<commit_message>
Help pages: the Member, Administrator's and Developer's Guides as web pages in Honcho
- modules/help: guide contents, one chapter per page with section links, prev/next, search
  across the guides each person may read (Member: everyone; Administrator's: admins and
  staff; Developer's: System Admins); text at the member's Values size
- docs/export-web.js: each generate.js also writes modules/help/content/<key>.json from the
  same chapter files as the Word guide (docs/ isn't deployed)
- Help in the member top bar and as a member-home tile; System Admin > Help & Guides;
  Help / ? buttons on the AI and Coffee Report screens open their sections
- welcome-ccmps/helpdocs redirects to the Developer's Guide; helpdocs.php retired
- Docs: CLAUDE.md, Conventions, both guides' Getting Started

Co-Authored-By: Claude Opus 5.5 <noreply@anthropic.com>
</commit_message>
<xml_diff>
--- a/docs/admin-guide/Honcho_Administrators_Guide.docx
+++ b/docs/admin-guide/Honcho_Administrators_Guide.docx
@@ -1517,6 +1517,82 @@
       <w:pPr>
         <w:spacing w:after="120"/>
       </w:pPr>
+    </w:p>
+    <w:p>
+      <w:pPr>
+        <w:pStyle w:val="Heading3"/>
+        <w:spacing w:after="160" w:before="320"/>
+      </w:pPr>
+      <w:r>
+        <w:t xml:space="preserve">This Guide in Honcho</w:t>
+      </w:r>
+    </w:p>
+    <w:p>
+      <w:pPr>
+        <w:spacing w:after="160"/>
+      </w:pPr>
+      <w:r>
+        <w:rPr>
+          <w:rFonts w:ascii="Calibri" w:cs="Calibri" w:eastAsia="Calibri" w:hAnsi="Calibri"/>
+        </w:rPr>
+        <w:t xml:space="preserve">Click </w:t>
+      </w:r>
+      <w:r>
+        <w:rPr>
+          <w:rFonts w:ascii="Calibri" w:cs="Calibri" w:eastAsia="Calibri" w:hAnsi="Calibri"/>
+          <w:b/>
+          <w:bCs/>
+        </w:rPr>
+        <w:t xml:space="preserve">Help</w:t>
+      </w:r>
+      <w:r>
+        <w:rPr>
+          <w:rFonts w:ascii="Calibri" w:cs="Calibri" w:eastAsia="Calibri" w:hAnsi="Calibri"/>
+        </w:rPr>
+        <w:t xml:space="preserve"> (side menu of the home page, top bar of profile pages, or </w:t>
+      </w:r>
+      <w:r>
+        <w:rPr>
+          <w:rFonts w:ascii="Calibri" w:cs="Calibri" w:eastAsia="Calibri" w:hAnsi="Calibri"/>
+          <w:b/>
+          <w:bCs/>
+        </w:rPr>
+        <w:t xml:space="preserve">System Admin &gt; Help &amp; Guides</w:t>
+      </w:r>
+      <w:r>
+        <w:rPr>
+          <w:rFonts w:ascii="Calibri" w:cs="Calibri" w:eastAsia="Calibri" w:hAnsi="Calibri"/>
+        </w:rPr>
+        <w:t xml:space="preserve">) to read this guide, the Member Guide and, for System Admins, the Developer's Guide, with a search box. Admin screens such as the Coffee Report settings have a </w:t>
+      </w:r>
+      <w:r>
+        <w:rPr>
+          <w:rFonts w:ascii="Calibri" w:cs="Calibri" w:eastAsia="Calibri" w:hAnsi="Calibri"/>
+          <w:b/>
+          <w:bCs/>
+        </w:rPr>
+        <w:t xml:space="preserve">Help</w:t>
+      </w:r>
+      <w:r>
+        <w:rPr>
+          <w:rFonts w:ascii="Calibri" w:cs="Calibri" w:eastAsia="Calibri" w:hAnsi="Calibri"/>
+        </w:rPr>
+        <w:t xml:space="preserve"> or </w:t>
+      </w:r>
+      <w:r>
+        <w:rPr>
+          <w:rFonts w:ascii="Calibri" w:cs="Calibri" w:eastAsia="Calibri" w:hAnsi="Calibri"/>
+          <w:b/>
+          <w:bCs/>
+        </w:rPr>
+        <w:t xml:space="preserve">?</w:t>
+      </w:r>
+      <w:r>
+        <w:rPr>
+          <w:rFonts w:ascii="Calibri" w:cs="Calibri" w:eastAsia="Calibri" w:hAnsi="Calibri"/>
+        </w:rPr>
+        <w:t xml:space="preserve"> button that opens the matching section.</w:t>
+      </w:r>
     </w:p>
     <w:p>
       <w:pPr>

</xml_diff>

<commit_message>
Coffee Report: Send a test To me or To everyone on the Sent to list (no silent fallback); Administrator's Guide
Co-Authored-By: Claude Opus 5.5 <noreply@anthropic.com>
</commit_message>
<xml_diff>
--- a/docs/admin-guide/Honcho_Administrators_Guide.docx
+++ b/docs/admin-guide/Honcho_Administrators_Guide.docx
@@ -9035,15 +9035,15 @@
                 <w:sz w:val="19"/>
                 <w:szCs w:val="19"/>
               </w:rPr>
-              <w:t xml:space="preserve">Send me a test</w:t>
-            </w:r>
-            <w:r>
-              <w:rPr>
-                <w:rFonts w:ascii="Calibri" w:cs="Calibri" w:eastAsia="Calibri" w:hAnsi="Calibri"/>
-                <w:sz w:val="19"/>
-                <w:szCs w:val="19"/>
-              </w:rPr>
-              <w:t xml:space="preserve"> emails it to you, and </w:t>
+              <w:t xml:space="preserve">Send a test</w:t>
+            </w:r>
+            <w:r>
+              <w:rPr>
+                <w:rFonts w:ascii="Calibri" w:cs="Calibri" w:eastAsia="Calibri" w:hAnsi="Calibri"/>
+                <w:sz w:val="19"/>
+                <w:szCs w:val="19"/>
+              </w:rPr>
+              <w:t xml:space="preserve"> emails it to you or to everyone on the list, and </w:t>
             </w:r>
             <w:r>
               <w:rPr>
@@ -13823,13 +13823,41 @@
           <w:b/>
           <w:bCs/>
         </w:rPr>
-        <w:t xml:space="preserve">Send me a test</w:t>
-      </w:r>
-      <w:r>
-        <w:rPr>
-          <w:rFonts w:ascii="Calibri" w:cs="Calibri" w:eastAsia="Calibri" w:hAnsi="Calibri"/>
-        </w:rPr>
-        <w:t xml:space="preserve"> emails it to you (if your account has no email address, to the report's extra addresses).</w:t>
+        <w:t xml:space="preserve">Send a test</w:t>
+      </w:r>
+      <w:r>
+        <w:rPr>
+          <w:rFonts w:ascii="Calibri" w:cs="Calibri" w:eastAsia="Calibri" w:hAnsi="Calibri"/>
+        </w:rPr>
+        <w:t xml:space="preserve"> emails it </w:t>
+      </w:r>
+      <w:r>
+        <w:rPr>
+          <w:rFonts w:ascii="Calibri" w:cs="Calibri" w:eastAsia="Calibri" w:hAnsi="Calibri"/>
+          <w:b/>
+          <w:bCs/>
+        </w:rPr>
+        <w:t xml:space="preserve">To me</w:t>
+      </w:r>
+      <w:r>
+        <w:rPr>
+          <w:rFonts w:ascii="Calibri" w:cs="Calibri" w:eastAsia="Calibri" w:hAnsi="Calibri"/>
+        </w:rPr>
+        <w:t xml:space="preserve"> (your own address), or </w:t>
+      </w:r>
+      <w:r>
+        <w:rPr>
+          <w:rFonts w:ascii="Calibri" w:cs="Calibri" w:eastAsia="Calibri" w:hAnsi="Calibri"/>
+          <w:b/>
+          <w:bCs/>
+        </w:rPr>
+        <w:t xml:space="preserve">To everyone on the "Sent to" list</w:t>
+      </w:r>
+      <w:r>
+        <w:rPr>
+          <w:rFonts w:ascii="Calibri" w:cs="Calibri" w:eastAsia="Calibri" w:hAnsi="Calibri"/>
+        </w:rPr>
+        <w:t xml:space="preserve"> as a dry run of the real email. If your account has no email address, only the list choice is offered.</w:t>
       </w:r>
     </w:p>
     <w:p>

</xml_diff>

<commit_message>
Coffee Report settings: the extra-addresses box has its own label (always sent, ticked or not); Administrator's Guide
Co-Authored-By: Claude Opus 5.5 <noreply@anthropic.com>
</commit_message>
<xml_diff>
--- a/docs/admin-guide/Honcho_Administrators_Guide.docx
+++ b/docs/admin-guide/Honcho_Administrators_Guide.docx
@@ -12359,7 +12359,25 @@
                 <w:sz w:val="19"/>
                 <w:szCs w:val="19"/>
               </w:rPr>
-              <w:t xml:space="preserve">Tick to send it to the scope's admins (National: System and Member Admins; a chapter: its Chapter Admins). Add more addresses, one per line</w:t>
+              <w:t xml:space="preserve">Tick to send it to the scope's admins (National: System and Member Admins; a chapter: its Chapter Admins); the page names them. </w:t>
+            </w:r>
+            <w:r>
+              <w:rPr>
+                <w:rFonts w:ascii="Calibri" w:cs="Calibri" w:eastAsia="Calibri" w:hAnsi="Calibri"/>
+                <w:b/>
+                <w:bCs/>
+                <w:sz w:val="19"/>
+                <w:szCs w:val="19"/>
+              </w:rPr>
+              <w:t xml:space="preserve">Also send it to these addresses</w:t>
+            </w:r>
+            <w:r>
+              <w:rPr>
+                <w:rFonts w:ascii="Calibri" w:cs="Calibri" w:eastAsia="Calibri" w:hAnsi="Calibri"/>
+                <w:sz w:val="19"/>
+                <w:szCs w:val="19"/>
+              </w:rPr>
+              <w:t xml:space="preserve"> always receive it, ticked or not: one per line. Each address gets one copy, even if it is also an admin's</w:t>
             </w:r>
           </w:p>
         </w:tc>

</xml_diff>

<commit_message>
Coffee Report: Sports section (NFL, MLB, NBA, WNBA, MLS, NWSL results and games; PGA, LPGA, DP World, Champions leaderboards Top 10/25/Full) from ESPN's public scoreboards; guides
Co-Authored-By: Claude Opus 5.5 <noreply@anthropic.com>
</commit_message>
<xml_diff>
--- a/docs/admin-guide/Honcho_Administrators_Guide.docx
+++ b/docs/admin-guide/Honcho_Administrators_Guide.docx
@@ -13278,6 +13278,85 @@
                 <w:szCs w:val="19"/>
               </w:rPr>
               <w:t xml:space="preserve">One per line: "Name | channel ID" (the ID starts with UC); hours to look back</w:t>
+            </w:r>
+          </w:p>
+        </w:tc>
+      </w:tr>
+      <w:tr>
+        <w:tc>
+          <w:tcPr>
+            <w:tcW w:type="dxa" w:w="3120"/>
+            <w:shd w:fill="F7F9FA" w:val="clear"/>
+            <w:tcMar>
+              <w:top w:type="dxa" w:w="100"/>
+              <w:left w:type="dxa" w:w="120"/>
+              <w:bottom w:type="dxa" w:w="100"/>
+              <w:right w:type="dxa" w:w="120"/>
+            </w:tcMar>
+          </w:tcPr>
+          <w:p>
+            <w:pPr>
+              <w:spacing w:after="0"/>
+            </w:pPr>
+            <w:r>
+              <w:rPr>
+                <w:rFonts w:ascii="Calibri" w:cs="Calibri" w:eastAsia="Calibri" w:hAnsi="Calibri"/>
+                <w:b/>
+                <w:bCs/>
+                <w:sz w:val="19"/>
+                <w:szCs w:val="19"/>
+              </w:rPr>
+              <w:t xml:space="preserve">Sports</w:t>
+            </w:r>
+          </w:p>
+        </w:tc>
+        <w:tc>
+          <w:tcPr>
+            <w:tcW w:type="dxa" w:w="3120"/>
+            <w:shd w:fill="F7F9FA" w:val="clear"/>
+            <w:tcMar>
+              <w:top w:type="dxa" w:w="100"/>
+              <w:left w:type="dxa" w:w="120"/>
+              <w:bottom w:type="dxa" w:w="100"/>
+              <w:right w:type="dxa" w:w="120"/>
+            </w:tcMar>
+          </w:tcPr>
+          <w:p>
+            <w:pPr>
+              <w:spacing w:after="0"/>
+            </w:pPr>
+            <w:r>
+              <w:rPr>
+                <w:rFonts w:ascii="Calibri" w:cs="Calibri" w:eastAsia="Calibri" w:hAnsi="Calibri"/>
+                <w:sz w:val="19"/>
+                <w:szCs w:val="19"/>
+              </w:rPr>
+              <w:t xml:space="preserve">Yesterday's results and today's games for the leagues you tick (NFL, MLB, NBA, WNBA, MLS, NWSL), and golf leaderboards (PGA Tour, LPGA Tour, DP World Tour, PGA Tour Champions)</w:t>
+            </w:r>
+          </w:p>
+        </w:tc>
+        <w:tc>
+          <w:tcPr>
+            <w:tcW w:type="dxa" w:w="3120"/>
+            <w:shd w:fill="F7F9FA" w:val="clear"/>
+            <w:tcMar>
+              <w:top w:type="dxa" w:w="100"/>
+              <w:left w:type="dxa" w:w="120"/>
+              <w:bottom w:type="dxa" w:w="100"/>
+              <w:right w:type="dxa" w:w="120"/>
+            </w:tcMar>
+          </w:tcPr>
+          <w:p>
+            <w:pPr>
+              <w:spacing w:after="0"/>
+            </w:pPr>
+            <w:r>
+              <w:rPr>
+                <w:rFonts w:ascii="Calibri" w:cs="Calibri" w:eastAsia="Calibri" w:hAnsi="Calibri"/>
+                <w:sz w:val="19"/>
+                <w:szCs w:val="19"/>
+              </w:rPr>
+              <w:t xml:space="preserve">Tick leagues; for each golf tour choose Off, Top 10, Top 25 or Full leaderboard. Top 10 includes everyone tied at 10th, as on the tours' own leaderboards</w:t>
             </w:r>
           </w:p>
         </w:tc>

</xml_diff>

<commit_message>
Coffee Report: Markets section (previous close for listed tickers from Yahoo Finance, oil and rates from FRED's API with a free key, exchange rates); guides and requirements
Co-Authored-By: Claude Opus 5.5 <noreply@anthropic.com>
</commit_message>
<xml_diff>
--- a/docs/admin-guide/Honcho_Administrators_Guide.docx
+++ b/docs/admin-guide/Honcho_Administrators_Guide.docx
@@ -45,13 +45,13 @@
           <w:sz w:val="20"/>
           <w:szCs w:val="20"/>
         </w:rPr>
-        <w:t xml:space="preserve">Generated 2026-10-29</w:t>
+        <w:t xml:space="preserve">Generated 2026-10-30</w:t>
       </w:r>
     </w:p>
     <w:p>
       <w:pPr>
         <w:pageBreakBefore/>
-        <w:spacing w:after="600" w:before="2400"/>
+        <w:spacing w:before="2400" w:after="600"/>
       </w:pPr>
       <w:r>
         <w:rPr>
@@ -69,7 +69,7 @@
       <w:pPr>
         <w:pStyle w:val="Heading1"/>
         <w:pageBreakBefore/>
-        <w:spacing w:after="300" w:before="0"/>
+        <w:spacing w:before="0" w:after="300"/>
       </w:pPr>
       <w:r>
         <w:t xml:space="preserve">Chapter 1: Getting Started as an Admin</w:t>
@@ -81,7 +81,7 @@
         <w:pBdr>
           <w:bottom w:val="single" w:color="2C3E50" w:sz="6" w:space="8"/>
         </w:pBdr>
-        <w:spacing w:after="240" w:before="0"/>
+        <w:spacing w:before="0" w:after="240"/>
       </w:pPr>
       <w:r>
         <w:t xml:space="preserve">Who This Guide Is For</w:t>
@@ -154,7 +154,7 @@
     <w:p>
       <w:pPr>
         <w:pStyle w:val="Heading3"/>
-        <w:spacing w:after="160" w:before="320"/>
+        <w:spacing w:before="320" w:after="160"/>
       </w:pPr>
       <w:r>
         <w:t xml:space="preserve">Your Role Decides What You See</w:t>
@@ -1354,7 +1354,7 @@
     </w:p>
     <w:tbl>
       <w:tblPr>
-        <w:tblW w:type="pct" w:w="5000"/>
+        <w:tblW w:type="pct" w:w="100%"/>
         <w:tblBorders>
           <w:top w:val="single" w:color="5BC0DE" w:sz="4"/>
           <w:left w:val="single" w:color="5BC0DE" w:sz="4"/>
@@ -1365,12 +1365,12 @@
         </w:tblBorders>
       </w:tblPr>
       <w:tblGrid>
-        <w:gridCol w:w="9360"/>
+        <w:gridCol w:w="100"/>
       </w:tblGrid>
       <w:tr>
         <w:tc>
           <w:tcPr>
-            <w:tcW w:type="pct" w:w="5000"/>
+            <w:tcW w:type="pct" w:w="100%"/>
             <w:shd w:fill="D9EDF7" w:val="clear"/>
             <w:tcMar>
               <w:top w:type="dxa" w:w="160"/>
@@ -1404,7 +1404,7 @@
         <w:pBdr>
           <w:bottom w:val="single" w:color="2C3E50" w:sz="6" w:space="8"/>
         </w:pBdr>
-        <w:spacing w:after="240" w:before="500"/>
+        <w:spacing w:before="500" w:after="240"/>
       </w:pPr>
       <w:r>
         <w:t xml:space="preserve">The EMS Menu</w:t>
@@ -1521,7 +1521,7 @@
     <w:p>
       <w:pPr>
         <w:pStyle w:val="Heading3"/>
-        <w:spacing w:after="160" w:before="320"/>
+        <w:spacing w:before="320" w:after="160"/>
       </w:pPr>
       <w:r>
         <w:t xml:space="preserve">This Guide in Honcho</w:t>
@@ -1597,7 +1597,7 @@
     <w:p>
       <w:pPr>
         <w:pageBreakBefore/>
-        <w:spacing w:after="600" w:before="2400"/>
+        <w:spacing w:before="2400" w:after="600"/>
       </w:pPr>
       <w:r>
         <w:rPr>
@@ -1615,7 +1615,7 @@
       <w:pPr>
         <w:pStyle w:val="Heading1"/>
         <w:pageBreakBefore/>
-        <w:spacing w:after="300" w:before="0"/>
+        <w:spacing w:before="0" w:after="300"/>
       </w:pPr>
       <w:r>
         <w:t xml:space="preserve">Chapter 2: Chapter Admins</w:t>
@@ -1627,7 +1627,7 @@
         <w:pBdr>
           <w:bottom w:val="single" w:color="2C3E50" w:sz="6" w:space="8"/>
         </w:pBdr>
-        <w:spacing w:after="240" w:before="0"/>
+        <w:spacing w:before="0" w:after="240"/>
       </w:pPr>
       <w:r>
         <w:t xml:space="preserve">Your Chapter Admin Pages</w:t>
@@ -2189,7 +2189,7 @@
         <w:pBdr>
           <w:bottom w:val="single" w:color="2C3E50" w:sz="6" w:space="8"/>
         </w:pBdr>
-        <w:spacing w:after="240" w:before="500"/>
+        <w:spacing w:before="500" w:after="240"/>
       </w:pPr>
       <w:r>
         <w:t xml:space="preserve">Managing Chapter Members</w:t>
@@ -2198,7 +2198,7 @@
     <w:p>
       <w:pPr>
         <w:pStyle w:val="Heading3"/>
-        <w:spacing w:after="160" w:before="320"/>
+        <w:spacing w:before="320" w:after="160"/>
       </w:pPr>
       <w:r>
         <w:t xml:space="preserve">Working With the Member List</w:t>
@@ -2600,7 +2600,7 @@
     <w:p>
       <w:pPr>
         <w:pStyle w:val="Heading4"/>
-        <w:spacing w:after="120" w:before="240"/>
+        <w:spacing w:before="240" w:after="120"/>
       </w:pPr>
       <w:r>
         <w:rPr>
@@ -2985,7 +2985,7 @@
     <w:p>
       <w:pPr>
         <w:pStyle w:val="Heading4"/>
-        <w:spacing w:after="120" w:before="240"/>
+        <w:spacing w:before="240" w:after="120"/>
       </w:pPr>
       <w:r>
         <w:rPr>
@@ -3064,7 +3064,7 @@
     <w:p>
       <w:pPr>
         <w:pStyle w:val="Heading4"/>
-        <w:spacing w:after="120" w:before="240"/>
+        <w:spacing w:before="240" w:after="120"/>
       </w:pPr>
       <w:r>
         <w:rPr>
@@ -3227,7 +3227,7 @@
     </w:p>
     <w:tbl>
       <w:tblPr>
-        <w:tblW w:type="pct" w:w="5000"/>
+        <w:tblW w:type="pct" w:w="100%"/>
         <w:tblBorders>
           <w:top w:val="single" w:color="5BC0DE" w:sz="4"/>
           <w:left w:val="single" w:color="5BC0DE" w:sz="4"/>
@@ -3238,12 +3238,12 @@
         </w:tblBorders>
       </w:tblPr>
       <w:tblGrid>
-        <w:gridCol w:w="9360"/>
+        <w:gridCol w:w="100"/>
       </w:tblGrid>
       <w:tr>
         <w:tc>
           <w:tcPr>
-            <w:tcW w:type="pct" w:w="5000"/>
+            <w:tcW w:type="pct" w:w="100%"/>
             <w:shd w:fill="D9EDF7" w:val="clear"/>
             <w:tcMar>
               <w:top w:type="dxa" w:w="160"/>
@@ -3274,7 +3274,7 @@
     <w:p>
       <w:pPr>
         <w:pStyle w:val="Heading3"/>
-        <w:spacing w:after="160" w:before="320"/>
+        <w:spacing w:before="320" w:after="160"/>
       </w:pPr>
       <w:r>
         <w:t xml:space="preserve">Adding a Member</w:t>
@@ -3311,7 +3311,7 @@
         <w:pBdr>
           <w:bottom w:val="single" w:color="2C3E50" w:sz="6" w:space="8"/>
         </w:pBdr>
-        <w:spacing w:after="240" w:before="500"/>
+        <w:spacing w:before="500" w:after="240"/>
       </w:pPr>
       <w:r>
         <w:t xml:space="preserve">Chapter Posts</w:t>
@@ -3622,7 +3622,7 @@
       <w:pPr>
         <w:pStyle w:val="Heading1"/>
         <w:pageBreakBefore/>
-        <w:spacing w:after="300" w:before="0"/>
+        <w:spacing w:before="0" w:after="300"/>
       </w:pPr>
       <w:r>
         <w:t xml:space="preserve">Chapter 3: Member Admins</w:t>
@@ -3634,7 +3634,7 @@
         <w:pBdr>
           <w:bottom w:val="single" w:color="2C3E50" w:sz="6" w:space="8"/>
         </w:pBdr>
-        <w:spacing w:after="240" w:before="0"/>
+        <w:spacing w:before="0" w:after="240"/>
       </w:pPr>
       <w:r>
         <w:t xml:space="preserve">Your Member Admin Pages</w:t>
@@ -4037,7 +4037,7 @@
         <w:pBdr>
           <w:bottom w:val="single" w:color="2C3E50" w:sz="6" w:space="8"/>
         </w:pBdr>
-        <w:spacing w:after="240" w:before="500"/>
+        <w:spacing w:before="500" w:after="240"/>
       </w:pPr>
       <w:r>
         <w:t xml:space="preserve">Managing All Members</w:t>
@@ -4046,7 +4046,7 @@
     <w:p>
       <w:pPr>
         <w:pStyle w:val="Heading3"/>
-        <w:spacing w:after="160" w:before="320"/>
+        <w:spacing w:before="320" w:after="160"/>
       </w:pPr>
       <w:r>
         <w:t xml:space="preserve">Working With the Member List</w:t>
@@ -4448,7 +4448,7 @@
     <w:p>
       <w:pPr>
         <w:pStyle w:val="Heading4"/>
-        <w:spacing w:after="120" w:before="240"/>
+        <w:spacing w:before="240" w:after="120"/>
       </w:pPr>
       <w:r>
         <w:rPr>
@@ -4833,7 +4833,7 @@
     <w:p>
       <w:pPr>
         <w:pStyle w:val="Heading4"/>
-        <w:spacing w:after="120" w:before="240"/>
+        <w:spacing w:before="240" w:after="120"/>
       </w:pPr>
       <w:r>
         <w:rPr>
@@ -4912,7 +4912,7 @@
     <w:p>
       <w:pPr>
         <w:pStyle w:val="Heading4"/>
-        <w:spacing w:after="120" w:before="240"/>
+        <w:spacing w:before="240" w:after="120"/>
       </w:pPr>
       <w:r>
         <w:rPr>
@@ -5075,7 +5075,7 @@
     </w:p>
     <w:tbl>
       <w:tblPr>
-        <w:tblW w:type="pct" w:w="5000"/>
+        <w:tblW w:type="pct" w:w="100%"/>
         <w:tblBorders>
           <w:top w:val="single" w:color="5BC0DE" w:sz="4"/>
           <w:left w:val="single" w:color="5BC0DE" w:sz="4"/>
@@ -5086,12 +5086,12 @@
         </w:tblBorders>
       </w:tblPr>
       <w:tblGrid>
-        <w:gridCol w:w="9360"/>
+        <w:gridCol w:w="100"/>
       </w:tblGrid>
       <w:tr>
         <w:tc>
           <w:tcPr>
-            <w:tcW w:type="pct" w:w="5000"/>
+            <w:tcW w:type="pct" w:w="100%"/>
             <w:shd w:fill="D9EDF7" w:val="clear"/>
             <w:tcMar>
               <w:top w:type="dxa" w:w="160"/>
@@ -5122,7 +5122,7 @@
     <w:p>
       <w:pPr>
         <w:pStyle w:val="Heading3"/>
-        <w:spacing w:after="160" w:before="320"/>
+        <w:spacing w:before="320" w:after="160"/>
       </w:pPr>
       <w:r>
         <w:t xml:space="preserve">Statuses and the Current Year</w:t>
@@ -5195,7 +5195,7 @@
     <w:p>
       <w:pPr>
         <w:pStyle w:val="Heading3"/>
-        <w:spacing w:after="160" w:before="320"/>
+        <w:spacing w:before="320" w:after="160"/>
       </w:pPr>
       <w:r>
         <w:t xml:space="preserve">Membership Cards</w:t>
@@ -5243,7 +5243,7 @@
     <w:p>
       <w:pPr>
         <w:pStyle w:val="Heading3"/>
-        <w:spacing w:after="160" w:before="320"/>
+        <w:spacing w:before="320" w:after="160"/>
       </w:pPr>
       <w:r>
         <w:t xml:space="preserve">Giving Someone an Admin Role</w:t>
@@ -5304,7 +5304,7 @@
     </w:p>
     <w:tbl>
       <w:tblPr>
-        <w:tblW w:type="pct" w:w="5000"/>
+        <w:tblW w:type="pct" w:w="100%"/>
         <w:tblBorders>
           <w:top w:val="single" w:color="E8A33D" w:sz="4"/>
           <w:left w:val="single" w:color="E8A33D" w:sz="4"/>
@@ -5315,12 +5315,12 @@
         </w:tblBorders>
       </w:tblPr>
       <w:tblGrid>
-        <w:gridCol w:w="9360"/>
+        <w:gridCol w:w="100"/>
       </w:tblGrid>
       <w:tr>
         <w:tc>
           <w:tcPr>
-            <w:tcW w:type="pct" w:w="5000"/>
+            <w:tcW w:type="pct" w:w="100%"/>
             <w:shd w:fill="FCF1DC" w:val="clear"/>
             <w:tcMar>
               <w:top w:type="dxa" w:w="160"/>
@@ -5352,7 +5352,7 @@
       <w:pPr>
         <w:pStyle w:val="Heading1"/>
         <w:pageBreakBefore/>
-        <w:spacing w:after="300" w:before="0"/>
+        <w:spacing w:before="0" w:after="300"/>
       </w:pPr>
       <w:r>
         <w:t xml:space="preserve">Chapter 4: Website (Home Page Content)</w:t>
@@ -5364,7 +5364,7 @@
         <w:pBdr>
           <w:bottom w:val="single" w:color="2C3E50" w:sz="6" w:space="8"/>
         </w:pBdr>
-        <w:spacing w:after="240" w:before="0"/>
+        <w:spacing w:before="0" w:after="240"/>
       </w:pPr>
       <w:r>
         <w:t xml:space="preserve">What You Manage</w:t>
@@ -6045,7 +6045,7 @@
     </w:p>
     <w:tbl>
       <w:tblPr>
-        <w:tblW w:type="pct" w:w="5000"/>
+        <w:tblW w:type="pct" w:w="100%"/>
         <w:tblBorders>
           <w:top w:val="single" w:color="5BC0DE" w:sz="4"/>
           <w:left w:val="single" w:color="5BC0DE" w:sz="4"/>
@@ -6056,12 +6056,12 @@
         </w:tblBorders>
       </w:tblPr>
       <w:tblGrid>
-        <w:gridCol w:w="9360"/>
+        <w:gridCol w:w="100"/>
       </w:tblGrid>
       <w:tr>
         <w:tc>
           <w:tcPr>
-            <w:tcW w:type="pct" w:w="5000"/>
+            <w:tcW w:type="pct" w:w="100%"/>
             <w:shd w:fill="D9EDF7" w:val="clear"/>
             <w:tcMar>
               <w:top w:type="dxa" w:w="160"/>
@@ -6095,7 +6095,7 @@
         <w:pBdr>
           <w:bottom w:val="single" w:color="2C3E50" w:sz="6" w:space="8"/>
         </w:pBdr>
-        <w:spacing w:after="240" w:before="500"/>
+        <w:spacing w:before="500" w:after="240"/>
       </w:pPr>
       <w:r>
         <w:t xml:space="preserve">Events Calendar</w:t>
@@ -6351,7 +6351,7 @@
         <w:pBdr>
           <w:bottom w:val="single" w:color="2C3E50" w:sz="6" w:space="8"/>
         </w:pBdr>
-        <w:spacing w:after="240" w:before="500"/>
+        <w:spacing w:before="500" w:after="240"/>
       </w:pPr>
       <w:r>
         <w:t xml:space="preserve">Page Sections</w:t>
@@ -6548,7 +6548,7 @@
         <w:pBdr>
           <w:bottom w:val="single" w:color="2C3E50" w:sz="6" w:space="8"/>
         </w:pBdr>
-        <w:spacing w:after="240" w:before="500"/>
+        <w:spacing w:before="500" w:after="240"/>
       </w:pPr>
       <w:r>
         <w:t xml:space="preserve">Items</w:t>
@@ -6890,7 +6890,7 @@
         <w:pBdr>
           <w:bottom w:val="single" w:color="2C3E50" w:sz="6" w:space="8"/>
         </w:pBdr>
-        <w:spacing w:after="240" w:before="500"/>
+        <w:spacing w:before="500" w:after="240"/>
       </w:pPr>
       <w:r>
         <w:t xml:space="preserve">Sunshine, Bulletin Board, Marquee, Careers</w:t>
@@ -7246,7 +7246,7 @@
         <w:pBdr>
           <w:bottom w:val="single" w:color="2C3E50" w:sz="6" w:space="8"/>
         </w:pBdr>
-        <w:spacing w:after="240" w:before="500"/>
+        <w:spacing w:before="500" w:after="240"/>
       </w:pPr>
       <w:r>
         <w:t xml:space="preserve">Pictures</w:t>
@@ -7350,7 +7350,7 @@
     <w:p>
       <w:pPr>
         <w:pStyle w:val="Heading3"/>
-        <w:spacing w:after="160" w:before="320"/>
+        <w:spacing w:before="320" w:after="160"/>
       </w:pPr>
       <w:r>
         <w:t xml:space="preserve">Pictures for the Slider</w:t>
@@ -7848,7 +7848,7 @@
       <w:pPr>
         <w:pStyle w:val="Heading1"/>
         <w:pageBreakBefore/>
-        <w:spacing w:after="300" w:before="0"/>
+        <w:spacing w:before="0" w:after="300"/>
       </w:pPr>
       <w:r>
         <w:t xml:space="preserve">Chapter 5: Document Library</w:t>
@@ -7860,7 +7860,7 @@
         <w:pBdr>
           <w:bottom w:val="single" w:color="2C3E50" w:sz="6" w:space="8"/>
         </w:pBdr>
-        <w:spacing w:after="240" w:before="0"/>
+        <w:spacing w:before="0" w:after="240"/>
       </w:pPr>
       <w:r>
         <w:t xml:space="preserve">Adding a Document</w:t>
@@ -8002,7 +8002,7 @@
         <w:pBdr>
           <w:bottom w:val="single" w:color="2C3E50" w:sz="6" w:space="8"/>
         </w:pBdr>
-        <w:spacing w:after="240" w:before="500"/>
+        <w:spacing w:before="500" w:after="240"/>
       </w:pPr>
       <w:r>
         <w:t xml:space="preserve">The Kanban Board</w:t>
@@ -8454,7 +8454,7 @@
     <w:p>
       <w:pPr>
         <w:pStyle w:val="Heading3"/>
-        <w:spacing w:after="160" w:before="320"/>
+        <w:spacing w:before="320" w:after="160"/>
       </w:pPr>
       <w:r>
         <w:t xml:space="preserve">Comments, Holds and Rejections</w:t>
@@ -8586,7 +8586,7 @@
     <w:p>
       <w:pPr>
         <w:pageBreakBefore/>
-        <w:spacing w:after="600" w:before="2400"/>
+        <w:spacing w:before="2400" w:after="600"/>
       </w:pPr>
       <w:r>
         <w:rPr>
@@ -8604,7 +8604,7 @@
       <w:pPr>
         <w:pStyle w:val="Heading1"/>
         <w:pageBreakBefore/>
-        <w:spacing w:after="300" w:before="0"/>
+        <w:spacing w:before="0" w:after="300"/>
       </w:pPr>
       <w:r>
         <w:t xml:space="preserve">Chapter 6: System Admins</w:t>
@@ -8616,7 +8616,7 @@
         <w:pBdr>
           <w:bottom w:val="single" w:color="2C3E50" w:sz="6" w:space="8"/>
         </w:pBdr>
-        <w:spacing w:after="240" w:before="0"/>
+        <w:spacing w:before="0" w:after="240"/>
       </w:pPr>
       <w:r>
         <w:t xml:space="preserve">System Admin Pages</w:t>
@@ -9434,7 +9434,7 @@
     </w:p>
     <w:tbl>
       <w:tblPr>
-        <w:tblW w:type="pct" w:w="5000"/>
+        <w:tblW w:type="pct" w:w="100%"/>
         <w:tblBorders>
           <w:top w:val="single" w:color="5BC0DE" w:sz="4"/>
           <w:left w:val="single" w:color="5BC0DE" w:sz="4"/>
@@ -9445,12 +9445,12 @@
         </w:tblBorders>
       </w:tblPr>
       <w:tblGrid>
-        <w:gridCol w:w="9360"/>
+        <w:gridCol w:w="100"/>
       </w:tblGrid>
       <w:tr>
         <w:tc>
           <w:tcPr>
-            <w:tcW w:type="pct" w:w="5000"/>
+            <w:tcW w:type="pct" w:w="100%"/>
             <w:shd w:fill="D9EDF7" w:val="clear"/>
             <w:tcMar>
               <w:top w:type="dxa" w:w="160"/>
@@ -9531,7 +9531,7 @@
     <w:p>
       <w:pPr>
         <w:pStyle w:val="Heading3"/>
-        <w:spacing w:after="160" w:before="320"/>
+        <w:spacing w:before="320" w:after="160"/>
       </w:pPr>
       <w:r>
         <w:t xml:space="preserve">Member Permissions</w:t>
@@ -9575,7 +9575,7 @@
     </w:p>
     <w:tbl>
       <w:tblPr>
-        <w:tblW w:type="pct" w:w="5000"/>
+        <w:tblW w:type="pct" w:w="100%"/>
         <w:tblBorders>
           <w:top w:val="single" w:color="E8A33D" w:sz="4"/>
           <w:left w:val="single" w:color="E8A33D" w:sz="4"/>
@@ -9586,12 +9586,12 @@
         </w:tblBorders>
       </w:tblPr>
       <w:tblGrid>
-        <w:gridCol w:w="9360"/>
+        <w:gridCol w:w="100"/>
       </w:tblGrid>
       <w:tr>
         <w:tc>
           <w:tcPr>
-            <w:tcW w:type="pct" w:w="5000"/>
+            <w:tcW w:type="pct" w:w="100%"/>
             <w:shd w:fill="FCF1DC" w:val="clear"/>
             <w:tcMar>
               <w:top w:type="dxa" w:w="160"/>
@@ -9622,7 +9622,7 @@
     <w:p>
       <w:pPr>
         <w:pStyle w:val="Heading3"/>
-        <w:spacing w:after="160" w:before="320"/>
+        <w:spacing w:before="320" w:after="160"/>
       </w:pPr>
       <w:r>
         <w:t xml:space="preserve">Security Groups</w:t>
@@ -9755,7 +9755,7 @@
     </w:p>
     <w:tbl>
       <w:tblPr>
-        <w:tblW w:type="pct" w:w="5000"/>
+        <w:tblW w:type="pct" w:w="100%"/>
         <w:tblBorders>
           <w:top w:val="single" w:color="5BC0DE" w:sz="4"/>
           <w:left w:val="single" w:color="5BC0DE" w:sz="4"/>
@@ -9766,12 +9766,12 @@
         </w:tblBorders>
       </w:tblPr>
       <w:tblGrid>
-        <w:gridCol w:w="9360"/>
+        <w:gridCol w:w="100"/>
       </w:tblGrid>
       <w:tr>
         <w:tc>
           <w:tcPr>
-            <w:tcW w:type="pct" w:w="5000"/>
+            <w:tcW w:type="pct" w:w="100%"/>
             <w:shd w:fill="D9EDF7" w:val="clear"/>
             <w:tcMar>
               <w:top w:type="dxa" w:w="160"/>
@@ -9830,7 +9830,7 @@
     <w:p>
       <w:pPr>
         <w:pStyle w:val="Heading3"/>
-        <w:spacing w:after="160" w:before="320"/>
+        <w:spacing w:before="320" w:after="160"/>
       </w:pPr>
       <w:r>
         <w:t xml:space="preserve">Using the Audit Log</w:t>
@@ -9853,7 +9853,7 @@
         <w:pBdr>
           <w:bottom w:val="single" w:color="2C3E50" w:sz="6" w:space="8"/>
         </w:pBdr>
-        <w:spacing w:after="240" w:before="500"/>
+        <w:spacing w:before="500" w:after="240"/>
       </w:pPr>
       <w:r>
         <w:t xml:space="preserve">System Settings</w:t>
@@ -10356,7 +10356,7 @@
     <w:p>
       <w:pPr>
         <w:pStyle w:val="Heading3"/>
-        <w:spacing w:after="160" w:before="320"/>
+        <w:spacing w:before="320" w:after="160"/>
       </w:pPr>
       <w:r>
         <w:t xml:space="preserve">Color Scheme and Logos</w:t>
@@ -10565,7 +10565,7 @@
     </w:p>
     <w:tbl>
       <w:tblPr>
-        <w:tblW w:type="pct" w:w="5000"/>
+        <w:tblW w:type="pct" w:w="100%"/>
         <w:tblBorders>
           <w:top w:val="single" w:color="5BC0DE" w:sz="4"/>
           <w:left w:val="single" w:color="5BC0DE" w:sz="4"/>
@@ -10576,12 +10576,12 @@
         </w:tblBorders>
       </w:tblPr>
       <w:tblGrid>
-        <w:gridCol w:w="9360"/>
+        <w:gridCol w:w="100"/>
       </w:tblGrid>
       <w:tr>
         <w:tc>
           <w:tcPr>
-            <w:tcW w:type="pct" w:w="5000"/>
+            <w:tcW w:type="pct" w:w="100%"/>
             <w:shd w:fill="D9EDF7" w:val="clear"/>
             <w:tcMar>
               <w:top w:type="dxa" w:w="160"/>
@@ -10612,7 +10612,7 @@
     <w:p>
       <w:pPr>
         <w:pStyle w:val="Heading3"/>
-        <w:spacing w:after="160" w:before="320"/>
+        <w:spacing w:before="320" w:after="160"/>
       </w:pPr>
       <w:r>
         <w:t xml:space="preserve">Financial Settings</w:t>
@@ -11066,7 +11066,7 @@
       <w:pPr>
         <w:pStyle w:val="Heading1"/>
         <w:pageBreakBefore/>
-        <w:spacing w:after="300" w:before="0"/>
+        <w:spacing w:before="0" w:after="300"/>
       </w:pPr>
       <w:r>
         <w:t xml:space="preserve">Chapter 7: AI and the Daily Coffee Report</w:t>
@@ -11078,7 +11078,7 @@
         <w:pBdr>
           <w:bottom w:val="single" w:color="2C3E50" w:sz="6" w:space="8"/>
         </w:pBdr>
-        <w:spacing w:after="240" w:before="0"/>
+        <w:spacing w:before="0" w:after="240"/>
       </w:pPr>
       <w:r>
         <w:t xml:space="preserve">What It Does</w:t>
@@ -11471,7 +11471,7 @@
     </w:p>
     <w:tbl>
       <w:tblPr>
-        <w:tblW w:type="pct" w:w="5000"/>
+        <w:tblW w:type="pct" w:w="100%"/>
         <w:tblBorders>
           <w:top w:val="single" w:color="5BC0DE" w:sz="4"/>
           <w:left w:val="single" w:color="5BC0DE" w:sz="4"/>
@@ -11482,12 +11482,12 @@
         </w:tblBorders>
       </w:tblPr>
       <w:tblGrid>
-        <w:gridCol w:w="9360"/>
+        <w:gridCol w:w="100"/>
       </w:tblGrid>
       <w:tr>
         <w:tc>
           <w:tcPr>
-            <w:tcW w:type="pct" w:w="5000"/>
+            <w:tcW w:type="pct" w:w="100%"/>
             <w:shd w:fill="D9EDF7" w:val="clear"/>
             <w:tcMar>
               <w:top w:type="dxa" w:w="160"/>
@@ -11549,7 +11549,7 @@
         <w:pBdr>
           <w:bottom w:val="single" w:color="2C3E50" w:sz="6" w:space="8"/>
         </w:pBdr>
-        <w:spacing w:after="240" w:before="500"/>
+        <w:spacing w:before="500" w:after="240"/>
       </w:pPr>
       <w:r>
         <w:t xml:space="preserve">Step 1: Connect the AI</w:t>
@@ -11823,7 +11823,7 @@
     </w:p>
     <w:tbl>
       <w:tblPr>
-        <w:tblW w:type="pct" w:w="5000"/>
+        <w:tblW w:type="pct" w:w="100%"/>
         <w:tblBorders>
           <w:top w:val="single" w:color="E8A33D" w:sz="4"/>
           <w:left w:val="single" w:color="E8A33D" w:sz="4"/>
@@ -11834,12 +11834,12 @@
         </w:tblBorders>
       </w:tblPr>
       <w:tblGrid>
-        <w:gridCol w:w="9360"/>
+        <w:gridCol w:w="100"/>
       </w:tblGrid>
       <w:tr>
         <w:tc>
           <w:tcPr>
-            <w:tcW w:type="pct" w:w="5000"/>
+            <w:tcW w:type="pct" w:w="100%"/>
             <w:shd w:fill="FCF1DC" w:val="clear"/>
             <w:tcMar>
               <w:top w:type="dxa" w:w="160"/>
@@ -12024,7 +12024,7 @@
         <w:pBdr>
           <w:bottom w:val="single" w:color="2C3E50" w:sz="6" w:space="8"/>
         </w:pBdr>
-        <w:spacing w:after="240" w:before="500"/>
+        <w:spacing w:before="500" w:after="240"/>
       </w:pPr>
       <w:r>
         <w:t xml:space="preserve">Step 2: Set Up the Report</w:t>
@@ -12617,7 +12617,7 @@
     <w:p>
       <w:pPr>
         <w:pStyle w:val="Heading3"/>
-        <w:spacing w:after="160" w:before="320"/>
+        <w:spacing w:before="320" w:after="160"/>
       </w:pPr>
       <w:r>
         <w:t xml:space="preserve">The Sections</w:t>
@@ -13306,7 +13306,7 @@
                 <w:sz w:val="19"/>
                 <w:szCs w:val="19"/>
               </w:rPr>
-              <w:t xml:space="preserve">Sports</w:t>
+              <w:t xml:space="preserve">Markets</w:t>
             </w:r>
           </w:p>
         </w:tc>
@@ -13331,7 +13331,7 @@
                 <w:sz w:val="19"/>
                 <w:szCs w:val="19"/>
               </w:rPr>
-              <w:t xml:space="preserve">Yesterday's results and today's games for the leagues you tick (NFL, MLB, NBA, WNBA, MLS, NWSL), and golf leaderboards (PGA Tour, LPGA Tour, DP World Tour, PGA Tour Champions)</w:t>
+              <w:t xml:space="preserve">The previous trading day's close and change for each ticker symbol you list (stocks and funds such as AAPL, indices ^GSPC S&amp;P 500, ^DJI Dow, ^IXIC Nasdaq, Bitcoin BTC-USD, gold GC=F, oil CL=F); WTI crude, the Prime Rate and the 30-year mortgage rate; exchange rates from US dollars</w:t>
             </w:r>
           </w:p>
         </w:tc>
@@ -13339,6 +13339,85 @@
           <w:tcPr>
             <w:tcW w:type="dxa" w:w="3120"/>
             <w:shd w:fill="F7F9FA" w:val="clear"/>
+            <w:tcMar>
+              <w:top w:type="dxa" w:w="100"/>
+              <w:left w:type="dxa" w:w="120"/>
+              <w:bottom w:type="dxa" w:w="100"/>
+              <w:right w:type="dxa" w:w="120"/>
+            </w:tcMar>
+          </w:tcPr>
+          <w:p>
+            <w:pPr>
+              <w:spacing w:after="0"/>
+            </w:pPr>
+            <w:r>
+              <w:rPr>
+                <w:rFonts w:ascii="Calibri" w:cs="Calibri" w:eastAsia="Calibri" w:hAnsi="Calibri"/>
+                <w:sz w:val="19"/>
+                <w:szCs w:val="19"/>
+              </w:rPr>
+              <w:t xml:space="preserve">Ticker symbols, one per line; tick oil and rates (these need a free FRED API key on the server, set by whoever looks after it); currency codes, one per line (EUR, GTQ)</w:t>
+            </w:r>
+          </w:p>
+        </w:tc>
+      </w:tr>
+      <w:tr>
+        <w:tc>
+          <w:tcPr>
+            <w:tcW w:type="dxa" w:w="3120"/>
+            <w:shd w:fill="FFFFFF" w:val="clear"/>
+            <w:tcMar>
+              <w:top w:type="dxa" w:w="100"/>
+              <w:left w:type="dxa" w:w="120"/>
+              <w:bottom w:type="dxa" w:w="100"/>
+              <w:right w:type="dxa" w:w="120"/>
+            </w:tcMar>
+          </w:tcPr>
+          <w:p>
+            <w:pPr>
+              <w:spacing w:after="0"/>
+            </w:pPr>
+            <w:r>
+              <w:rPr>
+                <w:rFonts w:ascii="Calibri" w:cs="Calibri" w:eastAsia="Calibri" w:hAnsi="Calibri"/>
+                <w:b/>
+                <w:bCs/>
+                <w:sz w:val="19"/>
+                <w:szCs w:val="19"/>
+              </w:rPr>
+              <w:t xml:space="preserve">Sports</w:t>
+            </w:r>
+          </w:p>
+        </w:tc>
+        <w:tc>
+          <w:tcPr>
+            <w:tcW w:type="dxa" w:w="3120"/>
+            <w:shd w:fill="FFFFFF" w:val="clear"/>
+            <w:tcMar>
+              <w:top w:type="dxa" w:w="100"/>
+              <w:left w:type="dxa" w:w="120"/>
+              <w:bottom w:type="dxa" w:w="100"/>
+              <w:right w:type="dxa" w:w="120"/>
+            </w:tcMar>
+          </w:tcPr>
+          <w:p>
+            <w:pPr>
+              <w:spacing w:after="0"/>
+            </w:pPr>
+            <w:r>
+              <w:rPr>
+                <w:rFonts w:ascii="Calibri" w:cs="Calibri" w:eastAsia="Calibri" w:hAnsi="Calibri"/>
+                <w:sz w:val="19"/>
+                <w:szCs w:val="19"/>
+              </w:rPr>
+              <w:t xml:space="preserve">Yesterday's results and today's games for the leagues you tick (NFL, MLB, NBA, WNBA, MLS, NWSL), and golf leaderboards (PGA Tour, LPGA Tour, DP World Tour, PGA Tour Champions)</w:t>
+            </w:r>
+          </w:p>
+        </w:tc>
+        <w:tc>
+          <w:tcPr>
+            <w:tcW w:type="dxa" w:w="3120"/>
+            <w:shd w:fill="FFFFFF" w:val="clear"/>
             <w:tcMar>
               <w:top w:type="dxa" w:w="100"/>
               <w:left w:type="dxa" w:w="120"/>
@@ -13426,7 +13505,7 @@
         <w:pBdr>
           <w:bottom w:val="single" w:color="2C3E50" w:sz="6" w:space="8"/>
         </w:pBdr>
-        <w:spacing w:after="240" w:before="500"/>
+        <w:spacing w:before="500" w:after="240"/>
       </w:pPr>
       <w:r>
         <w:t xml:space="preserve">Step 3: Email Sender</w:t>
@@ -13538,7 +13617,7 @@
     </w:p>
     <w:tbl>
       <w:tblPr>
-        <w:tblW w:type="pct" w:w="5000"/>
+        <w:tblW w:type="pct" w:w="100%"/>
         <w:tblBorders>
           <w:top w:val="single" w:color="5BC0DE" w:sz="4"/>
           <w:left w:val="single" w:color="5BC0DE" w:sz="4"/>
@@ -13549,12 +13628,12 @@
         </w:tblBorders>
       </w:tblPr>
       <w:tblGrid>
-        <w:gridCol w:w="9360"/>
+        <w:gridCol w:w="100"/>
       </w:tblGrid>
       <w:tr>
         <w:tc>
           <w:tcPr>
-            <w:tcW w:type="pct" w:w="5000"/>
+            <w:tcW w:type="pct" w:w="100%"/>
             <w:shd w:fill="D9EDF7" w:val="clear"/>
             <w:tcMar>
               <w:top w:type="dxa" w:w="160"/>
@@ -13588,7 +13667,7 @@
         <w:pBdr>
           <w:bottom w:val="single" w:color="2C3E50" w:sz="6" w:space="8"/>
         </w:pBdr>
-        <w:spacing w:after="240" w:before="500"/>
+        <w:spacing w:before="500" w:after="240"/>
       </w:pPr>
       <w:r>
         <w:t xml:space="preserve">Step 4: Telegram (Optional)</w:t>
@@ -13875,7 +13954,7 @@
         <w:pBdr>
           <w:bottom w:val="single" w:color="2C3E50" w:sz="6" w:space="8"/>
         </w:pBdr>
-        <w:spacing w:after="240" w:before="500"/>
+        <w:spacing w:before="500" w:after="240"/>
       </w:pPr>
       <w:r>
         <w:t xml:space="preserve">Step 5: Test, Then Switch On</w:t>
@@ -14047,7 +14126,7 @@
     <w:p>
       <w:pPr>
         <w:pStyle w:val="Heading3"/>
-        <w:spacing w:after="160" w:before="320"/>
+        <w:spacing w:before="320" w:after="160"/>
       </w:pPr>
       <w:r>
         <w:t xml:space="preserve">The Sent List</w:t>
@@ -14092,7 +14171,7 @@
         <w:pBdr>
           <w:bottom w:val="single" w:color="2C3E50" w:sz="6" w:space="8"/>
         </w:pBdr>
-        <w:spacing w:after="240" w:before="500"/>
+        <w:spacing w:before="500" w:after="240"/>
       </w:pPr>
       <w:r>
         <w:t xml:space="preserve">If Something Goes Wrong</w:t>
@@ -14704,7 +14783,7 @@
     <w:p>
       <w:pPr>
         <w:pageBreakBefore/>
-        <w:spacing w:after="600" w:before="2400"/>
+        <w:spacing w:before="2400" w:after="600"/>
       </w:pPr>
       <w:r>
         <w:rPr>
@@ -14722,7 +14801,7 @@
       <w:pPr>
         <w:pStyle w:val="Heading1"/>
         <w:pageBreakBefore/>
-        <w:spacing w:after="300" w:before="0"/>
+        <w:spacing w:before="0" w:after="300"/>
       </w:pPr>
       <w:r>
         <w:t xml:space="preserve">Chapter 8: Projects</w:t>
@@ -14734,7 +14813,7 @@
         <w:pBdr>
           <w:bottom w:val="single" w:color="2C3E50" w:sz="6" w:space="8"/>
         </w:pBdr>
-        <w:spacing w:after="240" w:before="0"/>
+        <w:spacing w:before="0" w:after="240"/>
       </w:pPr>
       <w:r>
         <w:t xml:space="preserve">Projects (Add-on)</w:t>
@@ -15120,7 +15199,7 @@
         <w:pBdr>
           <w:bottom w:val="single" w:color="2C3E50" w:sz="6" w:space="8"/>
         </w:pBdr>
-        <w:spacing w:after="240" w:before="500"/>
+        <w:spacing w:before="500" w:after="240"/>
       </w:pPr>
       <w:r>
         <w:t xml:space="preserve">Teams</w:t>
@@ -15210,7 +15289,7 @@
         <w:pBdr>
           <w:bottom w:val="single" w:color="2C3E50" w:sz="6" w:space="8"/>
         </w:pBdr>
-        <w:spacing w:after="240" w:before="500"/>
+        <w:spacing w:before="500" w:after="240"/>
       </w:pPr>
       <w:r>
         <w:t xml:space="preserve">Projects</w:t>
@@ -15705,7 +15784,7 @@
       <w:pPr>
         <w:pStyle w:val="Heading1"/>
         <w:pageBreakBefore/>
-        <w:spacing w:after="300" w:before="0"/>
+        <w:spacing w:before="0" w:after="300"/>
       </w:pPr>
       <w:r>
         <w:t xml:space="preserve">Chapter 9: The Staff Portal</w:t>
@@ -15717,7 +15796,7 @@
         <w:pBdr>
           <w:bottom w:val="single" w:color="2C3E50" w:sz="6" w:space="8"/>
         </w:pBdr>
-        <w:spacing w:after="240" w:before="0"/>
+        <w:spacing w:before="0" w:after="240"/>
       </w:pPr>
       <w:r>
         <w:t xml:space="preserve">The Staff Portal</w:t>
@@ -16015,41 +16094,8 @@
 </w:document>
 </file>
 
-<file path=word/endnotes.xml><?xml version="1.0" encoding="utf-8"?>
-<w:endnotes xmlns:wpc="http://schemas.microsoft.com/office/word/2010/wordprocessingCanvas" xmlns:mc="http://schemas.openxmlformats.org/markup-compatibility/2006" xmlns:o="urn:schemas-microsoft-com:office:office" xmlns:r="http://schemas.openxmlformats.org/officeDocument/2006/relationships" xmlns:m="http://schemas.openxmlformats.org/officeDocument/2006/math" xmlns:v="urn:schemas-microsoft-com:vml" xmlns:wp14="http://schemas.microsoft.com/office/word/2010/wordprocessingDrawing" xmlns:wp="http://schemas.openxmlformats.org/drawingml/2006/wordprocessingDrawing" xmlns:w10="urn:schemas-microsoft-com:office:word" xmlns:w="http://schemas.openxmlformats.org/wordprocessingml/2006/main" xmlns:w14="http://schemas.microsoft.com/office/word/2010/wordml" xmlns:w15="http://schemas.microsoft.com/office/word/2012/wordml" xmlns:wpg="http://schemas.microsoft.com/office/word/2010/wordprocessingGroup" xmlns:wpi="http://schemas.microsoft.com/office/word/2010/wordprocessingInk" xmlns:wne="http://schemas.microsoft.com/office/word/2006/wordml" xmlns:wps="http://schemas.microsoft.com/office/word/2010/wordprocessingShape" mc:Ignorable="w14 w15 wp14">
-  <w:endnote w:type="separator" w:id="-1">
-    <w:p>
-      <w:pPr>
-        <w:spacing w:after="0" w:line="240" w:lineRule="auto"/>
-      </w:pPr>
-      <w:r>
-        <w:rPr>
-          <w:rStyle w:val="EndnoteReference"/>
-        </w:rPr>
-        <w:endnoteRef/>
-      </w:r>
-      <w:r>
-        <w:separator/>
-      </w:r>
-    </w:p>
-  </w:endnote>
-  <w:endnote w:type="continuationSeparator" w:id="0">
-    <w:p>
-      <w:pPr>
-        <w:spacing w:after="0" w:line="240" w:lineRule="auto"/>
-      </w:pPr>
-      <w:r>
-        <w:rPr>
-          <w:rStyle w:val="EndnoteReference"/>
-        </w:rPr>
-        <w:endnoteRef/>
-      </w:r>
-      <w:r>
-        <w:continuationSeparator/>
-      </w:r>
-    </w:p>
-  </w:endnote>
-</w:endnotes>
+<file path=word/comments.xml><?xml version="1.0" encoding="utf-8"?>
+<w:comments xmlns:cx="http://schemas.microsoft.com/office/drawing/2014/chartex" xmlns:cx1="http://schemas.microsoft.com/office/drawing/2015/9/8/chartex" xmlns:cx2="http://schemas.microsoft.com/office/drawing/2015/10/21/chartex" xmlns:cx3="http://schemas.microsoft.com/office/drawing/2016/5/9/chartex" xmlns:cx4="http://schemas.microsoft.com/office/drawing/2016/5/10/chartex" xmlns:cx5="http://schemas.microsoft.com/office/drawing/2016/5/11/chartex" xmlns:cx6="http://schemas.microsoft.com/office/drawing/2016/5/12/chartex" xmlns:cx7="http://schemas.microsoft.com/office/drawing/2016/5/13/chartex" xmlns:cx8="http://schemas.microsoft.com/office/drawing/2016/5/14/chartex" xmlns:mc="http://schemas.openxmlformats.org/markup-compatibility/2006" xmlns:aink="http://schemas.microsoft.com/office/drawing/2016/ink" xmlns:am3d="http://schemas.microsoft.com/office/drawing/2017/model3d" xmlns:o="urn:schemas-microsoft-com:office:office" xmlns:r="http://schemas.openxmlformats.org/officeDocument/2006/relationships" xmlns:m="http://schemas.openxmlformats.org/officeDocument/2006/math" xmlns:v="urn:schemas-microsoft-com:vml" xmlns:wp14="http://schemas.microsoft.com/office/word/2010/wordprocessingDrawing" xmlns:wp="http://schemas.openxmlformats.org/drawingml/2006/wordprocessingDrawing" xmlns:w10="urn:schemas-microsoft-com:office:word" xmlns:w="http://schemas.openxmlformats.org/wordprocessingml/2006/main" xmlns:w14="http://schemas.microsoft.com/office/word/2010/wordml" xmlns:w15="http://schemas.microsoft.com/office/word/2012/wordml" xmlns:w16cex="http://schemas.microsoft.com/office/word/2018/wordml/cex" xmlns:w16cid="http://schemas.microsoft.com/office/word/2016/wordml/cid" xmlns:w16="http://schemas.microsoft.com/office/word/2018/wordml" xmlns:w16sdtdh="http://schemas.microsoft.com/office/word/2020/wordml/sdtdatahash" xmlns:w16se="http://schemas.microsoft.com/office/word/2015/wordml/symex" xmlns:wpg="http://schemas.microsoft.com/office/word/2010/wordprocessingGroup" xmlns:wpi="http://schemas.microsoft.com/office/word/2010/wordprocessingInk" xmlns:wne="http://schemas.microsoft.com/office/word/2006/wordml" xmlns:wps="http://schemas.microsoft.com/office/word/2010/wordprocessingShape"/>
 </file>
 
 <file path=word/footnotes.xml><?xml version="1.0" encoding="utf-8"?>
@@ -16093,7 +16139,7 @@
 <w:numbering xmlns:wpc="http://schemas.microsoft.com/office/word/2010/wordprocessingCanvas" xmlns:mc="http://schemas.openxmlformats.org/markup-compatibility/2006" xmlns:o="urn:schemas-microsoft-com:office:office" xmlns:r="http://schemas.openxmlformats.org/officeDocument/2006/relationships" xmlns:m="http://schemas.openxmlformats.org/officeDocument/2006/math" xmlns:v="urn:schemas-microsoft-com:vml" xmlns:wp14="http://schemas.microsoft.com/office/word/2010/wordprocessingDrawing" xmlns:wp="http://schemas.openxmlformats.org/drawingml/2006/wordprocessingDrawing" xmlns:w10="urn:schemas-microsoft-com:office:word" xmlns:w="http://schemas.openxmlformats.org/wordprocessingml/2006/main" xmlns:w14="http://schemas.microsoft.com/office/word/2010/wordml" xmlns:w15="http://schemas.microsoft.com/office/word/2012/wordml" xmlns:wpg="http://schemas.microsoft.com/office/word/2010/wordprocessingGroup" xmlns:wpi="http://schemas.microsoft.com/office/word/2010/wordprocessingInk" xmlns:wne="http://schemas.microsoft.com/office/word/2006/wordml" xmlns:wps="http://schemas.microsoft.com/office/word/2010/wordprocessingShape" mc:Ignorable="w14 w15 wp14">
   <w:abstractNum w:abstractNumId="1" w15:restartNumberingAfterBreak="0">
     <w:multiLevelType w:val="hybridMultilevel"/>
-    <w:lvl w:ilvl="0" w:tentative="1">
+    <w:lvl w:ilvl="0" w15:tentative="1">
       <w:start w:val="1"/>
       <w:numFmt w:val="bullet"/>
       <w:lvlText w:val="●"/>
@@ -16102,7 +16148,7 @@
         <w:ind w:left="720" w:hanging="360"/>
       </w:pPr>
     </w:lvl>
-    <w:lvl w:ilvl="1" w:tentative="1">
+    <w:lvl w:ilvl="1" w15:tentative="1">
       <w:start w:val="1"/>
       <w:numFmt w:val="bullet"/>
       <w:lvlText w:val="○"/>
@@ -16111,7 +16157,7 @@
         <w:ind w:left="1440" w:hanging="360"/>
       </w:pPr>
     </w:lvl>
-    <w:lvl w:ilvl="2" w:tentative="1">
+    <w:lvl w:ilvl="2" w15:tentative="1">
       <w:start w:val="1"/>
       <w:numFmt w:val="bullet"/>
       <w:lvlText w:val="■"/>
@@ -16120,7 +16166,7 @@
         <w:ind w:left="2160" w:hanging="360"/>
       </w:pPr>
     </w:lvl>
-    <w:lvl w:ilvl="3" w:tentative="1">
+    <w:lvl w:ilvl="3" w15:tentative="1">
       <w:start w:val="1"/>
       <w:numFmt w:val="bullet"/>
       <w:lvlText w:val="●"/>
@@ -16129,7 +16175,7 @@
         <w:ind w:left="2880" w:hanging="360"/>
       </w:pPr>
     </w:lvl>
-    <w:lvl w:ilvl="4" w:tentative="1">
+    <w:lvl w:ilvl="4" w15:tentative="1">
       <w:start w:val="1"/>
       <w:numFmt w:val="bullet"/>
       <w:lvlText w:val="○"/>
@@ -16138,7 +16184,7 @@
         <w:ind w:left="3600" w:hanging="360"/>
       </w:pPr>
     </w:lvl>
-    <w:lvl w:ilvl="5" w:tentative="1">
+    <w:lvl w:ilvl="5" w15:tentative="1">
       <w:start w:val="1"/>
       <w:numFmt w:val="bullet"/>
       <w:lvlText w:val="■"/>
@@ -16147,7 +16193,7 @@
         <w:ind w:left="4320" w:hanging="360"/>
       </w:pPr>
     </w:lvl>
-    <w:lvl w:ilvl="6" w:tentative="1">
+    <w:lvl w:ilvl="6" w15:tentative="1">
       <w:start w:val="1"/>
       <w:numFmt w:val="bullet"/>
       <w:lvlText w:val="●"/>
@@ -16156,7 +16202,7 @@
         <w:ind w:left="5040" w:hanging="360"/>
       </w:pPr>
     </w:lvl>
-    <w:lvl w:ilvl="7" w:tentative="1">
+    <w:lvl w:ilvl="7" w15:tentative="1">
       <w:start w:val="1"/>
       <w:numFmt w:val="bullet"/>
       <w:lvlText w:val="●"/>
@@ -16165,7 +16211,7 @@
         <w:ind w:left="5760" w:hanging="360"/>
       </w:pPr>
     </w:lvl>
-    <w:lvl w:ilvl="8" w:tentative="1">
+    <w:lvl w:ilvl="8" w15:tentative="1">
       <w:start w:val="1"/>
       <w:numFmt w:val="bullet"/>
       <w:lvlText w:val="●"/>
@@ -16177,7 +16223,7 @@
   </w:abstractNum>
   <w:abstractNum w:abstractNumId="2" w15:restartNumberingAfterBreak="0">
     <w:multiLevelType w:val="hybridMultilevel"/>
-    <w:lvl w:ilvl="0" w:tentative="1">
+    <w:lvl w:ilvl="0" w15:tentative="1">
       <w:start w:val="1"/>
       <w:numFmt w:val="bullet"/>
       <w:lvlText w:val="•"/>
@@ -16189,7 +16235,7 @@
   </w:abstractNum>
   <w:abstractNum w:abstractNumId="3" w15:restartNumberingAfterBreak="0">
     <w:multiLevelType w:val="hybridMultilevel"/>
-    <w:lvl w:ilvl="0" w:tentative="1">
+    <w:lvl w:ilvl="0" w15:tentative="1">
       <w:start w:val="1"/>
       <w:numFmt w:val="decimal"/>
       <w:lvlText w:val="%1."/>
@@ -16232,25 +16278,6 @@
     </w:rPrDefault>
     <w:pPrDefault/>
   </w:docDefaults>
-  <w:style w:type="paragraph" w:styleId="Normal" w:default="1">
-    <w:name w:val="Normal"/>
-    <w:qFormat/>
-  </w:style>
-  <w:style w:type="table" w:styleId="TableNormal" w:default="true">
-    <w:name w:val="Normal Table"/>
-    <w:uiPriority w:val="99"/>
-    <w:semiHidden/>
-    <w:unhideWhenUsed/>
-    <w:tblPr>
-      <w:tblInd w:type="dxa" w:w="0"/>
-      <w:tblCellMar>
-        <w:top w:type="dxa" w:w="0"/>
-        <w:left w:type="dxa" w:w="108"/>
-        <w:bottom w:type="dxa" w:w="0"/>
-        <w:right w:type="dxa" w:w="108"/>
-      </w:tblCellMar>
-    </w:tblPr>
-  </w:style>
   <w:style w:type="paragraph" w:styleId="Title">
     <w:name w:val="Title"/>
     <w:basedOn w:val="Normal"/>
@@ -16259,6 +16286,50 @@
     <w:rPr>
       <w:sz w:val="56"/>
       <w:szCs w:val="56"/>
+    </w:rPr>
+  </w:style>
+  <w:style w:type="paragraph" w:styleId="Heading1">
+    <w:name w:val="Heading 1"/>
+    <w:basedOn w:val="Normal"/>
+    <w:next w:val="Normal"/>
+    <w:qFormat/>
+    <w:rPr>
+      <w:color w:val="2E74B5"/>
+      <w:sz w:val="32"/>
+      <w:szCs w:val="32"/>
+    </w:rPr>
+  </w:style>
+  <w:style w:type="paragraph" w:styleId="Heading2">
+    <w:name w:val="Heading 2"/>
+    <w:basedOn w:val="Normal"/>
+    <w:next w:val="Normal"/>
+    <w:qFormat/>
+    <w:rPr>
+      <w:color w:val="2E74B5"/>
+      <w:sz w:val="26"/>
+      <w:szCs w:val="26"/>
+    </w:rPr>
+  </w:style>
+  <w:style w:type="paragraph" w:styleId="Heading3">
+    <w:name w:val="Heading 3"/>
+    <w:basedOn w:val="Normal"/>
+    <w:next w:val="Normal"/>
+    <w:qFormat/>
+    <w:rPr>
+      <w:color w:val="1F4D78"/>
+      <w:sz w:val="24"/>
+      <w:szCs w:val="24"/>
+    </w:rPr>
+  </w:style>
+  <w:style w:type="paragraph" w:styleId="Heading4">
+    <w:name w:val="Heading 4"/>
+    <w:basedOn w:val="Normal"/>
+    <w:next w:val="Normal"/>
+    <w:qFormat/>
+    <w:rPr>
+      <w:i/>
+      <w:iCs/>
+      <w:color w:val="2E74B5"/>
     </w:rPr>
   </w:style>
   <w:style w:type="paragraph" w:styleId="Heading5">
@@ -16293,139 +16364,6 @@
     <w:name w:val="List Paragraph"/>
     <w:basedOn w:val="Normal"/>
     <w:qFormat/>
-  </w:style>
-  <w:style w:type="paragraph" w:styleId="Caption">
-    <w:name w:val="caption"/>
-    <w:basedOn w:val="Normal"/>
-    <w:next w:val="Normal"/>
-    <w:uiPriority w:val="35"/>
-    <w:semiHidden/>
-    <w:unhideWhenUsed/>
-    <w:qFormat/>
-    <w:pPr>
-      <w:spacing w:after="200"/>
-    </w:pPr>
-    <w:rPr>
-      <w:i/>
-      <w:iCs/>
-      <w:color w:val="44546A" w:themeColor="dark2"/>
-      <w:sz w:val="18"/>
-      <w:szCs w:val="18"/>
-    </w:rPr>
-  </w:style>
-  <w:style w:type="paragraph" w:styleId="Bibliography">
-    <w:name w:val="Bibliography"/>
-    <w:basedOn w:val="Normal"/>
-    <w:next w:val="Normal"/>
-    <w:uiPriority w:val="37"/>
-    <w:unhideWhenUsed/>
-  </w:style>
-  <w:style w:type="paragraph" w:styleId="TOC1">
-    <w:name w:val="toc 1"/>
-    <w:basedOn w:val="Normal"/>
-    <w:next w:val="Normal"/>
-    <w:uiPriority w:val="39"/>
-    <w:semiHidden/>
-    <w:unhideWhenUsed/>
-    <w:pPr>
-      <w:spacing w:after="100"/>
-    </w:pPr>
-  </w:style>
-  <w:style w:type="paragraph" w:styleId="TOC2">
-    <w:name w:val="toc 2"/>
-    <w:basedOn w:val="Normal"/>
-    <w:next w:val="Normal"/>
-    <w:uiPriority w:val="39"/>
-    <w:semiHidden/>
-    <w:unhideWhenUsed/>
-    <w:pPr>
-      <w:spacing w:after="100"/>
-      <w:ind w:left="220"/>
-    </w:pPr>
-  </w:style>
-  <w:style w:type="paragraph" w:styleId="TOC3">
-    <w:name w:val="toc 3"/>
-    <w:basedOn w:val="Normal"/>
-    <w:next w:val="Normal"/>
-    <w:uiPriority w:val="39"/>
-    <w:semiHidden/>
-    <w:unhideWhenUsed/>
-    <w:pPr>
-      <w:spacing w:after="100"/>
-      <w:ind w:left="440"/>
-    </w:pPr>
-  </w:style>
-  <w:style w:type="paragraph" w:styleId="TOC4">
-    <w:name w:val="toc 4"/>
-    <w:basedOn w:val="Normal"/>
-    <w:next w:val="Normal"/>
-    <w:uiPriority w:val="39"/>
-    <w:semiHidden/>
-    <w:unhideWhenUsed/>
-    <w:pPr>
-      <w:spacing w:after="100"/>
-      <w:ind w:left="660"/>
-    </w:pPr>
-  </w:style>
-  <w:style w:type="paragraph" w:styleId="TOC5">
-    <w:name w:val="toc 5"/>
-    <w:basedOn w:val="Normal"/>
-    <w:next w:val="Normal"/>
-    <w:uiPriority w:val="39"/>
-    <w:semiHidden/>
-    <w:unhideWhenUsed/>
-    <w:pPr>
-      <w:spacing w:after="100"/>
-      <w:ind w:left="880"/>
-    </w:pPr>
-  </w:style>
-  <w:style w:type="paragraph" w:styleId="TOC6">
-    <w:name w:val="toc 6"/>
-    <w:basedOn w:val="Normal"/>
-    <w:next w:val="Normal"/>
-    <w:uiPriority w:val="39"/>
-    <w:semiHidden/>
-    <w:unhideWhenUsed/>
-    <w:pPr>
-      <w:spacing w:after="100"/>
-      <w:ind w:left="1100"/>
-    </w:pPr>
-  </w:style>
-  <w:style w:type="paragraph" w:styleId="TOC7">
-    <w:name w:val="toc 7"/>
-    <w:basedOn w:val="Normal"/>
-    <w:next w:val="Normal"/>
-    <w:uiPriority w:val="39"/>
-    <w:semiHidden/>
-    <w:unhideWhenUsed/>
-    <w:pPr>
-      <w:spacing w:after="100"/>
-      <w:ind w:left="1320"/>
-    </w:pPr>
-  </w:style>
-  <w:style w:type="paragraph" w:styleId="TOC8">
-    <w:name w:val="toc 8"/>
-    <w:basedOn w:val="Normal"/>
-    <w:next w:val="Normal"/>
-    <w:uiPriority w:val="39"/>
-    <w:semiHidden/>
-    <w:unhideWhenUsed/>
-    <w:pPr>
-      <w:spacing w:after="100"/>
-      <w:ind w:left="1540"/>
-    </w:pPr>
-  </w:style>
-  <w:style w:type="paragraph" w:styleId="TOC9">
-    <w:name w:val="toc 9"/>
-    <w:basedOn w:val="Normal"/>
-    <w:next w:val="Normal"/>
-    <w:uiPriority w:val="39"/>
-    <w:semiHidden/>
-    <w:unhideWhenUsed/>
-    <w:pPr>
-      <w:spacing w:after="100"/>
-      <w:ind w:left="1760"/>
-    </w:pPr>
   </w:style>
   <w:style w:type="character" w:styleId="Hyperlink">
     <w:name w:val="Hyperlink"/>
@@ -16473,50 +16411,6 @@
       <w:sz w:val="20"/>
       <w:szCs w:val="20"/>
     </w:rPr>
-  </w:style>
-  <w:style w:type="character" w:styleId="EndnoteReference">
-    <w:name w:val="endnote reference"/>
-    <w:basedOn w:val="DefaultParagraphFont"/>
-    <w:uiPriority w:val="99"/>
-    <w:semiHidden/>
-    <w:unhideWhenUsed/>
-    <w:rPr>
-      <w:vertAlign w:val="superscript"/>
-    </w:rPr>
-  </w:style>
-  <w:style w:type="paragraph" w:styleId="EndnoteText">
-    <w:name w:val="endnote text"/>
-    <w:basedOn w:val="Normal"/>
-    <w:link w:val="EndnoteTextChar"/>
-    <w:uiPriority w:val="99"/>
-    <w:semiHidden/>
-    <w:unhideWhenUsed/>
-    <w:pPr>
-      <w:spacing w:after="0" w:line="240" w:lineRule="auto"/>
-    </w:pPr>
-    <w:rPr>
-      <w:sz w:val="20"/>
-      <w:szCs w:val="20"/>
-    </w:rPr>
-  </w:style>
-  <w:style w:type="character" w:styleId="EndnoteTextChar">
-    <w:name w:val="Endnote Text Char"/>
-    <w:basedOn w:val="DefaultParagraphFont"/>
-    <w:link w:val="EndnoteText"/>
-    <w:uiPriority w:val="99"/>
-    <w:semiHidden/>
-    <w:unhideWhenUsed/>
-    <w:rPr>
-      <w:sz w:val="20"/>
-      <w:szCs w:val="20"/>
-    </w:rPr>
-  </w:style>
-  <w:style w:type="character" w:styleId="LineNumber">
-    <w:name w:val="line number"/>
-    <w:basedOn w:val="DefaultParagraphFont"/>
-    <w:uiPriority w:val="99"/>
-    <w:semiHidden/>
-    <w:unhideWhenUsed/>
   </w:style>
   <w:style w:type="paragraph" w:styleId="Heading1">
     <w:name w:val="Heading 1"/>
@@ -16575,294 +16469,4 @@
     </w:rPr>
   </w:style>
 </w:styles>
-</file>
-
-<file path=word/theme/theme1.xml><?xml version="1.0" encoding="utf-8"?>
-<a:theme xmlns:a="http://schemas.openxmlformats.org/drawingml/2006/main" name="Office Theme">
-  <a:themeElements>
-    <a:clrScheme name="Office">
-      <a:dk1>
-        <a:sysClr val="windowText" lastClr="000000"/>
-      </a:dk1>
-      <a:lt1>
-        <a:sysClr val="window" lastClr="FFFFFF"/>
-      </a:lt1>
-      <a:dk2>
-        <a:srgbClr val="44546A"/>
-      </a:dk2>
-      <a:lt2>
-        <a:srgbClr val="E7E6E6"/>
-      </a:lt2>
-      <a:accent1>
-        <a:srgbClr val="4472C4"/>
-      </a:accent1>
-      <a:accent2>
-        <a:srgbClr val="ED7D31"/>
-      </a:accent2>
-      <a:accent3>
-        <a:srgbClr val="A5A5A5"/>
-      </a:accent3>
-      <a:accent4>
-        <a:srgbClr val="FFC000"/>
-      </a:accent4>
-      <a:accent5>
-        <a:srgbClr val="5B9BD5"/>
-      </a:accent5>
-      <a:accent6>
-        <a:srgbClr val="70AD47"/>
-      </a:accent6>
-      <a:hlink>
-        <a:srgbClr val="0563C1"/>
-      </a:hlink>
-      <a:folHlink>
-        <a:srgbClr val="954F72"/>
-      </a:folHlink>
-    </a:clrScheme>
-    <a:fontScheme name="Office">
-      <a:majorFont>
-        <a:latin typeface="Calibri Light" panose="020F0302020204030204"/>
-        <a:ea typeface=""/>
-        <a:cs typeface=""/>
-        <a:font script="Jpan" typeface="游ゴシック Light"/>
-        <a:font script="Hang" typeface="맑은 고딕"/>
-        <a:font script="Hans" typeface="等线 Light"/>
-        <a:font script="Hant" typeface="新細明體"/>
-        <a:font script="Arab" typeface="Times New Roman"/>
-        <a:font script="Hebr" typeface="Times New Roman"/>
-        <a:font script="Thai" typeface="Angsana New"/>
-        <a:font script="Ethi" typeface="Nyala"/>
-        <a:font script="Beng" typeface="Vrinda"/>
-        <a:font script="Gujr" typeface="Shruti"/>
-        <a:font script="Khmr" typeface="MoolBoran"/>
-        <a:font script="Knda" typeface="Tunga"/>
-        <a:font script="Guru" typeface="Raavi"/>
-        <a:font script="Cans" typeface="Euphemia"/>
-        <a:font script="Cher" typeface="Plantagenet Cherokee"/>
-        <a:font script="Yiii" typeface="Microsoft Yi Baiti"/>
-        <a:font script="Tibt" typeface="Microsoft Himalaya"/>
-        <a:font script="Thaa" typeface="MV Boli"/>
-        <a:font script="Deva" typeface="Mangal"/>
-        <a:font script="Telu" typeface="Gautami"/>
-        <a:font script="Taml" typeface="Latha"/>
-        <a:font script="Syrc" typeface="Estrangelo Edessa"/>
-        <a:font script="Orya" typeface="Kalinga"/>
-        <a:font script="Mlym" typeface="Kartika"/>
-        <a:font script="Laoo" typeface="DokChampa"/>
-        <a:font script="Sinh" typeface="Iskoola Pota"/>
-        <a:font script="Mong" typeface="Mongolian Baiti"/>
-        <a:font script="Viet" typeface="Times New Roman"/>
-        <a:font script="Uigh" typeface="Microsoft Uighur"/>
-        <a:font script="Geor" typeface="Sylfaen"/>
-        <a:font script="Armn" typeface="Arial"/>
-        <a:font script="Bugi" typeface="Leelawadee UI"/>
-        <a:font script="Bopo" typeface="Microsoft JhengHei"/>
-        <a:font script="Java" typeface="Javanese Text"/>
-        <a:font script="Lisu" typeface="Segoe UI"/>
-        <a:font script="Mymr" typeface="Myanmar Text"/>
-        <a:font script="Nkoo" typeface="Ebrima"/>
-        <a:font script="Olck" typeface="Nirmala UI"/>
-        <a:font script="Osma" typeface="Ebrima"/>
-        <a:font script="Phag" typeface="Phagspa"/>
-        <a:font script="Syrn" typeface="Estrangelo Edessa"/>
-        <a:font script="Syrj" typeface="Estrangelo Edessa"/>
-        <a:font script="Syre" typeface="Estrangelo Edessa"/>
-        <a:font script="Sora" typeface="Nirmala UI"/>
-        <a:font script="Tale" typeface="Microsoft Tai Le"/>
-        <a:font script="Talu" typeface="Microsoft New Tai Lue"/>
-        <a:font script="Tfng" typeface="Ebrima"/>
-      </a:majorFont>
-      <a:minorFont>
-        <a:latin typeface="Calibri" panose="020F0502020204030204"/>
-        <a:ea typeface=""/>
-        <a:cs typeface=""/>
-        <a:font script="Jpan" typeface="游明朝"/>
-        <a:font script="Hang" typeface="맑은 고딕"/>
-        <a:font script="Hans" typeface="等线"/>
-        <a:font script="Hant" typeface="新細明體"/>
-        <a:font script="Arab" typeface="Arial"/>
-        <a:font script="Hebr" typeface="Arial"/>
-        <a:font script="Thai" typeface="Cordia New"/>
-        <a:font script="Ethi" typeface="Nyala"/>
-        <a:font script="Beng" typeface="Vrinda"/>
-        <a:font script="Gujr" typeface="Shruti"/>
-        <a:font script="Khmr" typeface="DaunPenh"/>
-        <a:font script="Knda" typeface="Tunga"/>
-        <a:font script="Guru" typeface="Raavi"/>
-        <a:font script="Cans" typeface="Euphemia"/>
-        <a:font script="Cher" typeface="Plantagenet Cherokee"/>
-        <a:font script="Yiii" typeface="Microsoft Yi Baiti"/>
-        <a:font script="Tibt" typeface="Microsoft Himalaya"/>
-        <a:font script="Thaa" typeface="MV Boli"/>
-        <a:font script="Deva" typeface="Mangal"/>
-        <a:font script="Telu" typeface="Gautami"/>
-        <a:font script="Taml" typeface="Latha"/>
-        <a:font script="Syrc" typeface="Estrangelo Edessa"/>
-        <a:font script="Orya" typeface="Kalinga"/>
-        <a:font script="Mlym" typeface="Kartika"/>
-        <a:font script="Laoo" typeface="DokChampa"/>
-        <a:font script="Sinh" typeface="Iskoola Pota"/>
-        <a:font script="Mong" typeface="Mongolian Baiti"/>
-        <a:font script="Viet" typeface="Arial"/>
-        <a:font script="Uigh" typeface="Microsoft Uighur"/>
-        <a:font script="Geor" typeface="Sylfaen"/>
-        <a:font script="Armn" typeface="Arial"/>
-        <a:font script="Bugi" typeface="Leelawadee UI"/>
-        <a:font script="Bopo" typeface="Microsoft JhengHei"/>
-        <a:font script="Java" typeface="Javanese Text"/>
-        <a:font script="Lisu" typeface="Segoe UI"/>
-        <a:font script="Mymr" typeface="Myanmar Text"/>
-        <a:font script="Nkoo" typeface="Ebrima"/>
-        <a:font script="Olck" typeface="Nirmala UI"/>
-        <a:font script="Osma" typeface="Ebrima"/>
-        <a:font script="Phag" typeface="Phagspa"/>
-        <a:font script="Syrn" typeface="Estrangelo Edessa"/>
-        <a:font script="Syrj" typeface="Estrangelo Edessa"/>
-        <a:font script="Syre" typeface="Estrangelo Edessa"/>
-        <a:font script="Sora" typeface="Nirmala UI"/>
-        <a:font script="Tale" typeface="Microsoft Tai Le"/>
-        <a:font script="Talu" typeface="Microsoft New Tai Lue"/>
-        <a:font script="Tfng" typeface="Ebrima"/>
-      </a:minorFont>
-    </a:fontScheme>
-    <a:fmtScheme name="Office">
-      <a:fillStyleLst>
-        <a:solidFill>
-          <a:schemeClr val="phClr"/>
-        </a:solidFill>
-        <a:gradFill rotWithShape="true">
-          <a:gsLst>
-            <a:gs pos="0">
-              <a:schemeClr val="phClr">
-                <a:lumMod val="110000"/>
-                <a:satMod val="105000"/>
-                <a:tint val="67000"/>
-              </a:schemeClr>
-            </a:gs>
-            <a:gs pos="50000">
-              <a:schemeClr val="phClr">
-                <a:lumMod val="105000"/>
-                <a:satMod val="103000"/>
-                <a:tint val="73000"/>
-              </a:schemeClr>
-            </a:gs>
-            <a:gs pos="100000">
-              <a:schemeClr val="phClr">
-                <a:lumMod val="105000"/>
-                <a:satMod val="109000"/>
-                <a:tint val="81000"/>
-              </a:schemeClr>
-            </a:gs>
-          </a:gsLst>
-          <a:lin ang="5400000" scaled="false"/>
-        </a:gradFill>
-        <a:gradFill rotWithShape="true">
-          <a:gsLst>
-            <a:gs pos="0">
-              <a:schemeClr val="phClr">
-                <a:satMod val="103000"/>
-                <a:lumMod val="102000"/>
-                <a:tint val="94000"/>
-              </a:schemeClr>
-            </a:gs>
-            <a:gs pos="50000">
-              <a:schemeClr val="phClr">
-                <a:satMod val="110000"/>
-                <a:lumMod val="100000"/>
-                <a:shade val="100000"/>
-              </a:schemeClr>
-            </a:gs>
-            <a:gs pos="100000">
-              <a:schemeClr val="phClr">
-                <a:lumMod val="99000"/>
-                <a:satMod val="120000"/>
-                <a:shade val="78000"/>
-              </a:schemeClr>
-            </a:gs>
-          </a:gsLst>
-          <a:lin ang="5400000" scaled="false"/>
-        </a:gradFill>
-      </a:fillStyleLst>
-      <a:lnStyleLst>
-        <a:ln w="6350" cap="flat" cmpd="sng" algn="ctr">
-          <a:solidFill>
-            <a:schemeClr val="phClr"/>
-          </a:solidFill>
-          <a:prstDash val="solid"/>
-          <a:miter lim="800000"/>
-        </a:ln>
-        <a:ln w="12700" cap="flat" cmpd="sng" algn="ctr">
-          <a:solidFill>
-            <a:schemeClr val="phClr"/>
-          </a:solidFill>
-          <a:prstDash val="solid"/>
-          <a:miter lim="800000"/>
-        </a:ln>
-        <a:ln w="19050" cap="flat" cmpd="sng" algn="ctr">
-          <a:solidFill>
-            <a:schemeClr val="phClr"/>
-          </a:solidFill>
-          <a:prstDash val="solid"/>
-          <a:miter lim="800000"/>
-        </a:ln>
-      </a:lnStyleLst>
-      <a:effectStyleLst>
-        <a:effectStyle>
-          <a:effectLst/>
-        </a:effectStyle>
-        <a:effectStyle>
-          <a:effectLst/>
-        </a:effectStyle>
-        <a:effectStyle>
-          <a:effectLst>
-            <a:outerShdw blurRad="57150" dist="19050" dir="5400000" algn="ctr" rotWithShape="false">
-              <a:srgbClr val="000000">
-                <a:alpha val="63000"/>
-              </a:srgbClr>
-            </a:outerShdw>
-          </a:effectLst>
-        </a:effectStyle>
-      </a:effectStyleLst>
-      <a:bgFillStyleLst>
-        <a:solidFill>
-          <a:schemeClr val="phClr"/>
-        </a:solidFill>
-        <a:solidFill>
-          <a:schemeClr val="phClr">
-            <a:tint val="95000"/>
-            <a:satMod val="170000"/>
-          </a:schemeClr>
-        </a:solidFill>
-        <a:gradFill rotWithShape="true">
-          <a:gsLst>
-            <a:gs pos="0">
-              <a:schemeClr val="phClr">
-                <a:tint val="93000"/>
-                <a:satMod val="150000"/>
-                <a:shade val="98000"/>
-                <a:lumMod val="102000"/>
-              </a:schemeClr>
-            </a:gs>
-            <a:gs pos="50000">
-              <a:schemeClr val="phClr">
-                <a:tint val="98000"/>
-                <a:satMod val="130000"/>
-                <a:shade val="90000"/>
-                <a:lumMod val="103000"/>
-              </a:schemeClr>
-            </a:gs>
-            <a:gs pos="100000">
-              <a:schemeClr val="phClr">
-                <a:shade val="63000"/>
-                <a:satMod val="120000"/>
-              </a:schemeClr>
-            </a:gs>
-          </a:gsLst>
-          <a:lin ang="5400000" scaled="false"/>
-        </a:gradFill>
-      </a:bgFillStyleLst>
-    </a:fmtScheme>
-  </a:themeElements>
-  <a:objectDefaults/>
-  <a:extraClrSchemeLst/>
-</a:theme>
 </file>
</xml_diff>

<commit_message>
Coffee Report: Markets comes after Weather and before News (catalog order; saved reports on the Mac and staging reordered)
Co-Authored-By: Claude Opus 5.5 <noreply@anthropic.com>
</commit_message>
<xml_diff>
--- a/docs/admin-guide/Honcho_Administrators_Guide.docx
+++ b/docs/admin-guide/Honcho_Administrators_Guide.docx
@@ -13148,7 +13148,7 @@
                 <w:sz w:val="19"/>
                 <w:szCs w:val="19"/>
               </w:rPr>
-              <w:t xml:space="preserve">News</w:t>
+              <w:t xml:space="preserve">Markets</w:t>
             </w:r>
           </w:p>
         </w:tc>
@@ -13173,7 +13173,7 @@
                 <w:sz w:val="19"/>
                 <w:szCs w:val="19"/>
               </w:rPr>
-              <w:t xml:space="preserve">Recent headlines for each search topic, duplicates removed</w:t>
+              <w:t xml:space="preserve">The previous trading day's close and change for each ticker symbol you list (stocks and funds such as AAPL, indices ^GSPC S&amp;P 500, ^DJI Dow, ^IXIC Nasdaq, Bitcoin BTC-USD, gold GC=F, oil CL=F); WTI crude, the Prime Rate and the 30-year mortgage rate; exchange rates from US dollars</w:t>
             </w:r>
           </w:p>
         </w:tc>
@@ -13198,7 +13198,7 @@
                 <w:sz w:val="19"/>
                 <w:szCs w:val="19"/>
               </w:rPr>
-              <w:t xml:space="preserve">Topics, one per line; hours to look back; most headlines</w:t>
+              <w:t xml:space="preserve">Ticker symbols, one per line; tick oil and rates (these need a free FRED API key on the server, set by whoever looks after it); currency codes, one per line (EUR, GTQ)</w:t>
             </w:r>
           </w:p>
         </w:tc>
@@ -13227,7 +13227,7 @@
                 <w:sz w:val="19"/>
                 <w:szCs w:val="19"/>
               </w:rPr>
-              <w:t xml:space="preserve">YouTube channels</w:t>
+              <w:t xml:space="preserve">News</w:t>
             </w:r>
           </w:p>
         </w:tc>
@@ -13252,7 +13252,7 @@
                 <w:sz w:val="19"/>
                 <w:szCs w:val="19"/>
               </w:rPr>
-              <w:t xml:space="preserve">New videos from chosen channels</w:t>
+              <w:t xml:space="preserve">Recent headlines for each search topic, duplicates removed</w:t>
             </w:r>
           </w:p>
         </w:tc>
@@ -13277,7 +13277,7 @@
                 <w:sz w:val="19"/>
                 <w:szCs w:val="19"/>
               </w:rPr>
-              <w:t xml:space="preserve">One per line: "Name | channel ID" (the ID starts with UC); hours to look back</w:t>
+              <w:t xml:space="preserve">Topics, one per line; hours to look back; most headlines</w:t>
             </w:r>
           </w:p>
         </w:tc>
@@ -13306,7 +13306,7 @@
                 <w:sz w:val="19"/>
                 <w:szCs w:val="19"/>
               </w:rPr>
-              <w:t xml:space="preserve">Markets</w:t>
+              <w:t xml:space="preserve">YouTube channels</w:t>
             </w:r>
           </w:p>
         </w:tc>
@@ -13331,7 +13331,7 @@
                 <w:sz w:val="19"/>
                 <w:szCs w:val="19"/>
               </w:rPr>
-              <w:t xml:space="preserve">The previous trading day's close and change for each ticker symbol you list (stocks and funds such as AAPL, indices ^GSPC S&amp;P 500, ^DJI Dow, ^IXIC Nasdaq, Bitcoin BTC-USD, gold GC=F, oil CL=F); WTI crude, the Prime Rate and the 30-year mortgage rate; exchange rates from US dollars</w:t>
+              <w:t xml:space="preserve">New videos from chosen channels</w:t>
             </w:r>
           </w:p>
         </w:tc>
@@ -13356,7 +13356,7 @@
                 <w:sz w:val="19"/>
                 <w:szCs w:val="19"/>
               </w:rPr>
-              <w:t xml:space="preserve">Ticker symbols, one per line; tick oil and rates (these need a free FRED API key on the server, set by whoever looks after it); currency codes, one per line (EUR, GTQ)</w:t>
+              <w:t xml:space="preserve">One per line: "Name | channel ID" (the ID starts with UC); hours to look back</w:t>
             </w:r>
           </w:p>
         </w:tc>

</xml_diff>

<commit_message>
Coffee Report: bulletins at the top of every report (National and chapters); members' own Coffee Reports (My Coffee Report: Current members only, plain facts, email and Telegram via National's bot); guides and requirements
Co-Authored-By: Claude Opus 5.5 <noreply@anthropic.com>
</commit_message>
<xml_diff>
--- a/docs/admin-guide/Honcho_Administrators_Guide.docx
+++ b/docs/admin-guide/Honcho_Administrators_Guide.docx
@@ -14164,6 +14164,802 @@
         </w:rPr>
         <w:t xml:space="preserve"> shows the report and, underneath, exactly what each section collected, so you can check the facts.</w:t>
       </w:r>
+    </w:p>
+    <w:p>
+      <w:pPr>
+        <w:pStyle w:val="Heading2"/>
+        <w:pBdr>
+          <w:bottom w:val="single" w:color="2C3E50" w:sz="6" w:space="8"/>
+        </w:pBdr>
+        <w:spacing w:before="500" w:after="240"/>
+      </w:pPr>
+      <w:r>
+        <w:t xml:space="preserve">Bulletins</w:t>
+      </w:r>
+    </w:p>
+    <w:p>
+      <w:pPr>
+        <w:spacing w:after="160"/>
+      </w:pPr>
+      <w:r>
+        <w:rPr>
+          <w:rFonts w:ascii="Calibri" w:cs="Calibri" w:eastAsia="Calibri" w:hAnsi="Calibri"/>
+        </w:rPr>
+        <w:t xml:space="preserve">A </w:t>
+      </w:r>
+      <w:r>
+        <w:rPr>
+          <w:rFonts w:ascii="Calibri" w:cs="Calibri" w:eastAsia="Calibri" w:hAnsi="Calibri"/>
+          <w:b/>
+          <w:bCs/>
+        </w:rPr>
+        <w:t xml:space="preserve">bulletin</w:t>
+      </w:r>
+      <w:r>
+        <w:rPr>
+          <w:rFonts w:ascii="Calibri" w:cs="Calibri" w:eastAsia="Calibri" w:hAnsi="Calibri"/>
+        </w:rPr>
+        <w:t xml:space="preserve"> is a short notice printed word for word at the top of the Coffee Reports, right under the title, for as long as you choose. The AI never rewrites it.</w:t>
+      </w:r>
+    </w:p>
+    <w:p>
+      <w:pPr>
+        <w:pStyle w:val="ListParagraph"/>
+        <w:numPr>
+          <w:ilvl w:val="0"/>
+          <w:numId w:val="3"/>
+        </w:numPr>
+        <w:spacing w:after="100"/>
+      </w:pPr>
+      <w:r>
+        <w:rPr>
+          <w:rFonts w:ascii="Calibri" w:cs="Calibri" w:eastAsia="Calibri" w:hAnsi="Calibri"/>
+        </w:rPr>
+        <w:t xml:space="preserve">Open </w:t>
+      </w:r>
+      <w:r>
+        <w:rPr>
+          <w:rFonts w:ascii="Calibri" w:cs="Calibri" w:eastAsia="Calibri" w:hAnsi="Calibri"/>
+          <w:b/>
+          <w:bCs/>
+        </w:rPr>
+        <w:t xml:space="preserve">EMS &gt; System Admin &gt; Coffee Report</w:t>
+      </w:r>
+      <w:r>
+        <w:rPr>
+          <w:rFonts w:ascii="Calibri" w:cs="Calibri" w:eastAsia="Calibri" w:hAnsi="Calibri"/>
+        </w:rPr>
+        <w:t xml:space="preserve"> (Chapter Admins: </w:t>
+      </w:r>
+      <w:r>
+        <w:rPr>
+          <w:rFonts w:ascii="Calibri" w:cs="Calibri" w:eastAsia="Calibri" w:hAnsi="Calibri"/>
+          <w:b/>
+          <w:bCs/>
+        </w:rPr>
+        <w:t xml:space="preserve">EMS &gt; Chapter Admin &gt; Coffee Report</w:t>
+      </w:r>
+      <w:r>
+        <w:rPr>
+          <w:rFonts w:ascii="Calibri" w:cs="Calibri" w:eastAsia="Calibri" w:hAnsi="Calibri"/>
+        </w:rPr>
+        <w:t xml:space="preserve">) and click </w:t>
+      </w:r>
+      <w:r>
+        <w:rPr>
+          <w:rFonts w:ascii="Calibri" w:cs="Calibri" w:eastAsia="Calibri" w:hAnsi="Calibri"/>
+          <w:b/>
+          <w:bCs/>
+        </w:rPr>
+        <w:t xml:space="preserve">Bulletins</w:t>
+      </w:r>
+      <w:r>
+        <w:rPr>
+          <w:rFonts w:ascii="Calibri" w:cs="Calibri" w:eastAsia="Calibri" w:hAnsi="Calibri"/>
+        </w:rPr>
+        <w:t xml:space="preserve"> on your report's row.</w:t>
+      </w:r>
+    </w:p>
+    <w:p>
+      <w:pPr>
+        <w:pStyle w:val="ListParagraph"/>
+        <w:numPr>
+          <w:ilvl w:val="0"/>
+          <w:numId w:val="3"/>
+        </w:numPr>
+        <w:spacing w:after="100"/>
+      </w:pPr>
+      <w:r>
+        <w:rPr>
+          <w:rFonts w:ascii="Calibri" w:cs="Calibri" w:eastAsia="Calibri" w:hAnsi="Calibri"/>
+        </w:rPr>
+        <w:t xml:space="preserve">Click </w:t>
+      </w:r>
+      <w:r>
+        <w:rPr>
+          <w:rFonts w:ascii="Calibri" w:cs="Calibri" w:eastAsia="Calibri" w:hAnsi="Calibri"/>
+          <w:b/>
+          <w:bCs/>
+        </w:rPr>
+        <w:t xml:space="preserve">Add</w:t>
+      </w:r>
+      <w:r>
+        <w:rPr>
+          <w:rFonts w:ascii="Calibri" w:cs="Calibri" w:eastAsia="Calibri" w:hAnsi="Calibri"/>
+        </w:rPr>
+        <w:t xml:space="preserve">. Give it a </w:t>
+      </w:r>
+      <w:r>
+        <w:rPr>
+          <w:rFonts w:ascii="Calibri" w:cs="Calibri" w:eastAsia="Calibri" w:hAnsi="Calibri"/>
+          <w:b/>
+          <w:bCs/>
+        </w:rPr>
+        <w:t xml:space="preserve">title</w:t>
+      </w:r>
+      <w:r>
+        <w:rPr>
+          <w:rFonts w:ascii="Calibri" w:cs="Calibri" w:eastAsia="Calibri" w:hAnsi="Calibri"/>
+        </w:rPr>
+        <w:t xml:space="preserve">, a short </w:t>
+      </w:r>
+      <w:r>
+        <w:rPr>
+          <w:rFonts w:ascii="Calibri" w:cs="Calibri" w:eastAsia="Calibri" w:hAnsi="Calibri"/>
+          <w:b/>
+          <w:bCs/>
+        </w:rPr>
+        <w:t xml:space="preserve">message</w:t>
+      </w:r>
+      <w:r>
+        <w:rPr>
+          <w:rFonts w:ascii="Calibri" w:cs="Calibri" w:eastAsia="Calibri" w:hAnsi="Calibri"/>
+        </w:rPr>
+        <w:t xml:space="preserve"> and, if you like, a </w:t>
+      </w:r>
+      <w:r>
+        <w:rPr>
+          <w:rFonts w:ascii="Calibri" w:cs="Calibri" w:eastAsia="Calibri" w:hAnsi="Calibri"/>
+          <w:b/>
+          <w:bCs/>
+        </w:rPr>
+        <w:t xml:space="preserve">link</w:t>
+      </w:r>
+      <w:r>
+        <w:rPr>
+          <w:rFonts w:ascii="Calibri" w:cs="Calibri" w:eastAsia="Calibri" w:hAnsi="Calibri"/>
+        </w:rPr>
+        <w:t xml:space="preserve"> (a full address starting with https://).</w:t>
+      </w:r>
+    </w:p>
+    <w:p>
+      <w:pPr>
+        <w:pStyle w:val="ListParagraph"/>
+        <w:numPr>
+          <w:ilvl w:val="0"/>
+          <w:numId w:val="3"/>
+        </w:numPr>
+        <w:spacing w:after="100"/>
+      </w:pPr>
+      <w:r>
+        <w:rPr>
+          <w:rFonts w:ascii="Calibri" w:cs="Calibri" w:eastAsia="Calibri" w:hAnsi="Calibri"/>
+        </w:rPr>
+        <w:t xml:space="preserve">Choose where it goes: </w:t>
+      </w:r>
+      <w:r>
+        <w:rPr>
+          <w:rFonts w:ascii="Calibri" w:cs="Calibri" w:eastAsia="Calibri" w:hAnsi="Calibri"/>
+          <w:b/>
+          <w:bCs/>
+        </w:rPr>
+        <w:t xml:space="preserve">every report</w:t>
+      </w:r>
+      <w:r>
+        <w:rPr>
+          <w:rFonts w:ascii="Calibri" w:cs="Calibri" w:eastAsia="Calibri" w:hAnsi="Calibri"/>
+        </w:rPr>
+        <w:t xml:space="preserve"> (admins and members), </w:t>
+      </w:r>
+      <w:r>
+        <w:rPr>
+          <w:rFonts w:ascii="Calibri" w:cs="Calibri" w:eastAsia="Calibri" w:hAnsi="Calibri"/>
+          <w:b/>
+          <w:bCs/>
+        </w:rPr>
+        <w:t xml:space="preserve">admins' reports only</w:t>
+      </w:r>
+      <w:r>
+        <w:rPr>
+          <w:rFonts w:ascii="Calibri" w:cs="Calibri" w:eastAsia="Calibri" w:hAnsi="Calibri"/>
+        </w:rPr>
+        <w:t xml:space="preserve">, or </w:t>
+      </w:r>
+      <w:r>
+        <w:rPr>
+          <w:rFonts w:ascii="Calibri" w:cs="Calibri" w:eastAsia="Calibri" w:hAnsi="Calibri"/>
+          <w:b/>
+          <w:bCs/>
+        </w:rPr>
+        <w:t xml:space="preserve">members' own reports only</w:t>
+      </w:r>
+      <w:r>
+        <w:rPr>
+          <w:rFonts w:ascii="Calibri" w:cs="Calibri" w:eastAsia="Calibri" w:hAnsi="Calibri"/>
+        </w:rPr>
+        <w:t xml:space="preserve">.</w:t>
+      </w:r>
+    </w:p>
+    <w:p>
+      <w:pPr>
+        <w:pStyle w:val="ListParagraph"/>
+        <w:numPr>
+          <w:ilvl w:val="0"/>
+          <w:numId w:val="3"/>
+        </w:numPr>
+        <w:spacing w:after="100"/>
+      </w:pPr>
+      <w:r>
+        <w:rPr>
+          <w:rFonts w:ascii="Calibri" w:cs="Calibri" w:eastAsia="Calibri" w:hAnsi="Calibri"/>
+        </w:rPr>
+        <w:t xml:space="preserve">Set </w:t>
+      </w:r>
+      <w:r>
+        <w:rPr>
+          <w:rFonts w:ascii="Calibri" w:cs="Calibri" w:eastAsia="Calibri" w:hAnsi="Calibri"/>
+          <w:b/>
+          <w:bCs/>
+        </w:rPr>
+        <w:t xml:space="preserve">Shows from</w:t>
+      </w:r>
+      <w:r>
+        <w:rPr>
+          <w:rFonts w:ascii="Calibri" w:cs="Calibri" w:eastAsia="Calibri" w:hAnsi="Calibri"/>
+        </w:rPr>
+        <w:t xml:space="preserve"> and </w:t>
+      </w:r>
+      <w:r>
+        <w:rPr>
+          <w:rFonts w:ascii="Calibri" w:cs="Calibri" w:eastAsia="Calibri" w:hAnsi="Calibri"/>
+          <w:b/>
+          <w:bCs/>
+        </w:rPr>
+        <w:t xml:space="preserve">until</w:t>
+      </w:r>
+      <w:r>
+        <w:rPr>
+          <w:rFonts w:ascii="Calibri" w:cs="Calibri" w:eastAsia="Calibri" w:hAnsi="Calibri"/>
+        </w:rPr>
+        <w:t xml:space="preserve"> (both optional: blank means now, and no end), and click </w:t>
+      </w:r>
+      <w:r>
+        <w:rPr>
+          <w:rFonts w:ascii="Calibri" w:cs="Calibri" w:eastAsia="Calibri" w:hAnsi="Calibri"/>
+          <w:b/>
+          <w:bCs/>
+        </w:rPr>
+        <w:t xml:space="preserve">Save</w:t>
+      </w:r>
+      <w:r>
+        <w:rPr>
+          <w:rFonts w:ascii="Calibri" w:cs="Calibri" w:eastAsia="Calibri" w:hAnsi="Calibri"/>
+        </w:rPr>
+        <w:t xml:space="preserve">.</w:t>
+      </w:r>
+    </w:p>
+    <w:p>
+      <w:pPr>
+        <w:spacing w:after="120"/>
+      </w:pPr>
+    </w:p>
+    <w:tbl>
+      <w:tblPr>
+        <w:tblW w:type="dxa" w:w="9360"/>
+        <w:tblBorders>
+          <w:top w:val="single" w:color="auto" w:sz="4"/>
+          <w:left w:val="single" w:color="auto" w:sz="4"/>
+          <w:bottom w:val="single" w:color="auto" w:sz="4"/>
+          <w:right w:val="single" w:color="auto" w:sz="4"/>
+          <w:insideH w:val="single" w:color="auto" w:sz="4"/>
+          <w:insideV w:val="single" w:color="auto" w:sz="4"/>
+        </w:tblBorders>
+      </w:tblPr>
+      <w:tblGrid>
+        <w:gridCol w:w="4680"/>
+        <w:gridCol w:w="4680"/>
+      </w:tblGrid>
+      <w:tr>
+        <w:trPr>
+          <w:tblHeader/>
+        </w:trPr>
+        <w:tc>
+          <w:tcPr>
+            <w:tcW w:type="dxa" w:w="4680"/>
+            <w:shd w:fill="2C3E50" w:val="clear"/>
+            <w:tcMar>
+              <w:top w:type="dxa" w:w="100"/>
+              <w:left w:type="dxa" w:w="120"/>
+              <w:bottom w:type="dxa" w:w="100"/>
+              <w:right w:type="dxa" w:w="120"/>
+            </w:tcMar>
+          </w:tcPr>
+          <w:p>
+            <w:pPr>
+              <w:spacing w:after="0"/>
+            </w:pPr>
+            <w:r>
+              <w:rPr>
+                <w:rFonts w:ascii="Calibri" w:cs="Calibri" w:eastAsia="Calibri" w:hAnsi="Calibri"/>
+                <w:b/>
+                <w:bCs/>
+                <w:color w:val="FFFFFF"/>
+                <w:sz w:val="20"/>
+                <w:szCs w:val="20"/>
+              </w:rPr>
+              <w:t xml:space="preserve">Posted by</w:t>
+            </w:r>
+          </w:p>
+        </w:tc>
+        <w:tc>
+          <w:tcPr>
+            <w:tcW w:type="dxa" w:w="4680"/>
+            <w:shd w:fill="2C3E50" w:val="clear"/>
+            <w:tcMar>
+              <w:top w:type="dxa" w:w="100"/>
+              <w:left w:type="dxa" w:w="120"/>
+              <w:bottom w:type="dxa" w:w="100"/>
+              <w:right w:type="dxa" w:w="120"/>
+            </w:tcMar>
+          </w:tcPr>
+          <w:p>
+            <w:pPr>
+              <w:spacing w:after="0"/>
+            </w:pPr>
+            <w:r>
+              <w:rPr>
+                <w:rFonts w:ascii="Calibri" w:cs="Calibri" w:eastAsia="Calibri" w:hAnsi="Calibri"/>
+                <w:b/>
+                <w:bCs/>
+                <w:color w:val="FFFFFF"/>
+                <w:sz w:val="20"/>
+                <w:szCs w:val="20"/>
+              </w:rPr>
+              <w:t xml:space="preserve">Appears on</w:t>
+            </w:r>
+          </w:p>
+        </w:tc>
+      </w:tr>
+      <w:tr>
+        <w:tc>
+          <w:tcPr>
+            <w:tcW w:type="dxa" w:w="4680"/>
+            <w:shd w:fill="FFFFFF" w:val="clear"/>
+            <w:tcMar>
+              <w:top w:type="dxa" w:w="100"/>
+              <w:left w:type="dxa" w:w="120"/>
+              <w:bottom w:type="dxa" w:w="100"/>
+              <w:right w:type="dxa" w:w="120"/>
+            </w:tcMar>
+          </w:tcPr>
+          <w:p>
+            <w:pPr>
+              <w:spacing w:after="0"/>
+            </w:pPr>
+            <w:r>
+              <w:rPr>
+                <w:rFonts w:ascii="Calibri" w:cs="Calibri" w:eastAsia="Calibri" w:hAnsi="Calibri"/>
+                <w:b/>
+                <w:bCs/>
+                <w:sz w:val="19"/>
+                <w:szCs w:val="19"/>
+              </w:rPr>
+              <w:t xml:space="preserve">National</w:t>
+            </w:r>
+            <w:r>
+              <w:rPr>
+                <w:rFonts w:ascii="Calibri" w:cs="Calibri" w:eastAsia="Calibri" w:hAnsi="Calibri"/>
+                <w:sz w:val="19"/>
+                <w:szCs w:val="19"/>
+              </w:rPr>
+              <w:t xml:space="preserve"> (System Admins)</w:t>
+            </w:r>
+          </w:p>
+        </w:tc>
+        <w:tc>
+          <w:tcPr>
+            <w:tcW w:type="dxa" w:w="4680"/>
+            <w:shd w:fill="FFFFFF" w:val="clear"/>
+            <w:tcMar>
+              <w:top w:type="dxa" w:w="100"/>
+              <w:left w:type="dxa" w:w="120"/>
+              <w:bottom w:type="dxa" w:w="100"/>
+              <w:right w:type="dxa" w:w="120"/>
+            </w:tcMar>
+          </w:tcPr>
+          <w:p>
+            <w:pPr>
+              <w:spacing w:after="0"/>
+            </w:pPr>
+            <w:r>
+              <w:rPr>
+                <w:rFonts w:ascii="Calibri" w:cs="Calibri" w:eastAsia="Calibri" w:hAnsi="Calibri"/>
+                <w:sz w:val="19"/>
+                <w:szCs w:val="19"/>
+              </w:rPr>
+              <w:t xml:space="preserve">National's report, every chapter's admin report and every member's own report (as chosen)</w:t>
+            </w:r>
+          </w:p>
+        </w:tc>
+      </w:tr>
+      <w:tr>
+        <w:tc>
+          <w:tcPr>
+            <w:tcW w:type="dxa" w:w="4680"/>
+            <w:shd w:fill="F7F9FA" w:val="clear"/>
+            <w:tcMar>
+              <w:top w:type="dxa" w:w="100"/>
+              <w:left w:type="dxa" w:w="120"/>
+              <w:bottom w:type="dxa" w:w="100"/>
+              <w:right w:type="dxa" w:w="120"/>
+            </w:tcMar>
+          </w:tcPr>
+          <w:p>
+            <w:pPr>
+              <w:spacing w:after="0"/>
+            </w:pPr>
+            <w:r>
+              <w:rPr>
+                <w:rFonts w:ascii="Calibri" w:cs="Calibri" w:eastAsia="Calibri" w:hAnsi="Calibri"/>
+                <w:b/>
+                <w:bCs/>
+                <w:sz w:val="19"/>
+                <w:szCs w:val="19"/>
+              </w:rPr>
+              <w:t xml:space="preserve">A chapter</w:t>
+            </w:r>
+            <w:r>
+              <w:rPr>
+                <w:rFonts w:ascii="Calibri" w:cs="Calibri" w:eastAsia="Calibri" w:hAnsi="Calibri"/>
+                <w:sz w:val="19"/>
+                <w:szCs w:val="19"/>
+              </w:rPr>
+              <w:t xml:space="preserve"> (its Chapter Admins)</w:t>
+            </w:r>
+          </w:p>
+        </w:tc>
+        <w:tc>
+          <w:tcPr>
+            <w:tcW w:type="dxa" w:w="4680"/>
+            <w:shd w:fill="F7F9FA" w:val="clear"/>
+            <w:tcMar>
+              <w:top w:type="dxa" w:w="100"/>
+              <w:left w:type="dxa" w:w="120"/>
+              <w:bottom w:type="dxa" w:w="100"/>
+              <w:right w:type="dxa" w:w="120"/>
+            </w:tcMar>
+          </w:tcPr>
+          <w:p>
+            <w:pPr>
+              <w:spacing w:after="0"/>
+            </w:pPr>
+            <w:r>
+              <w:rPr>
+                <w:rFonts w:ascii="Calibri" w:cs="Calibri" w:eastAsia="Calibri" w:hAnsi="Calibri"/>
+                <w:sz w:val="19"/>
+                <w:szCs w:val="19"/>
+              </w:rPr>
+              <w:t xml:space="preserve">That chapter's admin report and its members' own reports (as chosen)</w:t>
+            </w:r>
+          </w:p>
+        </w:tc>
+      </w:tr>
+    </w:tbl>
+    <w:p>
+      <w:pPr>
+        <w:spacing w:after="240"/>
+      </w:pPr>
+    </w:p>
+    <w:p>
+      <w:pPr>
+        <w:spacing w:after="160"/>
+      </w:pPr>
+      <w:r>
+        <w:rPr>
+          <w:rFonts w:ascii="Calibri" w:cs="Calibri" w:eastAsia="Calibri" w:hAnsi="Calibri"/>
+        </w:rPr>
+        <w:t xml:space="preserve">The list shows whether each bulletin is </w:t>
+      </w:r>
+      <w:r>
+        <w:rPr>
+          <w:rFonts w:ascii="Calibri" w:cs="Calibri" w:eastAsia="Calibri" w:hAnsi="Calibri"/>
+          <w:b/>
+          <w:bCs/>
+        </w:rPr>
+        <w:t xml:space="preserve">Showing</w:t>
+      </w:r>
+      <w:r>
+        <w:rPr>
+          <w:rFonts w:ascii="Calibri" w:cs="Calibri" w:eastAsia="Calibri" w:hAnsi="Calibri"/>
+        </w:rPr>
+        <w:t xml:space="preserve"> today, </w:t>
+      </w:r>
+      <w:r>
+        <w:rPr>
+          <w:rFonts w:ascii="Calibri" w:cs="Calibri" w:eastAsia="Calibri" w:hAnsi="Calibri"/>
+          <w:b/>
+          <w:bCs/>
+        </w:rPr>
+        <w:t xml:space="preserve">Starts later</w:t>
+      </w:r>
+      <w:r>
+        <w:rPr>
+          <w:rFonts w:ascii="Calibri" w:cs="Calibri" w:eastAsia="Calibri" w:hAnsi="Calibri"/>
+        </w:rPr>
+        <w:t xml:space="preserve">, has </w:t>
+      </w:r>
+      <w:r>
+        <w:rPr>
+          <w:rFonts w:ascii="Calibri" w:cs="Calibri" w:eastAsia="Calibri" w:hAnsi="Calibri"/>
+          <w:b/>
+          <w:bCs/>
+        </w:rPr>
+        <w:t xml:space="preserve">Ended</w:t>
+      </w:r>
+      <w:r>
+        <w:rPr>
+          <w:rFonts w:ascii="Calibri" w:cs="Calibri" w:eastAsia="Calibri" w:hAnsi="Calibri"/>
+        </w:rPr>
+        <w:t xml:space="preserve"> or is </w:t>
+      </w:r>
+      <w:r>
+        <w:rPr>
+          <w:rFonts w:ascii="Calibri" w:cs="Calibri" w:eastAsia="Calibri" w:hAnsi="Calibri"/>
+          <w:b/>
+          <w:bCs/>
+        </w:rPr>
+        <w:t xml:space="preserve">Hidden</w:t>
+      </w:r>
+      <w:r>
+        <w:rPr>
+          <w:rFonts w:ascii="Calibri" w:cs="Calibri" w:eastAsia="Calibri" w:hAnsi="Calibri"/>
+        </w:rPr>
+        <w:t xml:space="preserve">. Untick </w:t>
+      </w:r>
+      <w:r>
+        <w:rPr>
+          <w:rFonts w:ascii="Calibri" w:cs="Calibri" w:eastAsia="Calibri" w:hAnsi="Calibri"/>
+          <w:b/>
+          <w:bCs/>
+        </w:rPr>
+        <w:t xml:space="preserve">Shown</w:t>
+      </w:r>
+      <w:r>
+        <w:rPr>
+          <w:rFonts w:ascii="Calibri" w:cs="Calibri" w:eastAsia="Calibri" w:hAnsi="Calibri"/>
+        </w:rPr>
+        <w:t xml:space="preserve"> to take one down without deleting it; </w:t>
+      </w:r>
+      <w:r>
+        <w:rPr>
+          <w:rFonts w:ascii="Calibri" w:cs="Calibri" w:eastAsia="Calibri" w:hAnsi="Calibri"/>
+          <w:b/>
+          <w:bCs/>
+        </w:rPr>
+        <w:t xml:space="preserve">Delete</w:t>
+      </w:r>
+      <w:r>
+        <w:rPr>
+          <w:rFonts w:ascii="Calibri" w:cs="Calibri" w:eastAsia="Calibri" w:hAnsi="Calibri"/>
+        </w:rPr>
+        <w:t xml:space="preserve"> asks for a second click.</w:t>
+      </w:r>
+    </w:p>
+    <w:p>
+      <w:pPr>
+        <w:pStyle w:val="Heading2"/>
+        <w:pBdr>
+          <w:bottom w:val="single" w:color="2C3E50" w:sz="6" w:space="8"/>
+        </w:pBdr>
+        <w:spacing w:before="500" w:after="240"/>
+      </w:pPr>
+      <w:r>
+        <w:t xml:space="preserve">Members' Own Reports</w:t>
+      </w:r>
+    </w:p>
+    <w:p>
+      <w:pPr>
+        <w:spacing w:after="160"/>
+      </w:pPr>
+      <w:r>
+        <w:rPr>
+          <w:rFonts w:ascii="Calibri" w:cs="Calibri" w:eastAsia="Calibri" w:hAnsi="Calibri"/>
+        </w:rPr>
+        <w:t xml:space="preserve">Members can also get their own Daily Coffee Report: bulletins first, then the sections they choose (membership numbers, events, Sunshine and Bulletin Board, weather, markets, news and sports). It is plain facts, without AI, sent to the member's own email address and, if they link it, their Telegram.</w:t>
+      </w:r>
+    </w:p>
+    <w:p>
+      <w:pPr>
+        <w:pStyle w:val="ListParagraph"/>
+        <w:numPr>
+          <w:ilvl w:val="0"/>
+          <w:numId w:val="2"/>
+        </w:numPr>
+        <w:spacing w:after="100"/>
+      </w:pPr>
+      <w:r>
+        <w:rPr>
+          <w:rFonts w:ascii="Calibri" w:cs="Calibri" w:eastAsia="Calibri" w:hAnsi="Calibri"/>
+          <w:b/>
+          <w:bCs/>
+        </w:rPr>
+        <w:t xml:space="preserve">Switch it on for the organization:</w:t>
+      </w:r>
+      <w:r>
+        <w:rPr>
+          <w:rFonts w:ascii="Calibri" w:cs="Calibri" w:eastAsia="Calibri" w:hAnsi="Calibri"/>
+        </w:rPr>
+        <w:t xml:space="preserve"> </w:t>
+      </w:r>
+      <w:r>
+        <w:rPr>
+          <w:rFonts w:ascii="Calibri" w:cs="Calibri" w:eastAsia="Calibri" w:hAnsi="Calibri"/>
+          <w:b/>
+          <w:bCs/>
+        </w:rPr>
+        <w:t xml:space="preserve">System Settings &gt; Features &amp; Policy &gt; Members can get their own Coffee Report</w:t>
+      </w:r>
+      <w:r>
+        <w:rPr>
+          <w:rFonts w:ascii="Calibri" w:cs="Calibri" w:eastAsia="Calibri" w:hAnsi="Calibri"/>
+        </w:rPr>
+        <w:t xml:space="preserve">. Members then see </w:t>
+      </w:r>
+      <w:r>
+        <w:rPr>
+          <w:rFonts w:ascii="Calibri" w:cs="Calibri" w:eastAsia="Calibri" w:hAnsi="Calibri"/>
+          <w:b/>
+          <w:bCs/>
+        </w:rPr>
+        <w:t xml:space="preserve">My Coffee Report</w:t>
+      </w:r>
+      <w:r>
+        <w:rPr>
+          <w:rFonts w:ascii="Calibri" w:cs="Calibri" w:eastAsia="Calibri" w:hAnsi="Calibri"/>
+        </w:rPr>
+        <w:t xml:space="preserve"> in their menu. The AI module must be on.</w:t>
+      </w:r>
+    </w:p>
+    <w:p>
+      <w:pPr>
+        <w:pStyle w:val="ListParagraph"/>
+        <w:numPr>
+          <w:ilvl w:val="0"/>
+          <w:numId w:val="2"/>
+        </w:numPr>
+        <w:spacing w:after="100"/>
+      </w:pPr>
+      <w:r>
+        <w:rPr>
+          <w:rFonts w:ascii="Calibri" w:cs="Calibri" w:eastAsia="Calibri" w:hAnsi="Calibri"/>
+          <w:b/>
+          <w:bCs/>
+        </w:rPr>
+        <w:t xml:space="preserve">Only Current members</w:t>
+      </w:r>
+      <w:r>
+        <w:rPr>
+          <w:rFonts w:ascii="Calibri" w:cs="Calibri" w:eastAsia="Calibri" w:hAnsi="Calibri"/>
+        </w:rPr>
+        <w:t xml:space="preserve"> can switch theirs on; anyone else sees why not. A member who stops being Current simply stops receiving it.</w:t>
+      </w:r>
+    </w:p>
+    <w:p>
+      <w:pPr>
+        <w:pStyle w:val="ListParagraph"/>
+        <w:numPr>
+          <w:ilvl w:val="0"/>
+          <w:numId w:val="2"/>
+        </w:numPr>
+        <w:spacing w:after="100"/>
+      </w:pPr>
+      <w:r>
+        <w:rPr>
+          <w:rFonts w:ascii="Calibri" w:cs="Calibri" w:eastAsia="Calibri" w:hAnsi="Calibri"/>
+          <w:b/>
+          <w:bCs/>
+        </w:rPr>
+        <w:t xml:space="preserve">Membership numbers for members</w:t>
+      </w:r>
+      <w:r>
+        <w:rPr>
+          <w:rFonts w:ascii="Calibri" w:cs="Calibri" w:eastAsia="Calibri" w:hAnsi="Calibri"/>
+        </w:rPr>
+        <w:t xml:space="preserve"> are the totals of Current members nationwide and in their chapter.</w:t>
+      </w:r>
+    </w:p>
+    <w:p>
+      <w:pPr>
+        <w:pStyle w:val="ListParagraph"/>
+        <w:numPr>
+          <w:ilvl w:val="0"/>
+          <w:numId w:val="2"/>
+        </w:numPr>
+        <w:spacing w:after="100"/>
+      </w:pPr>
+      <w:r>
+        <w:rPr>
+          <w:rFonts w:ascii="Calibri" w:cs="Calibri" w:eastAsia="Calibri" w:hAnsi="Calibri"/>
+          <w:b/>
+          <w:bCs/>
+        </w:rPr>
+        <w:t xml:space="preserve">Telegram:</w:t>
+      </w:r>
+      <w:r>
+        <w:rPr>
+          <w:rFonts w:ascii="Calibri" w:cs="Calibri" w:eastAsia="Calibri" w:hAnsi="Calibri"/>
+        </w:rPr>
+        <w:t xml:space="preserve"> members link their own Telegram to the organization's bot, which is the bot saved on </w:t>
+      </w:r>
+      <w:r>
+        <w:rPr>
+          <w:rFonts w:ascii="Calibri" w:cs="Calibri" w:eastAsia="Calibri" w:hAnsi="Calibri"/>
+          <w:b/>
+          <w:bCs/>
+        </w:rPr>
+        <w:t xml:space="preserve">National's</w:t>
+      </w:r>
+      <w:r>
+        <w:rPr>
+          <w:rFonts w:ascii="Calibri" w:cs="Calibri" w:eastAsia="Calibri" w:hAnsi="Calibri"/>
+        </w:rPr>
+        <w:t xml:space="preserve"> Coffee Report (Step 4). Set that up first, and consider giving the bot the organization's name.</w:t>
+      </w:r>
+    </w:p>
+    <w:p>
+      <w:pPr>
+        <w:pStyle w:val="ListParagraph"/>
+        <w:numPr>
+          <w:ilvl w:val="0"/>
+          <w:numId w:val="2"/>
+        </w:numPr>
+        <w:spacing w:after="100"/>
+      </w:pPr>
+      <w:r>
+        <w:rPr>
+          <w:rFonts w:ascii="Calibri" w:cs="Calibri" w:eastAsia="Calibri" w:hAnsi="Calibri"/>
+          <w:b/>
+          <w:bCs/>
+        </w:rPr>
+        <w:t xml:space="preserve">Email volume:</w:t>
+      </w:r>
+      <w:r>
+        <w:rPr>
+          <w:rFonts w:ascii="Calibri" w:cs="Calibri" w:eastAsia="Calibri" w:hAnsi="Calibri"/>
+        </w:rPr>
+        <w:t xml:space="preserve"> every member report is one email a day. Brevo's free plan sends 300 a day; if many members switch it on, the Brevo plan must be sized to match.</w:t>
+      </w:r>
+    </w:p>
+    <w:p>
+      <w:pPr>
+        <w:pStyle w:val="ListParagraph"/>
+        <w:numPr>
+          <w:ilvl w:val="0"/>
+          <w:numId w:val="2"/>
+        </w:numPr>
+        <w:spacing w:after="100"/>
+      </w:pPr>
+      <w:r>
+        <w:rPr>
+          <w:rFonts w:ascii="Calibri" w:cs="Calibri" w:eastAsia="Calibri" w:hAnsi="Calibri"/>
+        </w:rPr>
+        <w:t xml:space="preserve">The Coffee Report page shows how many members have theirs switched on.</w:t>
+      </w:r>
+    </w:p>
+    <w:p>
+      <w:pPr>
+        <w:spacing w:after="120"/>
+      </w:pPr>
     </w:p>
     <w:p>
       <w:pPr>

</xml_diff>

<commit_message>
Coffee Report: Telegram Chat IDs take a list (one per line); each person or group gets its own copy; guides and requirements
Co-Authored-By: Claude Opus 5.5 <noreply@anthropic.com>
</commit_message>
<xml_diff>
--- a/docs/admin-guide/Honcho_Administrators_Guide.docx
+++ b/docs/admin-guide/Honcho_Administrators_Guide.docx
@@ -13681,7 +13681,7 @@
         <w:rPr>
           <w:rFonts w:ascii="Calibri" w:cs="Calibri" w:eastAsia="Calibri" w:hAnsi="Calibri"/>
         </w:rPr>
-        <w:t xml:space="preserve">The report can also go to a Telegram chat: one person, or a group with the admins in it. Email and Telegram are sent separately, so if one fails the other still arrives.</w:t>
+        <w:t xml:space="preserve">The report can also go to Telegram: to several people, each getting their own copy, and/or to a group with the admins in it. Email and Telegram are sent separately, so if one fails the other still arrives.</w:t>
       </w:r>
     </w:p>
     <w:p>
@@ -13755,7 +13755,7 @@
         <w:rPr>
           <w:rFonts w:ascii="Calibri" w:cs="Calibri" w:eastAsia="Calibri" w:hAnsi="Calibri"/>
         </w:rPr>
-        <w:t xml:space="preserve">For a group: add the new bot to your admins' group. For yourself: open the bot and press </w:t>
+        <w:t xml:space="preserve">Each person who should get it opens the bot in Telegram (search for its username) and presses </w:t>
       </w:r>
       <w:r>
         <w:rPr>
@@ -13769,7 +13769,7 @@
         <w:rPr>
           <w:rFonts w:ascii="Calibri" w:cs="Calibri" w:eastAsia="Calibri" w:hAnsi="Calibri"/>
         </w:rPr>
-        <w:t xml:space="preserve">. Then post any message (in the group or to the bot).</w:t>
+        <w:t xml:space="preserve">; bots can't message anyone first. For a group: add the bot to the group and post any message there.</w:t>
       </w:r>
     </w:p>
     <w:p>
@@ -13857,21 +13857,21 @@
         <w:rPr>
           <w:rFonts w:ascii="Calibri" w:cs="Calibri" w:eastAsia="Calibri" w:hAnsi="Calibri"/>
         </w:rPr>
-        <w:t xml:space="preserve">. Honcho lists the chats that have messaged the bot; copy the number (groups start with -) into </w:t>
-      </w:r>
-      <w:r>
-        <w:rPr>
-          <w:rFonts w:ascii="Calibri" w:cs="Calibri" w:eastAsia="Calibri" w:hAnsi="Calibri"/>
-          <w:b/>
-          <w:bCs/>
-        </w:rPr>
-        <w:t xml:space="preserve">Chat ID</w:t>
-      </w:r>
-      <w:r>
-        <w:rPr>
-          <w:rFonts w:ascii="Calibri" w:cs="Calibri" w:eastAsia="Calibri" w:hAnsi="Calibri"/>
-        </w:rPr>
-        <w:t xml:space="preserve"> and </w:t>
+        <w:t xml:space="preserve">. Honcho lists the chats that have messaged the bot; copy each number (groups start with -) into </w:t>
+      </w:r>
+      <w:r>
+        <w:rPr>
+          <w:rFonts w:ascii="Calibri" w:cs="Calibri" w:eastAsia="Calibri" w:hAnsi="Calibri"/>
+          <w:b/>
+          <w:bCs/>
+        </w:rPr>
+        <w:t xml:space="preserve">Chat IDs</w:t>
+      </w:r>
+      <w:r>
+        <w:rPr>
+          <w:rFonts w:ascii="Calibri" w:cs="Calibri" w:eastAsia="Calibri" w:hAnsi="Calibri"/>
+        </w:rPr>
+        <w:t xml:space="preserve">, one per line, and </w:t>
       </w:r>
       <w:r>
         <w:rPr>
@@ -13885,7 +13885,7 @@
         <w:rPr>
           <w:rFonts w:ascii="Calibri" w:cs="Calibri" w:eastAsia="Calibri" w:hAnsi="Calibri"/>
         </w:rPr>
-        <w:t xml:space="preserve"> again.</w:t>
+        <w:t xml:space="preserve"> again. A person's chat ID is the same for every bot, so it doesn't change if you switch to a new bot (they press Start on the new one).</w:t>
       </w:r>
     </w:p>
     <w:p>

</xml_diff>

<commit_message>
Docs: Member Guide walks members through getting My Coffee Report working (email, Telegram link and Start, troubleshooting); Administrator's Guide bot setup, opening the bot, chat list errors; BPA bot @BPAPilotsCoffeeBot recorded
Co-Authored-By: Claude Opus 5.5 <noreply@anthropic.com>
</commit_message>
<xml_diff>
--- a/docs/admin-guide/Honcho_Administrators_Guide.docx
+++ b/docs/admin-guide/Honcho_Administrators_Guide.docx
@@ -13681,7 +13681,30 @@
         <w:rPr>
           <w:rFonts w:ascii="Calibri" w:cs="Calibri" w:eastAsia="Calibri" w:hAnsi="Calibri"/>
         </w:rPr>
-        <w:t xml:space="preserve">The report can also go to Telegram: to several people, each getting their own copy, and/or to a group with the admins in it. Email and Telegram are sent separately, so if one fails the other still arrives.</w:t>
+        <w:t xml:space="preserve">The report can also go to Telegram: to several people, each getting their own copy, and/or to a group with the admins in it. Email and Telegram are sent separately, so if one fails the other still arrives. BPA's bot is </w:t>
+      </w:r>
+      <w:r>
+        <w:rPr>
+          <w:rFonts w:ascii="Calibri" w:cs="Calibri" w:eastAsia="Calibri" w:hAnsi="Calibri"/>
+          <w:b/>
+          <w:bCs/>
+        </w:rPr>
+        <w:t xml:space="preserve">@BPAPilotsCoffeeBot</w:t>
+      </w:r>
+      <w:r>
+        <w:rPr>
+          <w:rFonts w:ascii="Calibri" w:cs="Calibri" w:eastAsia="Calibri" w:hAnsi="Calibri"/>
+        </w:rPr>
+        <w:t xml:space="preserve">; National's report holds its token, and members' own reports use the same bot.</w:t>
+      </w:r>
+    </w:p>
+    <w:p>
+      <w:pPr>
+        <w:pStyle w:val="Heading3"/>
+        <w:spacing w:before="320" w:after="160"/>
+      </w:pPr>
+      <w:r>
+        <w:t xml:space="preserve">Making a Bot (once, by a System Admin)</w:t>
       </w:r>
     </w:p>
     <w:p>
@@ -13711,7 +13734,7 @@
         <w:rPr>
           <w:rFonts w:ascii="Calibri" w:cs="Calibri" w:eastAsia="Calibri" w:hAnsi="Calibri"/>
         </w:rPr>
-        <w:t xml:space="preserve">, send </w:t>
+        <w:t xml:space="preserve"> and send </w:t>
       </w:r>
       <w:r>
         <w:rPr>
@@ -13725,21 +13748,7 @@
         <w:rPr>
           <w:rFonts w:ascii="Calibri" w:cs="Calibri" w:eastAsia="Calibri" w:hAnsi="Calibri"/>
         </w:rPr>
-        <w:t xml:space="preserve">, choose a name and a username ending in "bot". BotFather replies with a </w:t>
-      </w:r>
-      <w:r>
-        <w:rPr>
-          <w:rFonts w:ascii="Calibri" w:cs="Calibri" w:eastAsia="Calibri" w:hAnsi="Calibri"/>
-          <w:b/>
-          <w:bCs/>
-        </w:rPr>
-        <w:t xml:space="preserve">token</w:t>
-      </w:r>
-      <w:r>
-        <w:rPr>
-          <w:rFonts w:ascii="Calibri" w:cs="Calibri" w:eastAsia="Calibri" w:hAnsi="Calibri"/>
-        </w:rPr>
-        <w:t xml:space="preserve"> like 123456789:ABC....</w:t>
+        <w:t xml:space="preserve">.</w:t>
       </w:r>
     </w:p>
     <w:p>
@@ -13755,21 +13764,35 @@
         <w:rPr>
           <w:rFonts w:ascii="Calibri" w:cs="Calibri" w:eastAsia="Calibri" w:hAnsi="Calibri"/>
         </w:rPr>
-        <w:t xml:space="preserve">Each person who should get it opens the bot in Telegram (search for its username) and presses </w:t>
-      </w:r>
-      <w:r>
-        <w:rPr>
-          <w:rFonts w:ascii="Calibri" w:cs="Calibri" w:eastAsia="Calibri" w:hAnsi="Calibri"/>
-          <w:b/>
-          <w:bCs/>
-        </w:rPr>
-        <w:t xml:space="preserve">Start</w:t>
-      </w:r>
-      <w:r>
-        <w:rPr>
-          <w:rFonts w:ascii="Calibri" w:cs="Calibri" w:eastAsia="Calibri" w:hAnsi="Calibri"/>
-        </w:rPr>
-        <w:t xml:space="preserve">; bots can't message anyone first. For a group: add the bot to the group and post any message there.</w:t>
+        <w:t xml:space="preserve">Give it a </w:t>
+      </w:r>
+      <w:r>
+        <w:rPr>
+          <w:rFonts w:ascii="Calibri" w:cs="Calibri" w:eastAsia="Calibri" w:hAnsi="Calibri"/>
+          <w:b/>
+          <w:bCs/>
+        </w:rPr>
+        <w:t xml:space="preserve">name</w:t>
+      </w:r>
+      <w:r>
+        <w:rPr>
+          <w:rFonts w:ascii="Calibri" w:cs="Calibri" w:eastAsia="Calibri" w:hAnsi="Calibri"/>
+        </w:rPr>
+        <w:t xml:space="preserve"> (what people see, for example "BPA Coffee Report") and a </w:t>
+      </w:r>
+      <w:r>
+        <w:rPr>
+          <w:rFonts w:ascii="Calibri" w:cs="Calibri" w:eastAsia="Calibri" w:hAnsi="Calibri"/>
+          <w:b/>
+          <w:bCs/>
+        </w:rPr>
+        <w:t xml:space="preserve">username</w:t>
+      </w:r>
+      <w:r>
+        <w:rPr>
+          <w:rFonts w:ascii="Calibri" w:cs="Calibri" w:eastAsia="Calibri" w:hAnsi="Calibri"/>
+        </w:rPr>
+        <w:t xml:space="preserve"> ending in "bot" (permanent, for example BPAPilotsCoffeeBot).</w:t>
       </w:r>
     </w:p>
     <w:p>
@@ -13785,49 +13808,21 @@
         <w:rPr>
           <w:rFonts w:ascii="Calibri" w:cs="Calibri" w:eastAsia="Calibri" w:hAnsi="Calibri"/>
         </w:rPr>
-        <w:t xml:space="preserve">In the report's settings, tick </w:t>
-      </w:r>
-      <w:r>
-        <w:rPr>
-          <w:rFonts w:ascii="Calibri" w:cs="Calibri" w:eastAsia="Calibri" w:hAnsi="Calibri"/>
-          <w:b/>
-          <w:bCs/>
-        </w:rPr>
-        <w:t xml:space="preserve">Send to Telegram too</w:t>
-      </w:r>
-      <w:r>
-        <w:rPr>
-          <w:rFonts w:ascii="Calibri" w:cs="Calibri" w:eastAsia="Calibri" w:hAnsi="Calibri"/>
-        </w:rPr>
-        <w:t xml:space="preserve">, paste the </w:t>
-      </w:r>
-      <w:r>
-        <w:rPr>
-          <w:rFonts w:ascii="Calibri" w:cs="Calibri" w:eastAsia="Calibri" w:hAnsi="Calibri"/>
-          <w:b/>
-          <w:bCs/>
-        </w:rPr>
-        <w:t xml:space="preserve">bot token</w:t>
-      </w:r>
-      <w:r>
-        <w:rPr>
-          <w:rFonts w:ascii="Calibri" w:cs="Calibri" w:eastAsia="Calibri" w:hAnsi="Calibri"/>
-        </w:rPr>
-        <w:t xml:space="preserve">, and click </w:t>
-      </w:r>
-      <w:r>
-        <w:rPr>
-          <w:rFonts w:ascii="Calibri" w:cs="Calibri" w:eastAsia="Calibri" w:hAnsi="Calibri"/>
-          <w:b/>
-          <w:bCs/>
-        </w:rPr>
-        <w:t xml:space="preserve">Save</w:t>
-      </w:r>
-      <w:r>
-        <w:rPr>
-          <w:rFonts w:ascii="Calibri" w:cs="Calibri" w:eastAsia="Calibri" w:hAnsi="Calibri"/>
-        </w:rPr>
-        <w:t xml:space="preserve">.</w:t>
+        <w:t xml:space="preserve">BotFather replies with the bot's </w:t>
+      </w:r>
+      <w:r>
+        <w:rPr>
+          <w:rFonts w:ascii="Calibri" w:cs="Calibri" w:eastAsia="Calibri" w:hAnsi="Calibri"/>
+          <w:b/>
+          <w:bCs/>
+        </w:rPr>
+        <w:t xml:space="preserve">token</w:t>
+      </w:r>
+      <w:r>
+        <w:rPr>
+          <w:rFonts w:ascii="Calibri" w:cs="Calibri" w:eastAsia="Calibri" w:hAnsi="Calibri"/>
+        </w:rPr>
+        <w:t xml:space="preserve"> (123456789:ABC...) and its link (t.me/&lt;username&gt;). Keep the token private.</w:t>
       </w:r>
     </w:p>
     <w:p>
@@ -13843,49 +13838,35 @@
         <w:rPr>
           <w:rFonts w:ascii="Calibri" w:cs="Calibri" w:eastAsia="Calibri" w:hAnsi="Calibri"/>
         </w:rPr>
-        <w:t xml:space="preserve">Click </w:t>
-      </w:r>
-      <w:r>
-        <w:rPr>
-          <w:rFonts w:ascii="Calibri" w:cs="Calibri" w:eastAsia="Calibri" w:hAnsi="Calibri"/>
-          <w:b/>
-          <w:bCs/>
-        </w:rPr>
-        <w:t xml:space="preserve">Find chat ID</w:t>
-      </w:r>
-      <w:r>
-        <w:rPr>
-          <w:rFonts w:ascii="Calibri" w:cs="Calibri" w:eastAsia="Calibri" w:hAnsi="Calibri"/>
-        </w:rPr>
-        <w:t xml:space="preserve">. Honcho lists the chats that have messaged the bot; copy each number (groups start with -) into </w:t>
-      </w:r>
-      <w:r>
-        <w:rPr>
-          <w:rFonts w:ascii="Calibri" w:cs="Calibri" w:eastAsia="Calibri" w:hAnsi="Calibri"/>
-          <w:b/>
-          <w:bCs/>
-        </w:rPr>
-        <w:t xml:space="preserve">Chat IDs</w:t>
-      </w:r>
-      <w:r>
-        <w:rPr>
-          <w:rFonts w:ascii="Calibri" w:cs="Calibri" w:eastAsia="Calibri" w:hAnsi="Calibri"/>
-        </w:rPr>
-        <w:t xml:space="preserve">, one per line, and </w:t>
-      </w:r>
-      <w:r>
-        <w:rPr>
-          <w:rFonts w:ascii="Calibri" w:cs="Calibri" w:eastAsia="Calibri" w:hAnsi="Calibri"/>
-          <w:b/>
-          <w:bCs/>
-        </w:rPr>
-        <w:t xml:space="preserve">Save</w:t>
-      </w:r>
-      <w:r>
-        <w:rPr>
-          <w:rFonts w:ascii="Calibri" w:cs="Calibri" w:eastAsia="Calibri" w:hAnsi="Calibri"/>
-        </w:rPr>
-        <w:t xml:space="preserve"> again. A person's chat ID is the same for every bot, so it doesn't change if you switch to a new bot (they press Start on the new one).</w:t>
+        <w:t xml:space="preserve">Optional, in @BotFather: </w:t>
+      </w:r>
+      <w:r>
+        <w:rPr>
+          <w:rFonts w:ascii="Calibri" w:cs="Calibri" w:eastAsia="Calibri" w:hAnsi="Calibri"/>
+          <w:b/>
+          <w:bCs/>
+        </w:rPr>
+        <w:t xml:space="preserve">/setuserpic</w:t>
+      </w:r>
+      <w:r>
+        <w:rPr>
+          <w:rFonts w:ascii="Calibri" w:cs="Calibri" w:eastAsia="Calibri" w:hAnsi="Calibri"/>
+        </w:rPr>
+        <w:t xml:space="preserve"> for the logo, </w:t>
+      </w:r>
+      <w:r>
+        <w:rPr>
+          <w:rFonts w:ascii="Calibri" w:cs="Calibri" w:eastAsia="Calibri" w:hAnsi="Calibri"/>
+          <w:b/>
+          <w:bCs/>
+        </w:rPr>
+        <w:t xml:space="preserve">/setdescription</w:t>
+      </w:r>
+      <w:r>
+        <w:rPr>
+          <w:rFonts w:ascii="Calibri" w:cs="Calibri" w:eastAsia="Calibri" w:hAnsi="Calibri"/>
+        </w:rPr>
+        <w:t xml:space="preserve"> for the text people see before pressing Start.</w:t>
       </w:r>
     </w:p>
     <w:p>
@@ -13901,6 +13882,256 @@
         <w:rPr>
           <w:rFonts w:ascii="Calibri" w:cs="Calibri" w:eastAsia="Calibri" w:hAnsi="Calibri"/>
         </w:rPr>
+        <w:t xml:space="preserve">Turn on </w:t>
+      </w:r>
+      <w:r>
+        <w:rPr>
+          <w:rFonts w:ascii="Calibri" w:cs="Calibri" w:eastAsia="Calibri" w:hAnsi="Calibri"/>
+          <w:b/>
+          <w:bCs/>
+        </w:rPr>
+        <w:t xml:space="preserve">Two-Step Verification</w:t>
+      </w:r>
+      <w:r>
+        <w:rPr>
+          <w:rFonts w:ascii="Calibri" w:cs="Calibri" w:eastAsia="Calibri" w:hAnsi="Calibri"/>
+        </w:rPr>
+        <w:t xml:space="preserve"> in your Telegram settings (Privacy and Security): whoever controls the account that made the bot controls the bot.</w:t>
+      </w:r>
+    </w:p>
+    <w:p>
+      <w:pPr>
+        <w:spacing w:after="120"/>
+      </w:pPr>
+    </w:p>
+    <w:p>
+      <w:pPr>
+        <w:pStyle w:val="Heading3"/>
+        <w:spacing w:before="320" w:after="160"/>
+      </w:pPr>
+      <w:r>
+        <w:t xml:space="preserve">Opening the Bot and Pressing Start</w:t>
+      </w:r>
+    </w:p>
+    <w:p>
+      <w:pPr>
+        <w:spacing w:after="160"/>
+      </w:pPr>
+      <w:r>
+        <w:rPr>
+          <w:rFonts w:ascii="Calibri" w:cs="Calibri" w:eastAsia="Calibri" w:hAnsi="Calibri"/>
+        </w:rPr>
+        <w:t xml:space="preserve">A bot can't message anyone first. Everyone who should receive the report opens the bot once and taps </w:t>
+      </w:r>
+      <w:r>
+        <w:rPr>
+          <w:rFonts w:ascii="Calibri" w:cs="Calibri" w:eastAsia="Calibri" w:hAnsi="Calibri"/>
+          <w:b/>
+          <w:bCs/>
+        </w:rPr>
+        <w:t xml:space="preserve">Start</w:t>
+      </w:r>
+      <w:r>
+        <w:rPr>
+          <w:rFonts w:ascii="Calibri" w:cs="Calibri" w:eastAsia="Calibri" w:hAnsi="Calibri"/>
+        </w:rPr>
+        <w:t xml:space="preserve">. A new bot doesn't appear in anyone's chat list until they open it:</w:t>
+      </w:r>
+    </w:p>
+    <w:p>
+      <w:pPr>
+        <w:pStyle w:val="ListParagraph"/>
+        <w:numPr>
+          <w:ilvl w:val="0"/>
+          <w:numId w:val="2"/>
+        </w:numPr>
+        <w:spacing w:after="100"/>
+      </w:pPr>
+      <w:r>
+        <w:rPr>
+          <w:rFonts w:ascii="Calibri" w:cs="Calibri" w:eastAsia="Calibri" w:hAnsi="Calibri"/>
+          <w:b/>
+          <w:bCs/>
+        </w:rPr>
+        <w:t xml:space="preserve">Easiest:</w:t>
+      </w:r>
+      <w:r>
+        <w:rPr>
+          <w:rFonts w:ascii="Calibri" w:cs="Calibri" w:eastAsia="Calibri" w:hAnsi="Calibri"/>
+        </w:rPr>
+        <w:t xml:space="preserve"> tap the link </w:t>
+      </w:r>
+      <w:r>
+        <w:rPr>
+          <w:rFonts w:ascii="Calibri" w:cs="Calibri" w:eastAsia="Calibri" w:hAnsi="Calibri"/>
+          <w:b/>
+          <w:bCs/>
+        </w:rPr>
+        <w:t xml:space="preserve">t.me/&lt;bot username&gt;</w:t>
+      </w:r>
+      <w:r>
+        <w:rPr>
+          <w:rFonts w:ascii="Calibri" w:cs="Calibri" w:eastAsia="Calibri" w:hAnsi="Calibri"/>
+        </w:rPr>
+        <w:t xml:space="preserve"> (for BPA, t.me/BPAPilotsCoffeeBot), from BotFather's message or sent to them by email or text. It opens the chat with the bot.</w:t>
+      </w:r>
+    </w:p>
+    <w:p>
+      <w:pPr>
+        <w:pStyle w:val="ListParagraph"/>
+        <w:numPr>
+          <w:ilvl w:val="0"/>
+          <w:numId w:val="2"/>
+        </w:numPr>
+        <w:spacing w:after="100"/>
+      </w:pPr>
+      <w:r>
+        <w:rPr>
+          <w:rFonts w:ascii="Calibri" w:cs="Calibri" w:eastAsia="Calibri" w:hAnsi="Calibri"/>
+        </w:rPr>
+        <w:t xml:space="preserve">Or open </w:t>
+      </w:r>
+      <w:r>
+        <w:rPr>
+          <w:rFonts w:ascii="Calibri" w:cs="Calibri" w:eastAsia="Calibri" w:hAnsi="Calibri"/>
+          <w:b/>
+          <w:bCs/>
+        </w:rPr>
+        <w:t xml:space="preserve">https://t.me/&lt;bot username&gt;</w:t>
+      </w:r>
+      <w:r>
+        <w:rPr>
+          <w:rFonts w:ascii="Calibri" w:cs="Calibri" w:eastAsia="Calibri" w:hAnsi="Calibri"/>
+        </w:rPr>
+        <w:t xml:space="preserve"> in a browser, which offers to open Telegram.</w:t>
+      </w:r>
+    </w:p>
+    <w:p>
+      <w:pPr>
+        <w:pStyle w:val="ListParagraph"/>
+        <w:numPr>
+          <w:ilvl w:val="0"/>
+          <w:numId w:val="2"/>
+        </w:numPr>
+        <w:spacing w:after="100"/>
+      </w:pPr>
+      <w:r>
+        <w:rPr>
+          <w:rFonts w:ascii="Calibri" w:cs="Calibri" w:eastAsia="Calibri" w:hAnsi="Calibri"/>
+        </w:rPr>
+        <w:t xml:space="preserve">Or search for </w:t>
+      </w:r>
+      <w:r>
+        <w:rPr>
+          <w:rFonts w:ascii="Calibri" w:cs="Calibri" w:eastAsia="Calibri" w:hAnsi="Calibri"/>
+          <w:b/>
+          <w:bCs/>
+        </w:rPr>
+        <w:t xml:space="preserve">@&lt;bot username&gt;</w:t>
+      </w:r>
+      <w:r>
+        <w:rPr>
+          <w:rFonts w:ascii="Calibri" w:cs="Calibri" w:eastAsia="Calibri" w:hAnsi="Calibri"/>
+        </w:rPr>
+        <w:t xml:space="preserve"> in Telegram's search bar; a brand-new bot can take a while to appear in search.</w:t>
+      </w:r>
+    </w:p>
+    <w:p>
+      <w:pPr>
+        <w:spacing w:after="120"/>
+      </w:pPr>
+    </w:p>
+    <w:p>
+      <w:pPr>
+        <w:spacing w:after="160"/>
+      </w:pPr>
+      <w:r>
+        <w:rPr>
+          <w:rFonts w:ascii="Calibri" w:cs="Calibri" w:eastAsia="Calibri" w:hAnsi="Calibri"/>
+        </w:rPr>
+        <w:t xml:space="preserve">The chat opens with a </w:t>
+      </w:r>
+      <w:r>
+        <w:rPr>
+          <w:rFonts w:ascii="Calibri" w:cs="Calibri" w:eastAsia="Calibri" w:hAnsi="Calibri"/>
+          <w:b/>
+          <w:bCs/>
+        </w:rPr>
+        <w:t xml:space="preserve">Start</w:t>
+      </w:r>
+      <w:r>
+        <w:rPr>
+          <w:rFonts w:ascii="Calibri" w:cs="Calibri" w:eastAsia="Calibri" w:hAnsi="Calibri"/>
+        </w:rPr>
+        <w:t xml:space="preserve"> button at the bottom: tap it. The bot then stays in their chat list.</w:t>
+      </w:r>
+    </w:p>
+    <w:p>
+      <w:pPr>
+        <w:pStyle w:val="Heading3"/>
+        <w:spacing w:before="320" w:after="160"/>
+      </w:pPr>
+      <w:r>
+        <w:t xml:space="preserve">Setting Up the Report</w:t>
+      </w:r>
+    </w:p>
+    <w:p>
+      <w:pPr>
+        <w:pStyle w:val="ListParagraph"/>
+        <w:numPr>
+          <w:ilvl w:val="0"/>
+          <w:numId w:val="3"/>
+        </w:numPr>
+        <w:spacing w:after="100"/>
+      </w:pPr>
+      <w:r>
+        <w:rPr>
+          <w:rFonts w:ascii="Calibri" w:cs="Calibri" w:eastAsia="Calibri" w:hAnsi="Calibri"/>
+        </w:rPr>
+        <w:t xml:space="preserve">In the report's settings, paste the </w:t>
+      </w:r>
+      <w:r>
+        <w:rPr>
+          <w:rFonts w:ascii="Calibri" w:cs="Calibri" w:eastAsia="Calibri" w:hAnsi="Calibri"/>
+          <w:b/>
+          <w:bCs/>
+        </w:rPr>
+        <w:t xml:space="preserve">bot token</w:t>
+      </w:r>
+      <w:r>
+        <w:rPr>
+          <w:rFonts w:ascii="Calibri" w:cs="Calibri" w:eastAsia="Calibri" w:hAnsi="Calibri"/>
+        </w:rPr>
+        <w:t xml:space="preserve"> (only once; it's kept encrypted) and click </w:t>
+      </w:r>
+      <w:r>
+        <w:rPr>
+          <w:rFonts w:ascii="Calibri" w:cs="Calibri" w:eastAsia="Calibri" w:hAnsi="Calibri"/>
+          <w:b/>
+          <w:bCs/>
+        </w:rPr>
+        <w:t xml:space="preserve">Save</w:t>
+      </w:r>
+      <w:r>
+        <w:rPr>
+          <w:rFonts w:ascii="Calibri" w:cs="Calibri" w:eastAsia="Calibri" w:hAnsi="Calibri"/>
+        </w:rPr>
+        <w:t xml:space="preserve">.</w:t>
+      </w:r>
+    </w:p>
+    <w:p>
+      <w:pPr>
+        <w:pStyle w:val="ListParagraph"/>
+        <w:numPr>
+          <w:ilvl w:val="0"/>
+          <w:numId w:val="3"/>
+        </w:numPr>
+        <w:spacing w:after="100"/>
+      </w:pPr>
+      <w:r>
+        <w:rPr>
+          <w:rFonts w:ascii="Calibri" w:cs="Calibri" w:eastAsia="Calibri" w:hAnsi="Calibri"/>
+        </w:rPr>
         <w:t xml:space="preserve">Click </w:t>
       </w:r>
       <w:r>
@@ -13909,13 +14140,101 @@
           <w:b/>
           <w:bCs/>
         </w:rPr>
+        <w:t xml:space="preserve">Find chat ID</w:t>
+      </w:r>
+      <w:r>
+        <w:rPr>
+          <w:rFonts w:ascii="Calibri" w:cs="Calibri" w:eastAsia="Calibri" w:hAnsi="Calibri"/>
+        </w:rPr>
+        <w:t xml:space="preserve">. Honcho lists the chats that have messaged the bot. Copy each number into </w:t>
+      </w:r>
+      <w:r>
+        <w:rPr>
+          <w:rFonts w:ascii="Calibri" w:cs="Calibri" w:eastAsia="Calibri" w:hAnsi="Calibri"/>
+          <w:b/>
+          <w:bCs/>
+        </w:rPr>
+        <w:t xml:space="preserve">Chat IDs</w:t>
+      </w:r>
+      <w:r>
+        <w:rPr>
+          <w:rFonts w:ascii="Calibri" w:cs="Calibri" w:eastAsia="Calibri" w:hAnsi="Calibri"/>
+        </w:rPr>
+        <w:t xml:space="preserve">, one per line (a group's number starts with -).</w:t>
+      </w:r>
+    </w:p>
+    <w:p>
+      <w:pPr>
+        <w:pStyle w:val="ListParagraph"/>
+        <w:numPr>
+          <w:ilvl w:val="0"/>
+          <w:numId w:val="3"/>
+        </w:numPr>
+        <w:spacing w:after="100"/>
+      </w:pPr>
+      <w:r>
+        <w:rPr>
+          <w:rFonts w:ascii="Calibri" w:cs="Calibri" w:eastAsia="Calibri" w:hAnsi="Calibri"/>
+        </w:rPr>
+        <w:t xml:space="preserve">Tick </w:t>
+      </w:r>
+      <w:r>
+        <w:rPr>
+          <w:rFonts w:ascii="Calibri" w:cs="Calibri" w:eastAsia="Calibri" w:hAnsi="Calibri"/>
+          <w:b/>
+          <w:bCs/>
+        </w:rPr>
+        <w:t xml:space="preserve">Send to Telegram too</w:t>
+      </w:r>
+      <w:r>
+        <w:rPr>
+          <w:rFonts w:ascii="Calibri" w:cs="Calibri" w:eastAsia="Calibri" w:hAnsi="Calibri"/>
+        </w:rPr>
+        <w:t xml:space="preserve"> and click </w:t>
+      </w:r>
+      <w:r>
+        <w:rPr>
+          <w:rFonts w:ascii="Calibri" w:cs="Calibri" w:eastAsia="Calibri" w:hAnsi="Calibri"/>
+          <w:b/>
+          <w:bCs/>
+        </w:rPr>
+        <w:t xml:space="preserve">Save</w:t>
+      </w:r>
+      <w:r>
+        <w:rPr>
+          <w:rFonts w:ascii="Calibri" w:cs="Calibri" w:eastAsia="Calibri" w:hAnsi="Calibri"/>
+        </w:rPr>
+        <w:t xml:space="preserve">.</w:t>
+      </w:r>
+    </w:p>
+    <w:p>
+      <w:pPr>
+        <w:pStyle w:val="ListParagraph"/>
+        <w:numPr>
+          <w:ilvl w:val="0"/>
+          <w:numId w:val="3"/>
+        </w:numPr>
+        <w:spacing w:after="100"/>
+      </w:pPr>
+      <w:r>
+        <w:rPr>
+          <w:rFonts w:ascii="Calibri" w:cs="Calibri" w:eastAsia="Calibri" w:hAnsi="Calibri"/>
+        </w:rPr>
+        <w:t xml:space="preserve">Click </w:t>
+      </w:r>
+      <w:r>
+        <w:rPr>
+          <w:rFonts w:ascii="Calibri" w:cs="Calibri" w:eastAsia="Calibri" w:hAnsi="Calibri"/>
+          <w:b/>
+          <w:bCs/>
+        </w:rPr>
         <w:t xml:space="preserve">Telegram test</w:t>
       </w:r>
       <w:r>
         <w:rPr>
           <w:rFonts w:ascii="Calibri" w:cs="Calibri" w:eastAsia="Calibri" w:hAnsi="Calibri"/>
         </w:rPr>
-        <w:t xml:space="preserve">. The report should arrive in the chat.</w:t>
+        <w:t xml:space="preserve">. The report should arrive in every chat on the list.</w:t>
       </w:r>
     </w:p>
     <w:p>
@@ -13925,13 +14244,66 @@
     </w:p>
     <w:p>
       <w:pPr>
-        <w:spacing w:after="160"/>
-      </w:pPr>
-      <w:r>
-        <w:rPr>
-          <w:rFonts w:ascii="Calibri" w:cs="Calibri" w:eastAsia="Calibri" w:hAnsi="Calibri"/>
-        </w:rPr>
-        <w:t xml:space="preserve">Long reports arrive as two or three messages. The token is stored encrypted; tick </w:t>
+        <w:pStyle w:val="ListParagraph"/>
+        <w:numPr>
+          <w:ilvl w:val="0"/>
+          <w:numId w:val="2"/>
+        </w:numPr>
+        <w:spacing w:after="100"/>
+      </w:pPr>
+      <w:r>
+        <w:rPr>
+          <w:rFonts w:ascii="Calibri" w:cs="Calibri" w:eastAsia="Calibri" w:hAnsi="Calibri"/>
+          <w:b/>
+          <w:bCs/>
+        </w:rPr>
+        <w:t xml:space="preserve">A person's chat ID is the same for every bot.</w:t>
+      </w:r>
+      <w:r>
+        <w:rPr>
+          <w:rFonts w:ascii="Calibri" w:cs="Calibri" w:eastAsia="Calibri" w:hAnsi="Calibri"/>
+        </w:rPr>
+        <w:t xml:space="preserve"> If you switch to a new bot, keep the chat IDs; each person only presses Start on the new bot.</w:t>
+      </w:r>
+    </w:p>
+    <w:p>
+      <w:pPr>
+        <w:pStyle w:val="ListParagraph"/>
+        <w:numPr>
+          <w:ilvl w:val="0"/>
+          <w:numId w:val="2"/>
+        </w:numPr>
+        <w:spacing w:after="100"/>
+      </w:pPr>
+      <w:r>
+        <w:rPr>
+          <w:rFonts w:ascii="Calibri" w:cs="Calibri" w:eastAsia="Calibri" w:hAnsi="Calibri"/>
+          <w:b/>
+          <w:bCs/>
+        </w:rPr>
+        <w:t xml:space="preserve">A group:</w:t>
+      </w:r>
+      <w:r>
+        <w:rPr>
+          <w:rFonts w:ascii="Calibri" w:cs="Calibri" w:eastAsia="Calibri" w:hAnsi="Calibri"/>
+        </w:rPr>
+        <w:t xml:space="preserve"> add the bot to the group, post any message there, then Find chat ID shows the group's number.</w:t>
+      </w:r>
+    </w:p>
+    <w:p>
+      <w:pPr>
+        <w:pStyle w:val="ListParagraph"/>
+        <w:numPr>
+          <w:ilvl w:val="0"/>
+          <w:numId w:val="2"/>
+        </w:numPr>
+        <w:spacing w:after="100"/>
+      </w:pPr>
+      <w:r>
+        <w:rPr>
+          <w:rFonts w:ascii="Calibri" w:cs="Calibri" w:eastAsia="Calibri" w:hAnsi="Calibri"/>
+        </w:rPr>
+        <w:t xml:space="preserve">Long reports arrive as two or three messages. Tick </w:t>
       </w:r>
       <w:r>
         <w:rPr>
@@ -13945,8 +14317,29 @@
         <w:rPr>
           <w:rFonts w:ascii="Calibri" w:cs="Calibri" w:eastAsia="Calibri" w:hAnsi="Calibri"/>
         </w:rPr>
-        <w:t xml:space="preserve"> and save to delete it. iMessage isn't available: it only works from an Apple computer, not a web server.</w:t>
-      </w:r>
+        <w:t xml:space="preserve"> and save to delete the token.</w:t>
+      </w:r>
+    </w:p>
+    <w:p>
+      <w:pPr>
+        <w:pStyle w:val="ListParagraph"/>
+        <w:numPr>
+          <w:ilvl w:val="0"/>
+          <w:numId w:val="2"/>
+        </w:numPr>
+        <w:spacing w:after="100"/>
+      </w:pPr>
+      <w:r>
+        <w:rPr>
+          <w:rFonts w:ascii="Calibri" w:cs="Calibri" w:eastAsia="Calibri" w:hAnsi="Calibri"/>
+        </w:rPr>
+        <w:t xml:space="preserve">iMessage isn't available: it only works from an Apple computer, not a web server.</w:t>
+      </w:r>
+    </w:p>
+    <w:p>
+      <w:pPr>
+        <w:spacing w:after="120"/>
+      </w:pPr>
     </w:p>
     <w:p>
       <w:pPr>
@@ -14899,7 +15292,7 @@
         <w:rPr>
           <w:rFonts w:ascii="Calibri" w:cs="Calibri" w:eastAsia="Calibri" w:hAnsi="Calibri"/>
         </w:rPr>
-        <w:t xml:space="preserve"> members link their own Telegram to the organization's bot, which is the bot saved on </w:t>
+        <w:t xml:space="preserve"> members link their own Telegram to the organization's bot, the bot saved on </w:t>
       </w:r>
       <w:r>
         <w:rPr>
@@ -14913,7 +15306,7 @@
         <w:rPr>
           <w:rFonts w:ascii="Calibri" w:cs="Calibri" w:eastAsia="Calibri" w:hAnsi="Calibri"/>
         </w:rPr>
-        <w:t xml:space="preserve"> Coffee Report (Step 4). Set that up first, and consider giving the bot the organization's name.</w:t>
+        <w:t xml:space="preserve"> Coffee Report (Step 4; BPA's is @BPAPilotsCoffeeBot), from a link on their My Coffee Report page. The Member Guide walks them through it.</w:t>
       </w:r>
     </w:p>
     <w:p>
@@ -15384,7 +15777,7 @@
                 <w:sz w:val="19"/>
                 <w:szCs w:val="19"/>
               </w:rPr>
-              <w:t xml:space="preserve">"Telegram: not sent (Unauthorized)"</w:t>
+              <w:t xml:space="preserve">"Telegram: ... (Unauthorized)"</w:t>
             </w:r>
           </w:p>
         </w:tc>
@@ -15409,7 +15802,7 @@
                 <w:sz w:val="19"/>
                 <w:szCs w:val="19"/>
               </w:rPr>
-              <w:t xml:space="preserve">The bot token is wrong: copy it again from @BotFather</w:t>
+              <w:t xml:space="preserve">The bot token is wrong or was replaced: copy it again from @BotFather and paste it in Bot token</w:t>
             </w:r>
           </w:p>
         </w:tc>
@@ -15436,7 +15829,7 @@
                 <w:sz w:val="19"/>
                 <w:szCs w:val="19"/>
               </w:rPr>
-              <w:t xml:space="preserve">"Telegram: not sent (chat not found)"</w:t>
+              <w:t xml:space="preserve">"Telegram: sent to 1 of 2 chats. Not sent: 123456789 (... chat not found)"</w:t>
             </w:r>
           </w:p>
         </w:tc>
@@ -15461,7 +15854,25 @@
                 <w:sz w:val="19"/>
                 <w:szCs w:val="19"/>
               </w:rPr>
-              <w:t xml:space="preserve">Wrong chat ID, or nobody has messaged the bot: post in the chat and use Find chat ID</w:t>
+              <w:t xml:space="preserve">That person hasn't pressed </w:t>
+            </w:r>
+            <w:r>
+              <w:rPr>
+                <w:rFonts w:ascii="Calibri" w:cs="Calibri" w:eastAsia="Calibri" w:hAnsi="Calibri"/>
+                <w:b/>
+                <w:bCs/>
+                <w:sz w:val="19"/>
+                <w:szCs w:val="19"/>
+              </w:rPr>
+              <w:t xml:space="preserve">Start</w:t>
+            </w:r>
+            <w:r>
+              <w:rPr>
+                <w:rFonts w:ascii="Calibri" w:cs="Calibri" w:eastAsia="Calibri" w:hAnsi="Calibri"/>
+                <w:sz w:val="19"/>
+                <w:szCs w:val="19"/>
+              </w:rPr>
+              <w:t xml:space="preserve"> on the bot (or the number is wrong). Send them the bot's t.me link; once they tap Start, Telegram test again</w:t>
             </w:r>
           </w:p>
         </w:tc>
@@ -15488,7 +15899,7 @@
                 <w:sz w:val="19"/>
                 <w:szCs w:val="19"/>
               </w:rPr>
-              <w:t xml:space="preserve">"... unavailable" in one section</w:t>
+              <w:t xml:space="preserve">"Telegram: ... (Forbidden: bot was blocked by the user)"</w:t>
             </w:r>
           </w:p>
         </w:tc>
@@ -15513,7 +15924,7 @@
                 <w:sz w:val="19"/>
                 <w:szCs w:val="19"/>
               </w:rPr>
-              <w:t xml:space="preserve">That source didn't answer today; the rest of the report was still sent. If it keeps happening, check the section's options</w:t>
+              <w:t xml:space="preserve">That person blocked the bot: they open the bot, unblock it and press Start</w:t>
             </w:r>
           </w:p>
         </w:tc>
@@ -15540,6 +15951,58 @@
                 <w:sz w:val="19"/>
                 <w:szCs w:val="19"/>
               </w:rPr>
+              <w:t xml:space="preserve">"... unavailable" in one section</w:t>
+            </w:r>
+          </w:p>
+        </w:tc>
+        <w:tc>
+          <w:tcPr>
+            <w:tcW w:type="dxa" w:w="4680"/>
+            <w:shd w:fill="F7F9FA" w:val="clear"/>
+            <w:tcMar>
+              <w:top w:type="dxa" w:w="100"/>
+              <w:left w:type="dxa" w:w="120"/>
+              <w:bottom w:type="dxa" w:w="100"/>
+              <w:right w:type="dxa" w:w="120"/>
+            </w:tcMar>
+          </w:tcPr>
+          <w:p>
+            <w:pPr>
+              <w:spacing w:after="0"/>
+            </w:pPr>
+            <w:r>
+              <w:rPr>
+                <w:rFonts w:ascii="Calibri" w:cs="Calibri" w:eastAsia="Calibri" w:hAnsi="Calibri"/>
+                <w:sz w:val="19"/>
+                <w:szCs w:val="19"/>
+              </w:rPr>
+              <w:t xml:space="preserve">That source didn't answer today; the rest of the report was still sent. If it keeps happening, check the section's options</w:t>
+            </w:r>
+          </w:p>
+        </w:tc>
+      </w:tr>
+      <w:tr>
+        <w:tc>
+          <w:tcPr>
+            <w:tcW w:type="dxa" w:w="4680"/>
+            <w:shd w:fill="FFFFFF" w:val="clear"/>
+            <w:tcMar>
+              <w:top w:type="dxa" w:w="100"/>
+              <w:left w:type="dxa" w:w="120"/>
+              <w:bottom w:type="dxa" w:w="100"/>
+              <w:right w:type="dxa" w:w="120"/>
+            </w:tcMar>
+          </w:tcPr>
+          <w:p>
+            <w:pPr>
+              <w:spacing w:after="0"/>
+            </w:pPr>
+            <w:r>
+              <w:rPr>
+                <w:rFonts w:ascii="Calibri" w:cs="Calibri" w:eastAsia="Calibri" w:hAnsi="Calibri"/>
+                <w:sz w:val="19"/>
+                <w:szCs w:val="19"/>
+              </w:rPr>
               <w:t xml:space="preserve">Nothing arrives at the set time</w:t>
             </w:r>
           </w:p>
@@ -15547,7 +16010,7 @@
         <w:tc>
           <w:tcPr>
             <w:tcW w:type="dxa" w:w="4680"/>
-            <w:shd w:fill="F7F9FA" w:val="clear"/>
+            <w:shd w:fill="FFFFFF" w:val="clear"/>
             <w:tcMar>
               <w:top w:type="dxa" w:w="100"/>
               <w:left w:type="dxa" w:w="120"/>

</xml_diff>

<commit_message>
Dues step 2: status engine (dues_helper.php) from the dues records, due date and grace period; DUES_STATUS_ENGINE switch (on on the Mac); nightly fin/nightly job that also moves the membership year on; address-bar recalculation closed; requirements FIN-30 to FIN-33 (bulk actions, reversals); guides
Co-Authored-By: Claude Opus 5.5 <noreply@anthropic.com>
</commit_message>
<xml_diff>
--- a/docs/admin-guide/Honcho_Administrators_Guide.docx
+++ b/docs/admin-guide/Honcho_Administrators_Guide.docx
@@ -45,7 +45,7 @@
           <w:sz w:val="20"/>
           <w:szCs w:val="20"/>
         </w:rPr>
-        <w:t xml:space="preserve">Generated 2026-10-30</w:t>
+        <w:t xml:space="preserve">Generated 2026-10-31</w:t>
       </w:r>
     </w:p>
     <w:p>
@@ -10959,7 +10959,305 @@
                 <w:sz w:val="19"/>
                 <w:szCs w:val="19"/>
               </w:rPr>
-              <w:t xml:space="preserve">The share of full dues a new member pays: 1.0 = full dues, 0.75 = 25% off, 0 = free</w:t>
+              <w:t xml:space="preserve">The share of full dues a new member pays: 1.0 = full dues, 0.75 = 25% off, 0 = free. Being replaced by proration schedules by join month (coming with the dues screens)</w:t>
+            </w:r>
+          </w:p>
+        </w:tc>
+      </w:tr>
+      <w:tr>
+        <w:tc>
+          <w:tcPr>
+            <w:tcW w:type="dxa" w:w="4680"/>
+            <w:shd w:fill="FFFFFF" w:val="clear"/>
+            <w:tcMar>
+              <w:top w:type="dxa" w:w="100"/>
+              <w:left w:type="dxa" w:w="120"/>
+              <w:bottom w:type="dxa" w:w="100"/>
+              <w:right w:type="dxa" w:w="120"/>
+            </w:tcMar>
+          </w:tcPr>
+          <w:p>
+            <w:pPr>
+              <w:spacing w:after="0"/>
+            </w:pPr>
+            <w:r>
+              <w:rPr>
+                <w:rFonts w:ascii="Calibri" w:cs="Calibri" w:eastAsia="Calibri" w:hAnsi="Calibri"/>
+                <w:b/>
+                <w:bCs/>
+                <w:sz w:val="19"/>
+                <w:szCs w:val="19"/>
+              </w:rPr>
+              <w:t xml:space="preserve">Dues due date</w:t>
+            </w:r>
+          </w:p>
+        </w:tc>
+        <w:tc>
+          <w:tcPr>
+            <w:tcW w:type="dxa" w:w="4680"/>
+            <w:shd w:fill="FFFFFF" w:val="clear"/>
+            <w:tcMar>
+              <w:top w:type="dxa" w:w="100"/>
+              <w:left w:type="dxa" w:w="120"/>
+              <w:bottom w:type="dxa" w:w="100"/>
+              <w:right w:type="dxa" w:w="120"/>
+            </w:tcMar>
+          </w:tcPr>
+          <w:p>
+            <w:pPr>
+              <w:spacing w:after="0"/>
+            </w:pPr>
+            <w:r>
+              <w:rPr>
+                <w:rFonts w:ascii="Calibri" w:cs="Calibri" w:eastAsia="Calibri" w:hAnsi="Calibri"/>
+                <w:sz w:val="19"/>
+                <w:szCs w:val="19"/>
+              </w:rPr>
+              <w:t xml:space="preserve">Month and day dues are due for the coming membership year, as MM-DD (BPA: 09-30, so dues paid by Sep 30, 2026 are for 2027)</w:t>
+            </w:r>
+          </w:p>
+        </w:tc>
+      </w:tr>
+      <w:tr>
+        <w:tc>
+          <w:tcPr>
+            <w:tcW w:type="dxa" w:w="4680"/>
+            <w:shd w:fill="F7F9FA" w:val="clear"/>
+            <w:tcMar>
+              <w:top w:type="dxa" w:w="100"/>
+              <w:left w:type="dxa" w:w="120"/>
+              <w:bottom w:type="dxa" w:w="100"/>
+              <w:right w:type="dxa" w:w="120"/>
+            </w:tcMar>
+          </w:tcPr>
+          <w:p>
+            <w:pPr>
+              <w:spacing w:after="0"/>
+            </w:pPr>
+            <w:r>
+              <w:rPr>
+                <w:rFonts w:ascii="Calibri" w:cs="Calibri" w:eastAsia="Calibri" w:hAnsi="Calibri"/>
+                <w:b/>
+                <w:bCs/>
+                <w:sz w:val="19"/>
+                <w:szCs w:val="19"/>
+              </w:rPr>
+              <w:t xml:space="preserve">Grace period mode</w:t>
+            </w:r>
+          </w:p>
+        </w:tc>
+        <w:tc>
+          <w:tcPr>
+            <w:tcW w:type="dxa" w:w="4680"/>
+            <w:shd w:fill="F7F9FA" w:val="clear"/>
+            <w:tcMar>
+              <w:top w:type="dxa" w:w="100"/>
+              <w:left w:type="dxa" w:w="120"/>
+              <w:bottom w:type="dxa" w:w="100"/>
+              <w:right w:type="dxa" w:w="120"/>
+            </w:tcMar>
+          </w:tcPr>
+          <w:p>
+            <w:pPr>
+              <w:spacing w:after="0"/>
+            </w:pPr>
+            <w:r>
+              <w:rPr>
+                <w:rFonts w:ascii="Calibri" w:cs="Calibri" w:eastAsia="Calibri" w:hAnsi="Calibri"/>
+                <w:b/>
+                <w:bCs/>
+                <w:sz w:val="19"/>
+                <w:szCs w:val="19"/>
+              </w:rPr>
+              <w:t xml:space="preserve">Manual</w:t>
+            </w:r>
+            <w:r>
+              <w:rPr>
+                <w:rFonts w:ascii="Calibri" w:cs="Calibri" w:eastAsia="Calibri" w:hAnsi="Calibri"/>
+                <w:sz w:val="19"/>
+                <w:szCs w:val="19"/>
+              </w:rPr>
+              <w:t xml:space="preserve">: the grace period runs while the Grace period setting is on (BPA). </w:t>
+            </w:r>
+            <w:r>
+              <w:rPr>
+                <w:rFonts w:ascii="Calibri" w:cs="Calibri" w:eastAsia="Calibri" w:hAnsi="Calibri"/>
+                <w:b/>
+                <w:bCs/>
+                <w:sz w:val="19"/>
+                <w:szCs w:val="19"/>
+              </w:rPr>
+              <w:t xml:space="preserve">Calendar</w:t>
+            </w:r>
+            <w:r>
+              <w:rPr>
+                <w:rFonts w:ascii="Calibri" w:cs="Calibri" w:eastAsia="Calibri" w:hAnsi="Calibri"/>
+                <w:sz w:val="19"/>
+                <w:szCs w:val="19"/>
+              </w:rPr>
+              <w:t xml:space="preserve">: it ends on the grace end date</w:t>
+            </w:r>
+          </w:p>
+        </w:tc>
+      </w:tr>
+      <w:tr>
+        <w:tc>
+          <w:tcPr>
+            <w:tcW w:type="dxa" w:w="4680"/>
+            <w:shd w:fill="FFFFFF" w:val="clear"/>
+            <w:tcMar>
+              <w:top w:type="dxa" w:w="100"/>
+              <w:left w:type="dxa" w:w="120"/>
+              <w:bottom w:type="dxa" w:w="100"/>
+              <w:right w:type="dxa" w:w="120"/>
+            </w:tcMar>
+          </w:tcPr>
+          <w:p>
+            <w:pPr>
+              <w:spacing w:after="0"/>
+            </w:pPr>
+            <w:r>
+              <w:rPr>
+                <w:rFonts w:ascii="Calibri" w:cs="Calibri" w:eastAsia="Calibri" w:hAnsi="Calibri"/>
+                <w:b/>
+                <w:bCs/>
+                <w:sz w:val="19"/>
+                <w:szCs w:val="19"/>
+              </w:rPr>
+              <w:t xml:space="preserve">Grace period end</w:t>
+            </w:r>
+          </w:p>
+        </w:tc>
+        <w:tc>
+          <w:tcPr>
+            <w:tcW w:type="dxa" w:w="4680"/>
+            <w:shd w:fill="FFFFFF" w:val="clear"/>
+            <w:tcMar>
+              <w:top w:type="dxa" w:w="100"/>
+              <w:left w:type="dxa" w:w="120"/>
+              <w:bottom w:type="dxa" w:w="100"/>
+              <w:right w:type="dxa" w:w="120"/>
+            </w:tcMar>
+          </w:tcPr>
+          <w:p>
+            <w:pPr>
+              <w:spacing w:after="0"/>
+            </w:pPr>
+            <w:r>
+              <w:rPr>
+                <w:rFonts w:ascii="Calibri" w:cs="Calibri" w:eastAsia="Calibri" w:hAnsi="Calibri"/>
+                <w:sz w:val="19"/>
+                <w:szCs w:val="19"/>
+              </w:rPr>
+              <w:t xml:space="preserve">Calendar mode only: the last day of the grace period, as MM-DD</w:t>
+            </w:r>
+          </w:p>
+        </w:tc>
+      </w:tr>
+      <w:tr>
+        <w:tc>
+          <w:tcPr>
+            <w:tcW w:type="dxa" w:w="4680"/>
+            <w:shd w:fill="F7F9FA" w:val="clear"/>
+            <w:tcMar>
+              <w:top w:type="dxa" w:w="100"/>
+              <w:left w:type="dxa" w:w="120"/>
+              <w:bottom w:type="dxa" w:w="100"/>
+              <w:right w:type="dxa" w:w="120"/>
+            </w:tcMar>
+          </w:tcPr>
+          <w:p>
+            <w:pPr>
+              <w:spacing w:after="0"/>
+            </w:pPr>
+            <w:r>
+              <w:rPr>
+                <w:rFonts w:ascii="Calibri" w:cs="Calibri" w:eastAsia="Calibri" w:hAnsi="Calibri"/>
+                <w:b/>
+                <w:bCs/>
+                <w:sz w:val="19"/>
+                <w:szCs w:val="19"/>
+              </w:rPr>
+              <w:t xml:space="preserve">Dues billing plans offered</w:t>
+            </w:r>
+          </w:p>
+        </w:tc>
+        <w:tc>
+          <w:tcPr>
+            <w:tcW w:type="dxa" w:w="4680"/>
+            <w:shd w:fill="F7F9FA" w:val="clear"/>
+            <w:tcMar>
+              <w:top w:type="dxa" w:w="100"/>
+              <w:left w:type="dxa" w:w="120"/>
+              <w:bottom w:type="dxa" w:w="100"/>
+              <w:right w:type="dxa" w:w="120"/>
+            </w:tcMar>
+          </w:tcPr>
+          <w:p>
+            <w:pPr>
+              <w:spacing w:after="0"/>
+            </w:pPr>
+            <w:r>
+              <w:rPr>
+                <w:rFonts w:ascii="Calibri" w:cs="Calibri" w:eastAsia="Calibri" w:hAnsi="Calibri"/>
+                <w:sz w:val="19"/>
+                <w:szCs w:val="19"/>
+              </w:rPr>
+              <w:t xml:space="preserve">Annual, quarterly and/or monthly (used when the dues screens arrive)</w:t>
+            </w:r>
+          </w:p>
+        </w:tc>
+      </w:tr>
+      <w:tr>
+        <w:tc>
+          <w:tcPr>
+            <w:tcW w:type="dxa" w:w="4680"/>
+            <w:shd w:fill="FFFFFF" w:val="clear"/>
+            <w:tcMar>
+              <w:top w:type="dxa" w:w="100"/>
+              <w:left w:type="dxa" w:w="120"/>
+              <w:bottom w:type="dxa" w:w="100"/>
+              <w:right w:type="dxa" w:w="120"/>
+            </w:tcMar>
+          </w:tcPr>
+          <w:p>
+            <w:pPr>
+              <w:spacing w:after="0"/>
+            </w:pPr>
+            <w:r>
+              <w:rPr>
+                <w:rFonts w:ascii="Calibri" w:cs="Calibri" w:eastAsia="Calibri" w:hAnsi="Calibri"/>
+                <w:b/>
+                <w:bCs/>
+                <w:sz w:val="19"/>
+                <w:szCs w:val="19"/>
+              </w:rPr>
+              <w:t xml:space="preserve">Status from the dues records</w:t>
+            </w:r>
+          </w:p>
+        </w:tc>
+        <w:tc>
+          <w:tcPr>
+            <w:tcW w:type="dxa" w:w="4680"/>
+            <w:shd w:fill="FFFFFF" w:val="clear"/>
+            <w:tcMar>
+              <w:top w:type="dxa" w:w="100"/>
+              <w:left w:type="dxa" w:w="120"/>
+              <w:bottom w:type="dxa" w:w="100"/>
+              <w:right w:type="dxa" w:w="120"/>
+            </w:tcMar>
+          </w:tcPr>
+          <w:p>
+            <w:pPr>
+              <w:spacing w:after="0"/>
+            </w:pPr>
+            <w:r>
+              <w:rPr>
+                <w:rFonts w:ascii="Calibri" w:cs="Calibri" w:eastAsia="Calibri" w:hAnsi="Calibri"/>
+                <w:sz w:val="19"/>
+                <w:szCs w:val="19"/>
+              </w:rPr>
+              <w:t xml:space="preserve">On: the new dues engine sets every member's status from their dues, the due date and the grace period, every night, and moves the membership year on by itself the day after the due date. Off: the old rule. Switch on only once the dues history has been loaded</w:t>
             </w:r>
           </w:p>
         </w:tc>
@@ -10969,6 +11267,81 @@
       <w:pPr>
         <w:spacing w:after="240"/>
       </w:pPr>
+    </w:p>
+    <w:p>
+      <w:pPr>
+        <w:spacing w:after="160"/>
+      </w:pPr>
+      <w:r>
+        <w:rPr>
+          <w:rFonts w:ascii="Calibri" w:cs="Calibri" w:eastAsia="Calibri" w:hAnsi="Calibri"/>
+          <w:b/>
+          <w:bCs/>
+        </w:rPr>
+        <w:t xml:space="preserve">With the new dues engine on:</w:t>
+      </w:r>
+      <w:r>
+        <w:rPr>
+          <w:rFonts w:ascii="Calibri" w:cs="Calibri" w:eastAsia="Calibri" w:hAnsi="Calibri"/>
+        </w:rPr>
+        <w:t xml:space="preserve"> a member is </w:t>
+      </w:r>
+      <w:r>
+        <w:rPr>
+          <w:rFonts w:ascii="Calibri" w:cs="Calibri" w:eastAsia="Calibri" w:hAnsi="Calibri"/>
+          <w:b/>
+          <w:bCs/>
+        </w:rPr>
+        <w:t xml:space="preserve">Current</w:t>
+      </w:r>
+      <w:r>
+        <w:rPr>
+          <w:rFonts w:ascii="Calibri" w:cs="Calibri" w:eastAsia="Calibri" w:hAnsi="Calibri"/>
+        </w:rPr>
+        <w:t xml:space="preserve"> when both their chapter dues and their National dues for the year in force are paid; </w:t>
+      </w:r>
+      <w:r>
+        <w:rPr>
+          <w:rFonts w:ascii="Calibri" w:cs="Calibri" w:eastAsia="Calibri" w:hAnsi="Calibri"/>
+          <w:b/>
+          <w:bCs/>
+        </w:rPr>
+        <w:t xml:space="preserve">Pending</w:t>
+      </w:r>
+      <w:r>
+        <w:rPr>
+          <w:rFonts w:ascii="Calibri" w:cs="Calibri" w:eastAsia="Calibri" w:hAnsi="Calibri"/>
+        </w:rPr>
+        <w:t xml:space="preserve"> when the chapter dues are paid but National's invoice isn't; </w:t>
+      </w:r>
+      <w:r>
+        <w:rPr>
+          <w:rFonts w:ascii="Calibri" w:cs="Calibri" w:eastAsia="Calibri" w:hAnsi="Calibri"/>
+          <w:b/>
+          <w:bCs/>
+        </w:rPr>
+        <w:t xml:space="preserve">Past Due</w:t>
+      </w:r>
+      <w:r>
+        <w:rPr>
+          <w:rFonts w:ascii="Calibri" w:cs="Calibri" w:eastAsia="Calibri" w:hAnsi="Calibri"/>
+        </w:rPr>
+        <w:t xml:space="preserve"> when they were paid up last year, missed this year's due date and the grace period is on; </w:t>
+      </w:r>
+      <w:r>
+        <w:rPr>
+          <w:rFonts w:ascii="Calibri" w:cs="Calibri" w:eastAsia="Calibri" w:hAnsi="Calibri"/>
+          <w:b/>
+          <w:bCs/>
+        </w:rPr>
+        <w:t xml:space="preserve">Expired</w:t>
+      </w:r>
+      <w:r>
+        <w:rPr>
+          <w:rFonts w:ascii="Calibri" w:cs="Calibri" w:eastAsia="Calibri" w:hAnsi="Calibri"/>
+        </w:rPr>
+        <w:t xml:space="preserve"> when the grace period is off or has ended, or they're more than a year behind. Lifetime and Honorary members are always Current. Turning the grace period off (manual mode) moves Past Due members to Expired straight away.</w:t>
+      </w:r>
     </w:p>
     <w:p>
       <w:pPr>

</xml_diff>

<commit_message>
Dues step 3: recording chapter dues (member Dues page, Record/Renew, Reverse with National invoice voided or flagged), bulk Chapter Dues Paid with confirmation, Undelete, Current Year edits routed through the dues steps, National invoice email; guides
Co-Authored-By: Claude Opus 5.5 <noreply@anthropic.com>
</commit_message>
<xml_diff>
--- a/docs/admin-guide/Honcho_Administrators_Guide.docx
+++ b/docs/admin-guide/Honcho_Administrators_Guide.docx
@@ -2763,7 +2763,7 @@
                 <w:sz w:val="19"/>
                 <w:szCs w:val="19"/>
               </w:rPr>
-              <w:t xml:space="preserve">Current Year</w:t>
+              <w:t xml:space="preserve">Chapter Dues Paid</w:t>
             </w:r>
           </w:p>
         </w:tc>
@@ -2788,7 +2788,7 @@
                 <w:sz w:val="19"/>
                 <w:szCs w:val="19"/>
               </w:rPr>
-              <w:t xml:space="preserve">Marks the ticked members as members for the current year</w:t>
+              <w:t xml:space="preserve">Records chapter dues paid for the ticked members (see Chapter Dues). Shown once the dues engine is on</w:t>
             </w:r>
           </w:p>
         </w:tc>
@@ -2817,7 +2817,7 @@
                 <w:sz w:val="19"/>
                 <w:szCs w:val="19"/>
               </w:rPr>
-              <w:t xml:space="preserve">User Acct</w:t>
+              <w:t xml:space="preserve">Current Year</w:t>
             </w:r>
           </w:p>
         </w:tc>
@@ -2842,7 +2842,7 @@
                 <w:sz w:val="19"/>
                 <w:szCs w:val="19"/>
               </w:rPr>
-              <w:t xml:space="preserve">Creates a login account for each ticked member who doesn't have one</w:t>
+              <w:t xml:space="preserve">With the dues engine on: the same as Chapter Dues Paid. Before that: marks the ticked members as members for the current year</w:t>
             </w:r>
           </w:p>
         </w:tc>
@@ -2871,6 +2871,60 @@
                 <w:sz w:val="19"/>
                 <w:szCs w:val="19"/>
               </w:rPr>
+              <w:t xml:space="preserve">User Acct</w:t>
+            </w:r>
+          </w:p>
+        </w:tc>
+        <w:tc>
+          <w:tcPr>
+            <w:tcW w:type="dxa" w:w="4680"/>
+            <w:shd w:fill="FFFFFF" w:val="clear"/>
+            <w:tcMar>
+              <w:top w:type="dxa" w:w="100"/>
+              <w:left w:type="dxa" w:w="120"/>
+              <w:bottom w:type="dxa" w:w="100"/>
+              <w:right w:type="dxa" w:w="120"/>
+            </w:tcMar>
+          </w:tcPr>
+          <w:p>
+            <w:pPr>
+              <w:spacing w:after="0"/>
+            </w:pPr>
+            <w:r>
+              <w:rPr>
+                <w:rFonts w:ascii="Calibri" w:cs="Calibri" w:eastAsia="Calibri" w:hAnsi="Calibri"/>
+                <w:sz w:val="19"/>
+                <w:szCs w:val="19"/>
+              </w:rPr>
+              <w:t xml:space="preserve">Creates a login account for each ticked member who doesn't have one</w:t>
+            </w:r>
+          </w:p>
+        </w:tc>
+      </w:tr>
+      <w:tr>
+        <w:tc>
+          <w:tcPr>
+            <w:tcW w:type="dxa" w:w="4680"/>
+            <w:shd w:fill="F7F9FA" w:val="clear"/>
+            <w:tcMar>
+              <w:top w:type="dxa" w:w="100"/>
+              <w:left w:type="dxa" w:w="120"/>
+              <w:bottom w:type="dxa" w:w="100"/>
+              <w:right w:type="dxa" w:w="120"/>
+            </w:tcMar>
+          </w:tcPr>
+          <w:p>
+            <w:pPr>
+              <w:spacing w:after="0"/>
+            </w:pPr>
+            <w:r>
+              <w:rPr>
+                <w:rFonts w:ascii="Calibri" w:cs="Calibri" w:eastAsia="Calibri" w:hAnsi="Calibri"/>
+                <w:b/>
+                <w:bCs/>
+                <w:sz w:val="19"/>
+                <w:szCs w:val="19"/>
+              </w:rPr>
               <w:t xml:space="preserve">Delete</w:t>
             </w:r>
           </w:p>
@@ -2878,6 +2932,33 @@
         <w:tc>
           <w:tcPr>
             <w:tcW w:type="dxa" w:w="4680"/>
+            <w:shd w:fill="F7F9FA" w:val="clear"/>
+            <w:tcMar>
+              <w:top w:type="dxa" w:w="100"/>
+              <w:left w:type="dxa" w:w="120"/>
+              <w:bottom w:type="dxa" w:w="100"/>
+              <w:right w:type="dxa" w:w="120"/>
+            </w:tcMar>
+          </w:tcPr>
+          <w:p>
+            <w:pPr>
+              <w:spacing w:after="0"/>
+            </w:pPr>
+            <w:r>
+              <w:rPr>
+                <w:rFonts w:ascii="Calibri" w:cs="Calibri" w:eastAsia="Calibri" w:hAnsi="Calibri"/>
+                <w:sz w:val="19"/>
+                <w:szCs w:val="19"/>
+              </w:rPr>
+              <w:t xml:space="preserve">Deletes the ticked members</w:t>
+            </w:r>
+          </w:p>
+        </w:tc>
+      </w:tr>
+      <w:tr>
+        <w:tc>
+          <w:tcPr>
+            <w:tcW w:type="dxa" w:w="4680"/>
             <w:shd w:fill="FFFFFF" w:val="clear"/>
             <w:tcMar>
               <w:top w:type="dxa" w:w="100"/>
@@ -2893,10 +2974,37 @@
             <w:r>
               <w:rPr>
                 <w:rFonts w:ascii="Calibri" w:cs="Calibri" w:eastAsia="Calibri" w:hAnsi="Calibri"/>
-                <w:sz w:val="19"/>
-                <w:szCs w:val="19"/>
-              </w:rPr>
-              <w:t xml:space="preserve">Deletes the ticked members (can be undone one at a time with Undelete Record)</w:t>
+                <w:b/>
+                <w:bCs/>
+                <w:sz w:val="19"/>
+                <w:szCs w:val="19"/>
+              </w:rPr>
+              <w:t xml:space="preserve">Undelete</w:t>
+            </w:r>
+          </w:p>
+        </w:tc>
+        <w:tc>
+          <w:tcPr>
+            <w:tcW w:type="dxa" w:w="4680"/>
+            <w:shd w:fill="FFFFFF" w:val="clear"/>
+            <w:tcMar>
+              <w:top w:type="dxa" w:w="100"/>
+              <w:left w:type="dxa" w:w="120"/>
+              <w:bottom w:type="dxa" w:w="100"/>
+              <w:right w:type="dxa" w:w="120"/>
+            </w:tcMar>
+          </w:tcPr>
+          <w:p>
+            <w:pPr>
+              <w:spacing w:after="0"/>
+            </w:pPr>
+            <w:r>
+              <w:rPr>
+                <w:rFonts w:ascii="Calibri" w:cs="Calibri" w:eastAsia="Calibri" w:hAnsi="Calibri"/>
+                <w:sz w:val="19"/>
+                <w:szCs w:val="19"/>
+              </w:rPr>
+              <w:t xml:space="preserve">Brings deleted members back, with their status worked out again</w:t>
             </w:r>
           </w:p>
         </w:tc>
@@ -3304,6 +3412,588 @@
         </w:rPr>
         <w:t xml:space="preserve"> bulk action, or create the account from their record. They'll be asked to choose a new password the first time they log in.</w:t>
       </w:r>
+    </w:p>
+    <w:p>
+      <w:pPr>
+        <w:pStyle w:val="Heading2"/>
+        <w:pBdr>
+          <w:bottom w:val="single" w:color="2C3E50" w:sz="6" w:space="8"/>
+        </w:pBdr>
+        <w:spacing w:before="500" w:after="240"/>
+      </w:pPr>
+      <w:r>
+        <w:t xml:space="preserve">Chapter Dues</w:t>
+      </w:r>
+    </w:p>
+    <w:p>
+      <w:pPr>
+        <w:spacing w:after="160"/>
+      </w:pPr>
+      <w:r>
+        <w:rPr>
+          <w:rFonts w:ascii="Calibri" w:cs="Calibri" w:eastAsia="Calibri" w:hAnsi="Calibri"/>
+        </w:rPr>
+        <w:t xml:space="preserve">When a member pays your chapter's dues, record it in Honcho. That is what tells National to invoice the member for National dues, and it moves the member to </w:t>
+      </w:r>
+      <w:r>
+        <w:rPr>
+          <w:rFonts w:ascii="Calibri" w:cs="Calibri" w:eastAsia="Calibri" w:hAnsi="Calibri"/>
+          <w:b/>
+          <w:bCs/>
+        </w:rPr>
+        <w:t xml:space="preserve">Pending</w:t>
+      </w:r>
+      <w:r>
+        <w:rPr>
+          <w:rFonts w:ascii="Calibri" w:cs="Calibri" w:eastAsia="Calibri" w:hAnsi="Calibri"/>
+        </w:rPr>
+        <w:t xml:space="preserve"> until National is paid, then </w:t>
+      </w:r>
+      <w:r>
+        <w:rPr>
+          <w:rFonts w:ascii="Calibri" w:cs="Calibri" w:eastAsia="Calibri" w:hAnsi="Calibri"/>
+          <w:b/>
+          <w:bCs/>
+        </w:rPr>
+        <w:t xml:space="preserve">Current</w:t>
+      </w:r>
+      <w:r>
+        <w:rPr>
+          <w:rFonts w:ascii="Calibri" w:cs="Calibri" w:eastAsia="Calibri" w:hAnsi="Calibri"/>
+        </w:rPr>
+        <w:t xml:space="preserve">. (This works once the dues engine is switched on in System Settings, Financial.)</w:t>
+      </w:r>
+    </w:p>
+    <w:p>
+      <w:pPr>
+        <w:pStyle w:val="Heading3"/>
+        <w:spacing w:before="320" w:after="160"/>
+      </w:pPr>
+      <w:r>
+        <w:t xml:space="preserve">One Member</w:t>
+      </w:r>
+    </w:p>
+    <w:p>
+      <w:pPr>
+        <w:pStyle w:val="ListParagraph"/>
+        <w:numPr>
+          <w:ilvl w:val="0"/>
+          <w:numId w:val="3"/>
+        </w:numPr>
+        <w:spacing w:after="100"/>
+      </w:pPr>
+      <w:r>
+        <w:rPr>
+          <w:rFonts w:ascii="Calibri" w:cs="Calibri" w:eastAsia="Calibri" w:hAnsi="Calibri"/>
+        </w:rPr>
+        <w:t xml:space="preserve">Open the member and click </w:t>
+      </w:r>
+      <w:r>
+        <w:rPr>
+          <w:rFonts w:ascii="Calibri" w:cs="Calibri" w:eastAsia="Calibri" w:hAnsi="Calibri"/>
+          <w:b/>
+          <w:bCs/>
+        </w:rPr>
+        <w:t xml:space="preserve">Dues</w:t>
+      </w:r>
+      <w:r>
+        <w:rPr>
+          <w:rFonts w:ascii="Calibri" w:cs="Calibri" w:eastAsia="Calibri" w:hAnsi="Calibri"/>
+        </w:rPr>
+        <w:t xml:space="preserve"> (next to Card).</w:t>
+      </w:r>
+    </w:p>
+    <w:p>
+      <w:pPr>
+        <w:pStyle w:val="ListParagraph"/>
+        <w:numPr>
+          <w:ilvl w:val="0"/>
+          <w:numId w:val="3"/>
+        </w:numPr>
+        <w:spacing w:after="100"/>
+      </w:pPr>
+      <w:r>
+        <w:rPr>
+          <w:rFonts w:ascii="Calibri" w:cs="Calibri" w:eastAsia="Calibri" w:hAnsi="Calibri"/>
+        </w:rPr>
+        <w:t xml:space="preserve">Choose how they paid (</w:t>
+      </w:r>
+      <w:r>
+        <w:rPr>
+          <w:rFonts w:ascii="Calibri" w:cs="Calibri" w:eastAsia="Calibri" w:hAnsi="Calibri"/>
+          <w:b/>
+          <w:bCs/>
+        </w:rPr>
+        <w:t xml:space="preserve">Check</w:t>
+      </w:r>
+      <w:r>
+        <w:rPr>
+          <w:rFonts w:ascii="Calibri" w:cs="Calibri" w:eastAsia="Calibri" w:hAnsi="Calibri"/>
+        </w:rPr>
+        <w:t xml:space="preserve">, </w:t>
+      </w:r>
+      <w:r>
+        <w:rPr>
+          <w:rFonts w:ascii="Calibri" w:cs="Calibri" w:eastAsia="Calibri" w:hAnsi="Calibri"/>
+          <w:b/>
+          <w:bCs/>
+        </w:rPr>
+        <w:t xml:space="preserve">Cash</w:t>
+      </w:r>
+      <w:r>
+        <w:rPr>
+          <w:rFonts w:ascii="Calibri" w:cs="Calibri" w:eastAsia="Calibri" w:hAnsi="Calibri"/>
+        </w:rPr>
+        <w:t xml:space="preserve"> or </w:t>
+      </w:r>
+      <w:r>
+        <w:rPr>
+          <w:rFonts w:ascii="Calibri" w:cs="Calibri" w:eastAsia="Calibri" w:hAnsi="Calibri"/>
+          <w:b/>
+          <w:bCs/>
+        </w:rPr>
+        <w:t xml:space="preserve">Other</w:t>
+      </w:r>
+      <w:r>
+        <w:rPr>
+          <w:rFonts w:ascii="Calibri" w:cs="Calibri" w:eastAsia="Calibri" w:hAnsi="Calibri"/>
+        </w:rPr>
+        <w:t xml:space="preserve">), the check number or reference, and the date you received it.</w:t>
+      </w:r>
+    </w:p>
+    <w:p>
+      <w:pPr>
+        <w:pStyle w:val="ListParagraph"/>
+        <w:numPr>
+          <w:ilvl w:val="0"/>
+          <w:numId w:val="3"/>
+        </w:numPr>
+        <w:spacing w:after="100"/>
+      </w:pPr>
+      <w:r>
+        <w:rPr>
+          <w:rFonts w:ascii="Calibri" w:cs="Calibri" w:eastAsia="Calibri" w:hAnsi="Calibri"/>
+        </w:rPr>
+        <w:t xml:space="preserve">Click </w:t>
+      </w:r>
+      <w:r>
+        <w:rPr>
+          <w:rFonts w:ascii="Calibri" w:cs="Calibri" w:eastAsia="Calibri" w:hAnsi="Calibri"/>
+          <w:b/>
+          <w:bCs/>
+        </w:rPr>
+        <w:t xml:space="preserve">Record chapter dues paid</w:t>
+      </w:r>
+      <w:r>
+        <w:rPr>
+          <w:rFonts w:ascii="Calibri" w:cs="Calibri" w:eastAsia="Calibri" w:hAnsi="Calibri"/>
+        </w:rPr>
+        <w:t xml:space="preserve">. If your chapter has no dues, the button is </w:t>
+      </w:r>
+      <w:r>
+        <w:rPr>
+          <w:rFonts w:ascii="Calibri" w:cs="Calibri" w:eastAsia="Calibri" w:hAnsi="Calibri"/>
+          <w:b/>
+          <w:bCs/>
+        </w:rPr>
+        <w:t xml:space="preserve">Renew</w:t>
+      </w:r>
+      <w:r>
+        <w:rPr>
+          <w:rFonts w:ascii="Calibri" w:cs="Calibri" w:eastAsia="Calibri" w:hAnsi="Calibri"/>
+        </w:rPr>
+        <w:t xml:space="preserve"> instead.</w:t>
+      </w:r>
+    </w:p>
+    <w:p>
+      <w:pPr>
+        <w:spacing w:after="120"/>
+      </w:pPr>
+    </w:p>
+    <w:p>
+      <w:pPr>
+        <w:spacing w:after="160"/>
+      </w:pPr>
+      <w:r>
+        <w:rPr>
+          <w:rFonts w:ascii="Calibri" w:cs="Calibri" w:eastAsia="Calibri" w:hAnsi="Calibri"/>
+        </w:rPr>
+        <w:t xml:space="preserve">Honcho records the payment with a receipt number, raises the member's </w:t>
+      </w:r>
+      <w:r>
+        <w:rPr>
+          <w:rFonts w:ascii="Calibri" w:cs="Calibri" w:eastAsia="Calibri" w:hAnsi="Calibri"/>
+          <w:b/>
+          <w:bCs/>
+        </w:rPr>
+        <w:t xml:space="preserve">National dues invoice</w:t>
+      </w:r>
+      <w:r>
+        <w:rPr>
+          <w:rFonts w:ascii="Calibri" w:cs="Calibri" w:eastAsia="Calibri" w:hAnsi="Calibri"/>
+        </w:rPr>
+        <w:t xml:space="preserve"> and emails it to them, and sets their Current Year. The page shows their dues history, invoices and payments. A </w:t>
+      </w:r>
+      <w:r>
+        <w:rPr>
+          <w:rFonts w:ascii="Calibri" w:cs="Calibri" w:eastAsia="Calibri" w:hAnsi="Calibri"/>
+          <w:b/>
+          <w:bCs/>
+        </w:rPr>
+        <w:t xml:space="preserve">new member's</w:t>
+      </w:r>
+      <w:r>
+        <w:rPr>
+          <w:rFonts w:ascii="Calibri" w:cs="Calibri" w:eastAsia="Calibri" w:hAnsi="Calibri"/>
+        </w:rPr>
+        <w:t xml:space="preserve"> dues may be prorated, depending on when they join; the page says so.</w:t>
+      </w:r>
+    </w:p>
+    <w:p>
+      <w:pPr>
+        <w:pStyle w:val="Heading3"/>
+        <w:spacing w:before="320" w:after="160"/>
+      </w:pPr>
+      <w:r>
+        <w:t xml:space="preserve">Many Members at Once</w:t>
+      </w:r>
+    </w:p>
+    <w:p>
+      <w:pPr>
+        <w:pStyle w:val="ListParagraph"/>
+        <w:numPr>
+          <w:ilvl w:val="0"/>
+          <w:numId w:val="3"/>
+        </w:numPr>
+        <w:spacing w:after="100"/>
+      </w:pPr>
+      <w:r>
+        <w:rPr>
+          <w:rFonts w:ascii="Calibri" w:cs="Calibri" w:eastAsia="Calibri" w:hAnsi="Calibri"/>
+        </w:rPr>
+        <w:t xml:space="preserve">On your chapter's member list, tick the members who paid.</w:t>
+      </w:r>
+    </w:p>
+    <w:p>
+      <w:pPr>
+        <w:pStyle w:val="ListParagraph"/>
+        <w:numPr>
+          <w:ilvl w:val="0"/>
+          <w:numId w:val="3"/>
+        </w:numPr>
+        <w:spacing w:after="100"/>
+      </w:pPr>
+      <w:r>
+        <w:rPr>
+          <w:rFonts w:ascii="Calibri" w:cs="Calibri" w:eastAsia="Calibri" w:hAnsi="Calibri"/>
+        </w:rPr>
+        <w:t xml:space="preserve">Choose </w:t>
+      </w:r>
+      <w:r>
+        <w:rPr>
+          <w:rFonts w:ascii="Calibri" w:cs="Calibri" w:eastAsia="Calibri" w:hAnsi="Calibri"/>
+          <w:b/>
+          <w:bCs/>
+        </w:rPr>
+        <w:t xml:space="preserve">Chapter Dues Paid</w:t>
+      </w:r>
+      <w:r>
+        <w:rPr>
+          <w:rFonts w:ascii="Calibri" w:cs="Calibri" w:eastAsia="Calibri" w:hAnsi="Calibri"/>
+        </w:rPr>
+        <w:t xml:space="preserve"> from </w:t>
+      </w:r>
+      <w:r>
+        <w:rPr>
+          <w:rFonts w:ascii="Calibri" w:cs="Calibri" w:eastAsia="Calibri" w:hAnsi="Calibri"/>
+          <w:b/>
+          <w:bCs/>
+        </w:rPr>
+        <w:t xml:space="preserve">Bulk Actions</w:t>
+      </w:r>
+      <w:r>
+        <w:rPr>
+          <w:rFonts w:ascii="Calibri" w:cs="Calibri" w:eastAsia="Calibri" w:hAnsi="Calibri"/>
+        </w:rPr>
+        <w:t xml:space="preserve"> and click </w:t>
+      </w:r>
+      <w:r>
+        <w:rPr>
+          <w:rFonts w:ascii="Calibri" w:cs="Calibri" w:eastAsia="Calibri" w:hAnsi="Calibri"/>
+          <w:b/>
+          <w:bCs/>
+        </w:rPr>
+        <w:t xml:space="preserve">Submit</w:t>
+      </w:r>
+      <w:r>
+        <w:rPr>
+          <w:rFonts w:ascii="Calibri" w:cs="Calibri" w:eastAsia="Calibri" w:hAnsi="Calibri"/>
+        </w:rPr>
+        <w:t xml:space="preserve">.</w:t>
+      </w:r>
+    </w:p>
+    <w:p>
+      <w:pPr>
+        <w:pStyle w:val="ListParagraph"/>
+        <w:numPr>
+          <w:ilvl w:val="0"/>
+          <w:numId w:val="3"/>
+        </w:numPr>
+        <w:spacing w:after="100"/>
+      </w:pPr>
+      <w:r>
+        <w:rPr>
+          <w:rFonts w:ascii="Calibri" w:cs="Calibri" w:eastAsia="Calibri" w:hAnsi="Calibri"/>
+        </w:rPr>
+        <w:t xml:space="preserve">A page lists them with their amounts (and any that will be skipped, such as lifetime members or anyone already recorded). Untick anyone who shouldn't be included, choose how they paid, the reference and the date, and click </w:t>
+      </w:r>
+      <w:r>
+        <w:rPr>
+          <w:rFonts w:ascii="Calibri" w:cs="Calibri" w:eastAsia="Calibri" w:hAnsi="Calibri"/>
+          <w:b/>
+          <w:bCs/>
+        </w:rPr>
+        <w:t xml:space="preserve">Record the ticked members</w:t>
+      </w:r>
+      <w:r>
+        <w:rPr>
+          <w:rFonts w:ascii="Calibri" w:cs="Calibri" w:eastAsia="Calibri" w:hAnsi="Calibri"/>
+        </w:rPr>
+        <w:t xml:space="preserve">.</w:t>
+      </w:r>
+    </w:p>
+    <w:p>
+      <w:pPr>
+        <w:spacing w:after="120"/>
+      </w:pPr>
+    </w:p>
+    <w:p>
+      <w:pPr>
+        <w:pStyle w:val="Heading3"/>
+        <w:spacing w:before="320" w:after="160"/>
+      </w:pPr>
+      <w:r>
+        <w:t xml:space="preserve">When It Was a Mistake (or a Check Bounced)</w:t>
+      </w:r>
+    </w:p>
+    <w:p>
+      <w:pPr>
+        <w:spacing w:after="160"/>
+      </w:pPr>
+      <w:r>
+        <w:rPr>
+          <w:rFonts w:ascii="Calibri" w:cs="Calibri" w:eastAsia="Calibri" w:hAnsi="Calibri"/>
+        </w:rPr>
+        <w:t xml:space="preserve">Open the member's </w:t>
+      </w:r>
+      <w:r>
+        <w:rPr>
+          <w:rFonts w:ascii="Calibri" w:cs="Calibri" w:eastAsia="Calibri" w:hAnsi="Calibri"/>
+          <w:b/>
+          <w:bCs/>
+        </w:rPr>
+        <w:t xml:space="preserve">Dues</w:t>
+      </w:r>
+      <w:r>
+        <w:rPr>
+          <w:rFonts w:ascii="Calibri" w:cs="Calibri" w:eastAsia="Calibri" w:hAnsi="Calibri"/>
+        </w:rPr>
+        <w:t xml:space="preserve"> page and use </w:t>
+      </w:r>
+      <w:r>
+        <w:rPr>
+          <w:rFonts w:ascii="Calibri" w:cs="Calibri" w:eastAsia="Calibri" w:hAnsi="Calibri"/>
+          <w:b/>
+          <w:bCs/>
+        </w:rPr>
+        <w:t xml:space="preserve">Reverse chapter dues</w:t>
+      </w:r>
+      <w:r>
+        <w:rPr>
+          <w:rFonts w:ascii="Calibri" w:cs="Calibri" w:eastAsia="Calibri" w:hAnsi="Calibri"/>
+        </w:rPr>
+        <w:t xml:space="preserve">: choose why (check bounced, not actually paid, entered by mistake, other) and click </w:t>
+      </w:r>
+      <w:r>
+        <w:rPr>
+          <w:rFonts w:ascii="Calibri" w:cs="Calibri" w:eastAsia="Calibri" w:hAnsi="Calibri"/>
+          <w:b/>
+          <w:bCs/>
+        </w:rPr>
+        <w:t xml:space="preserve">Reverse</w:t>
+      </w:r>
+      <w:r>
+        <w:rPr>
+          <w:rFonts w:ascii="Calibri" w:cs="Calibri" w:eastAsia="Calibri" w:hAnsi="Calibri"/>
+        </w:rPr>
+        <w:t xml:space="preserve"> twice.</w:t>
+      </w:r>
+    </w:p>
+    <w:p>
+      <w:pPr>
+        <w:pStyle w:val="ListParagraph"/>
+        <w:numPr>
+          <w:ilvl w:val="0"/>
+          <w:numId w:val="2"/>
+        </w:numPr>
+        <w:spacing w:after="100"/>
+      </w:pPr>
+      <w:r>
+        <w:rPr>
+          <w:rFonts w:ascii="Calibri" w:cs="Calibri" w:eastAsia="Calibri" w:hAnsi="Calibri"/>
+        </w:rPr>
+        <w:t xml:space="preserve">The payment is marked reversed and the member goes back to paid through last year.</w:t>
+      </w:r>
+    </w:p>
+    <w:p>
+      <w:pPr>
+        <w:pStyle w:val="ListParagraph"/>
+        <w:numPr>
+          <w:ilvl w:val="0"/>
+          <w:numId w:val="2"/>
+        </w:numPr>
+        <w:spacing w:after="100"/>
+      </w:pPr>
+      <w:r>
+        <w:rPr>
+          <w:rFonts w:ascii="Calibri" w:cs="Calibri" w:eastAsia="Calibri" w:hAnsi="Calibri"/>
+        </w:rPr>
+        <w:t xml:space="preserve">If the member </w:t>
+      </w:r>
+      <w:r>
+        <w:rPr>
+          <w:rFonts w:ascii="Calibri" w:cs="Calibri" w:eastAsia="Calibri" w:hAnsi="Calibri"/>
+          <w:b/>
+          <w:bCs/>
+        </w:rPr>
+        <w:t xml:space="preserve">hasn't paid</w:t>
+      </w:r>
+      <w:r>
+        <w:rPr>
+          <w:rFonts w:ascii="Calibri" w:cs="Calibri" w:eastAsia="Calibri" w:hAnsi="Calibri"/>
+        </w:rPr>
+        <w:t xml:space="preserve"> National's invoice yet, it is voided and the member is told it's withdrawn, so National doesn't expect the money.</w:t>
+      </w:r>
+    </w:p>
+    <w:p>
+      <w:pPr>
+        <w:pStyle w:val="ListParagraph"/>
+        <w:numPr>
+          <w:ilvl w:val="0"/>
+          <w:numId w:val="2"/>
+        </w:numPr>
+        <w:spacing w:after="100"/>
+      </w:pPr>
+      <w:r>
+        <w:rPr>
+          <w:rFonts w:ascii="Calibri" w:cs="Calibri" w:eastAsia="Calibri" w:hAnsi="Calibri"/>
+        </w:rPr>
+        <w:t xml:space="preserve">If they </w:t>
+      </w:r>
+      <w:r>
+        <w:rPr>
+          <w:rFonts w:ascii="Calibri" w:cs="Calibri" w:eastAsia="Calibri" w:hAnsi="Calibri"/>
+          <w:b/>
+          <w:bCs/>
+        </w:rPr>
+        <w:t xml:space="preserve">already paid</w:t>
+      </w:r>
+      <w:r>
+        <w:rPr>
+          <w:rFonts w:ascii="Calibri" w:cs="Calibri" w:eastAsia="Calibri" w:hAnsi="Calibri"/>
+        </w:rPr>
+        <w:t xml:space="preserve"> National, nothing is undone there: the Financial Admin is alerted and decides what to do.</w:t>
+      </w:r>
+    </w:p>
+    <w:p>
+      <w:pPr>
+        <w:spacing w:after="120"/>
+      </w:pPr>
+    </w:p>
+    <w:p>
+      <w:pPr>
+        <w:spacing w:after="160"/>
+      </w:pPr>
+      <w:r>
+        <w:rPr>
+          <w:rFonts w:ascii="Calibri" w:cs="Calibri" w:eastAsia="Calibri" w:hAnsi="Calibri"/>
+        </w:rPr>
+        <w:t xml:space="preserve">Changing </w:t>
+      </w:r>
+      <w:r>
+        <w:rPr>
+          <w:rFonts w:ascii="Calibri" w:cs="Calibri" w:eastAsia="Calibri" w:hAnsi="Calibri"/>
+          <w:b/>
+          <w:bCs/>
+        </w:rPr>
+        <w:t xml:space="preserve">Current Year</w:t>
+      </w:r>
+      <w:r>
+        <w:rPr>
+          <w:rFonts w:ascii="Calibri" w:cs="Calibri" w:eastAsia="Calibri" w:hAnsi="Calibri"/>
+        </w:rPr>
+        <w:t xml:space="preserve"> on the member's record does the same: raising it to the year being renewed records the chapter dues; lowering it reverses them.</w:t>
+      </w:r>
+    </w:p>
+    <w:tbl>
+      <w:tblPr>
+        <w:tblW w:type="pct" w:w="100%"/>
+        <w:tblBorders>
+          <w:top w:val="single" w:color="5BC0DE" w:sz="4"/>
+          <w:left w:val="single" w:color="5BC0DE" w:sz="4"/>
+          <w:bottom w:val="single" w:color="5BC0DE" w:sz="4"/>
+          <w:right w:val="single" w:color="5BC0DE" w:sz="4"/>
+          <w:insideH w:val="single" w:color="auto" w:sz="4"/>
+          <w:insideV w:val="single" w:color="auto" w:sz="4"/>
+        </w:tblBorders>
+      </w:tblPr>
+      <w:tblGrid>
+        <w:gridCol w:w="100"/>
+      </w:tblGrid>
+      <w:tr>
+        <w:tc>
+          <w:tcPr>
+            <w:tcW w:type="pct" w:w="100%"/>
+            <w:shd w:fill="D9EDF7" w:val="clear"/>
+            <w:tcMar>
+              <w:top w:type="dxa" w:w="160"/>
+              <w:left w:type="dxa" w:w="200"/>
+              <w:bottom w:type="dxa" w:w="160"/>
+              <w:right w:type="dxa" w:w="200"/>
+            </w:tcMar>
+          </w:tcPr>
+          <w:p>
+            <w:pPr>
+              <w:spacing w:after="0"/>
+            </w:pPr>
+            <w:r>
+              <w:rPr>
+                <w:rFonts w:ascii="Calibri" w:cs="Calibri" w:eastAsia="Calibri" w:hAnsi="Calibri"/>
+              </w:rPr>
+              <w:t xml:space="preserve">The </w:t>
+            </w:r>
+            <w:r>
+              <w:rPr>
+                <w:rFonts w:ascii="Calibri" w:cs="Calibri" w:eastAsia="Calibri" w:hAnsi="Calibri"/>
+                <w:b/>
+                <w:bCs/>
+              </w:rPr>
+              <w:t xml:space="preserve">Chapter at Large</w:t>
+            </w:r>
+            <w:r>
+              <w:rPr>
+                <w:rFonts w:ascii="Calibri" w:cs="Calibri" w:eastAsia="Calibri" w:hAnsi="Calibri"/>
+              </w:rPr>
+              <w:t xml:space="preserve">'s dues are recorded by National's Financial Admins, not by a chapter.</w:t>
+            </w:r>
+          </w:p>
+        </w:tc>
+      </w:tr>
+    </w:tbl>
+    <w:p>
+      <w:pPr>
+        <w:spacing w:after="200"/>
+      </w:pPr>
     </w:p>
     <w:p>
       <w:pPr>
@@ -4611,7 +5301,7 @@
                 <w:sz w:val="19"/>
                 <w:szCs w:val="19"/>
               </w:rPr>
-              <w:t xml:space="preserve">Current Year</w:t>
+              <w:t xml:space="preserve">Chapter Dues Paid</w:t>
             </w:r>
           </w:p>
         </w:tc>
@@ -4636,7 +5326,7 @@
                 <w:sz w:val="19"/>
                 <w:szCs w:val="19"/>
               </w:rPr>
-              <w:t xml:space="preserve">Marks the ticked members as members for the current year</w:t>
+              <w:t xml:space="preserve">Records chapter dues paid for the ticked members (see Chapter Dues). Shown once the dues engine is on</w:t>
             </w:r>
           </w:p>
         </w:tc>
@@ -4665,7 +5355,7 @@
                 <w:sz w:val="19"/>
                 <w:szCs w:val="19"/>
               </w:rPr>
-              <w:t xml:space="preserve">User Acct</w:t>
+              <w:t xml:space="preserve">Current Year</w:t>
             </w:r>
           </w:p>
         </w:tc>
@@ -4690,7 +5380,7 @@
                 <w:sz w:val="19"/>
                 <w:szCs w:val="19"/>
               </w:rPr>
-              <w:t xml:space="preserve">Creates a login account for each ticked member who doesn't have one</w:t>
+              <w:t xml:space="preserve">With the dues engine on: the same as Chapter Dues Paid. Before that: marks the ticked members as members for the current year</w:t>
             </w:r>
           </w:p>
         </w:tc>
@@ -4719,6 +5409,60 @@
                 <w:sz w:val="19"/>
                 <w:szCs w:val="19"/>
               </w:rPr>
+              <w:t xml:space="preserve">User Acct</w:t>
+            </w:r>
+          </w:p>
+        </w:tc>
+        <w:tc>
+          <w:tcPr>
+            <w:tcW w:type="dxa" w:w="4680"/>
+            <w:shd w:fill="FFFFFF" w:val="clear"/>
+            <w:tcMar>
+              <w:top w:type="dxa" w:w="100"/>
+              <w:left w:type="dxa" w:w="120"/>
+              <w:bottom w:type="dxa" w:w="100"/>
+              <w:right w:type="dxa" w:w="120"/>
+            </w:tcMar>
+          </w:tcPr>
+          <w:p>
+            <w:pPr>
+              <w:spacing w:after="0"/>
+            </w:pPr>
+            <w:r>
+              <w:rPr>
+                <w:rFonts w:ascii="Calibri" w:cs="Calibri" w:eastAsia="Calibri" w:hAnsi="Calibri"/>
+                <w:sz w:val="19"/>
+                <w:szCs w:val="19"/>
+              </w:rPr>
+              <w:t xml:space="preserve">Creates a login account for each ticked member who doesn't have one</w:t>
+            </w:r>
+          </w:p>
+        </w:tc>
+      </w:tr>
+      <w:tr>
+        <w:tc>
+          <w:tcPr>
+            <w:tcW w:type="dxa" w:w="4680"/>
+            <w:shd w:fill="F7F9FA" w:val="clear"/>
+            <w:tcMar>
+              <w:top w:type="dxa" w:w="100"/>
+              <w:left w:type="dxa" w:w="120"/>
+              <w:bottom w:type="dxa" w:w="100"/>
+              <w:right w:type="dxa" w:w="120"/>
+            </w:tcMar>
+          </w:tcPr>
+          <w:p>
+            <w:pPr>
+              <w:spacing w:after="0"/>
+            </w:pPr>
+            <w:r>
+              <w:rPr>
+                <w:rFonts w:ascii="Calibri" w:cs="Calibri" w:eastAsia="Calibri" w:hAnsi="Calibri"/>
+                <w:b/>
+                <w:bCs/>
+                <w:sz w:val="19"/>
+                <w:szCs w:val="19"/>
+              </w:rPr>
               <w:t xml:space="preserve">Delete</w:t>
             </w:r>
           </w:p>
@@ -4726,6 +5470,33 @@
         <w:tc>
           <w:tcPr>
             <w:tcW w:type="dxa" w:w="4680"/>
+            <w:shd w:fill="F7F9FA" w:val="clear"/>
+            <w:tcMar>
+              <w:top w:type="dxa" w:w="100"/>
+              <w:left w:type="dxa" w:w="120"/>
+              <w:bottom w:type="dxa" w:w="100"/>
+              <w:right w:type="dxa" w:w="120"/>
+            </w:tcMar>
+          </w:tcPr>
+          <w:p>
+            <w:pPr>
+              <w:spacing w:after="0"/>
+            </w:pPr>
+            <w:r>
+              <w:rPr>
+                <w:rFonts w:ascii="Calibri" w:cs="Calibri" w:eastAsia="Calibri" w:hAnsi="Calibri"/>
+                <w:sz w:val="19"/>
+                <w:szCs w:val="19"/>
+              </w:rPr>
+              <w:t xml:space="preserve">Deletes the ticked members</w:t>
+            </w:r>
+          </w:p>
+        </w:tc>
+      </w:tr>
+      <w:tr>
+        <w:tc>
+          <w:tcPr>
+            <w:tcW w:type="dxa" w:w="4680"/>
             <w:shd w:fill="FFFFFF" w:val="clear"/>
             <w:tcMar>
               <w:top w:type="dxa" w:w="100"/>
@@ -4741,10 +5512,37 @@
             <w:r>
               <w:rPr>
                 <w:rFonts w:ascii="Calibri" w:cs="Calibri" w:eastAsia="Calibri" w:hAnsi="Calibri"/>
-                <w:sz w:val="19"/>
-                <w:szCs w:val="19"/>
-              </w:rPr>
-              <w:t xml:space="preserve">Deletes the ticked members (can be undone one at a time with Undelete Record)</w:t>
+                <w:b/>
+                <w:bCs/>
+                <w:sz w:val="19"/>
+                <w:szCs w:val="19"/>
+              </w:rPr>
+              <w:t xml:space="preserve">Undelete</w:t>
+            </w:r>
+          </w:p>
+        </w:tc>
+        <w:tc>
+          <w:tcPr>
+            <w:tcW w:type="dxa" w:w="4680"/>
+            <w:shd w:fill="FFFFFF" w:val="clear"/>
+            <w:tcMar>
+              <w:top w:type="dxa" w:w="100"/>
+              <w:left w:type="dxa" w:w="120"/>
+              <w:bottom w:type="dxa" w:w="100"/>
+              <w:right w:type="dxa" w:w="120"/>
+            </w:tcMar>
+          </w:tcPr>
+          <w:p>
+            <w:pPr>
+              <w:spacing w:after="0"/>
+            </w:pPr>
+            <w:r>
+              <w:rPr>
+                <w:rFonts w:ascii="Calibri" w:cs="Calibri" w:eastAsia="Calibri" w:hAnsi="Calibri"/>
+                <w:sz w:val="19"/>
+                <w:szCs w:val="19"/>
+              </w:rPr>
+              <w:t xml:space="preserve">Brings deleted members back, with their status worked out again</w:t>
             </w:r>
           </w:p>
         </w:tc>

</xml_diff>

<commit_message>
Dues step 4: National's side - National Invoices (Mark paid one or many, National Dues Paid bulk action), Void/Waive/Resend/Reverse National payment, Needs Attention, Dues Settings (National dues by type, type options, National proration, chapters' dues and collector), Chapter Dues page, Dues menu; guides
Co-Authored-By: Claude Opus 5.5 <noreply@anthropic.com>
</commit_message>
<xml_diff>
--- a/docs/admin-guide/Honcho_Administrators_Guide.docx
+++ b/docs/admin-guide/Honcho_Administrators_Guide.docx
@@ -3935,6 +3935,48 @@
         <w:t xml:space="preserve"> on the member's record does the same: raising it to the year being renewed records the chapter dues; lowering it reverses them.</w:t>
       </w:r>
     </w:p>
+    <w:p>
+      <w:pPr>
+        <w:pStyle w:val="Heading3"/>
+        <w:spacing w:before="320" w:after="160"/>
+      </w:pPr>
+      <w:r>
+        <w:t xml:space="preserve">Your Chapter's Dues Amount</w:t>
+      </w:r>
+    </w:p>
+    <w:p>
+      <w:pPr>
+        <w:spacing w:after="160"/>
+      </w:pPr>
+      <w:r>
+        <w:rPr>
+          <w:rFonts w:ascii="Calibri" w:cs="Calibri" w:eastAsia="Calibri" w:hAnsi="Calibri"/>
+          <w:b/>
+          <w:bCs/>
+        </w:rPr>
+        <w:t xml:space="preserve">Dues &gt; Chapter Dues</w:t>
+      </w:r>
+      <w:r>
+        <w:rPr>
+          <w:rFonts w:ascii="Calibri" w:cs="Calibri" w:eastAsia="Calibri" w:hAnsi="Calibri"/>
+        </w:rPr>
+        <w:t xml:space="preserve"> in the EMS menu sets your chapter's dues (0 = none) and, if you wish, a proration schedule: which member types get prorated chapter dues when they're </w:t>
+      </w:r>
+      <w:r>
+        <w:rPr>
+          <w:rFonts w:ascii="Calibri" w:cs="Calibri" w:eastAsia="Calibri" w:hAnsi="Calibri"/>
+          <w:b/>
+          <w:bCs/>
+        </w:rPr>
+        <w:t xml:space="preserve">new</w:t>
+      </w:r>
+      <w:r>
+        <w:rPr>
+          <w:rFonts w:ascii="Calibri" w:cs="Calibri" w:eastAsia="Calibri" w:hAnsi="Calibri"/>
+        </w:rPr>
+        <w:t xml:space="preserve">, and the share they pay by the month they join.</w:t>
+      </w:r>
+    </w:p>
     <w:tbl>
       <w:tblPr>
         <w:tblW w:type="pct" w:w="100%"/>
@@ -12232,6 +12274,563 @@
         </w:rPr>
         <w:t xml:space="preserve"> on their member record, or in Member Permissions.</w:t>
       </w:r>
+    </w:p>
+    <w:p>
+      <w:pPr>
+        <w:pStyle w:val="Heading2"/>
+        <w:pBdr>
+          <w:bottom w:val="single" w:color="2C3E50" w:sz="6" w:space="8"/>
+        </w:pBdr>
+        <w:spacing w:before="500" w:after="240"/>
+      </w:pPr>
+      <w:r>
+        <w:t xml:space="preserve">Dues</w:t>
+      </w:r>
+    </w:p>
+    <w:p>
+      <w:pPr>
+        <w:spacing w:after="160"/>
+      </w:pPr>
+      <w:r>
+        <w:rPr>
+          <w:rFonts w:ascii="Calibri" w:cs="Calibri" w:eastAsia="Calibri" w:hAnsi="Calibri"/>
+        </w:rPr>
+        <w:t xml:space="preserve">With the dues engine on (System Settings, Financial), Financial Admins and System Admins have a </w:t>
+      </w:r>
+      <w:r>
+        <w:rPr>
+          <w:rFonts w:ascii="Calibri" w:cs="Calibri" w:eastAsia="Calibri" w:hAnsi="Calibri"/>
+          <w:b/>
+          <w:bCs/>
+        </w:rPr>
+        <w:t xml:space="preserve">Dues</w:t>
+      </w:r>
+      <w:r>
+        <w:rPr>
+          <w:rFonts w:ascii="Calibri" w:cs="Calibri" w:eastAsia="Calibri" w:hAnsi="Calibri"/>
+        </w:rPr>
+        <w:t xml:space="preserve"> group in the EMS menu: </w:t>
+      </w:r>
+      <w:r>
+        <w:rPr>
+          <w:rFonts w:ascii="Calibri" w:cs="Calibri" w:eastAsia="Calibri" w:hAnsi="Calibri"/>
+          <w:b/>
+          <w:bCs/>
+        </w:rPr>
+        <w:t xml:space="preserve">National Invoices</w:t>
+      </w:r>
+      <w:r>
+        <w:rPr>
+          <w:rFonts w:ascii="Calibri" w:cs="Calibri" w:eastAsia="Calibri" w:hAnsi="Calibri"/>
+        </w:rPr>
+        <w:t xml:space="preserve">, </w:t>
+      </w:r>
+      <w:r>
+        <w:rPr>
+          <w:rFonts w:ascii="Calibri" w:cs="Calibri" w:eastAsia="Calibri" w:hAnsi="Calibri"/>
+          <w:b/>
+          <w:bCs/>
+        </w:rPr>
+        <w:t xml:space="preserve">Needs Attention</w:t>
+      </w:r>
+      <w:r>
+        <w:rPr>
+          <w:rFonts w:ascii="Calibri" w:cs="Calibri" w:eastAsia="Calibri" w:hAnsi="Calibri"/>
+        </w:rPr>
+        <w:t xml:space="preserve"> and </w:t>
+      </w:r>
+      <w:r>
+        <w:rPr>
+          <w:rFonts w:ascii="Calibri" w:cs="Calibri" w:eastAsia="Calibri" w:hAnsi="Calibri"/>
+          <w:b/>
+          <w:bCs/>
+        </w:rPr>
+        <w:t xml:space="preserve">Dues Settings</w:t>
+      </w:r>
+      <w:r>
+        <w:rPr>
+          <w:rFonts w:ascii="Calibri" w:cs="Calibri" w:eastAsia="Calibri" w:hAnsi="Calibri"/>
+        </w:rPr>
+        <w:t xml:space="preserve">. Chapter dues are recorded by Chapter Admins (Chapter 2, Chapter Dues); recording them raises each member's National invoice and emails it to them.</w:t>
+      </w:r>
+    </w:p>
+    <w:p>
+      <w:pPr>
+        <w:pStyle w:val="Heading3"/>
+        <w:spacing w:before="320" w:after="160"/>
+      </w:pPr>
+      <w:r>
+        <w:t xml:space="preserve">National Invoices</w:t>
+      </w:r>
+    </w:p>
+    <w:p>
+      <w:pPr>
+        <w:pStyle w:val="ListParagraph"/>
+        <w:numPr>
+          <w:ilvl w:val="0"/>
+          <w:numId w:val="2"/>
+        </w:numPr>
+        <w:spacing w:after="100"/>
+      </w:pPr>
+      <w:r>
+        <w:rPr>
+          <w:rFonts w:ascii="Calibri" w:cs="Calibri" w:eastAsia="Calibri" w:hAnsi="Calibri"/>
+        </w:rPr>
+        <w:t xml:space="preserve">The list shows National invoices by year, chapter and status (open, paid, voided, waived), with totals at the top.</w:t>
+      </w:r>
+    </w:p>
+    <w:p>
+      <w:pPr>
+        <w:pStyle w:val="ListParagraph"/>
+        <w:numPr>
+          <w:ilvl w:val="0"/>
+          <w:numId w:val="2"/>
+        </w:numPr>
+        <w:spacing w:after="100"/>
+      </w:pPr>
+      <w:r>
+        <w:rPr>
+          <w:rFonts w:ascii="Calibri" w:cs="Calibri" w:eastAsia="Calibri" w:hAnsi="Calibri"/>
+          <w:b/>
+          <w:bCs/>
+        </w:rPr>
+        <w:t xml:space="preserve">Mark paid:</w:t>
+      </w:r>
+      <w:r>
+        <w:rPr>
+          <w:rFonts w:ascii="Calibri" w:cs="Calibri" w:eastAsia="Calibri" w:hAnsi="Calibri"/>
+        </w:rPr>
+        <w:t xml:space="preserve"> tick the invoices that were paid, choose how (check, cash, PayPal, other), the reference and the date received, and click </w:t>
+      </w:r>
+      <w:r>
+        <w:rPr>
+          <w:rFonts w:ascii="Calibri" w:cs="Calibri" w:eastAsia="Calibri" w:hAnsi="Calibri"/>
+          <w:b/>
+          <w:bCs/>
+        </w:rPr>
+        <w:t xml:space="preserve">Mark the ticked invoices paid</w:t>
+      </w:r>
+      <w:r>
+        <w:rPr>
+          <w:rFonts w:ascii="Calibri" w:cs="Calibri" w:eastAsia="Calibri" w:hAnsi="Calibri"/>
+        </w:rPr>
+        <w:t xml:space="preserve">. Each member becomes </w:t>
+      </w:r>
+      <w:r>
+        <w:rPr>
+          <w:rFonts w:ascii="Calibri" w:cs="Calibri" w:eastAsia="Calibri" w:hAnsi="Calibri"/>
+          <w:b/>
+          <w:bCs/>
+        </w:rPr>
+        <w:t xml:space="preserve">Current</w:t>
+      </w:r>
+      <w:r>
+        <w:rPr>
+          <w:rFonts w:ascii="Calibri" w:cs="Calibri" w:eastAsia="Calibri" w:hAnsi="Calibri"/>
+        </w:rPr>
+        <w:t xml:space="preserve">.</w:t>
+      </w:r>
+    </w:p>
+    <w:p>
+      <w:pPr>
+        <w:pStyle w:val="ListParagraph"/>
+        <w:numPr>
+          <w:ilvl w:val="0"/>
+          <w:numId w:val="2"/>
+        </w:numPr>
+        <w:spacing w:after="100"/>
+      </w:pPr>
+      <w:r>
+        <w:rPr>
+          <w:rFonts w:ascii="Calibri" w:cs="Calibri" w:eastAsia="Calibri" w:hAnsi="Calibri"/>
+          <w:b/>
+          <w:bCs/>
+        </w:rPr>
+        <w:t xml:space="preserve">From a member list:</w:t>
+      </w:r>
+      <w:r>
+        <w:rPr>
+          <w:rFonts w:ascii="Calibri" w:cs="Calibri" w:eastAsia="Calibri" w:hAnsi="Calibri"/>
+        </w:rPr>
+        <w:t xml:space="preserve"> tick members and choose </w:t>
+      </w:r>
+      <w:r>
+        <w:rPr>
+          <w:rFonts w:ascii="Calibri" w:cs="Calibri" w:eastAsia="Calibri" w:hAnsi="Calibri"/>
+          <w:b/>
+          <w:bCs/>
+        </w:rPr>
+        <w:t xml:space="preserve">National Dues Paid</w:t>
+      </w:r>
+      <w:r>
+        <w:rPr>
+          <w:rFonts w:ascii="Calibri" w:cs="Calibri" w:eastAsia="Calibri" w:hAnsi="Calibri"/>
+        </w:rPr>
+        <w:t xml:space="preserve"> from Bulk Actions. The invoices page opens with just their open invoices ticked; members with no open invoice are listed as skipped.</w:t>
+      </w:r>
+    </w:p>
+    <w:p>
+      <w:pPr>
+        <w:pStyle w:val="ListParagraph"/>
+        <w:numPr>
+          <w:ilvl w:val="0"/>
+          <w:numId w:val="2"/>
+        </w:numPr>
+        <w:spacing w:after="100"/>
+      </w:pPr>
+      <w:r>
+        <w:rPr>
+          <w:rFonts w:ascii="Calibri" w:cs="Calibri" w:eastAsia="Calibri" w:hAnsi="Calibri"/>
+          <w:b/>
+          <w:bCs/>
+        </w:rPr>
+        <w:t xml:space="preserve">Dues</w:t>
+      </w:r>
+      <w:r>
+        <w:rPr>
+          <w:rFonts w:ascii="Calibri" w:cs="Calibri" w:eastAsia="Calibri" w:hAnsi="Calibri"/>
+        </w:rPr>
+        <w:t xml:space="preserve"> on a row opens that member's dues page.</w:t>
+      </w:r>
+    </w:p>
+    <w:p>
+      <w:pPr>
+        <w:spacing w:after="120"/>
+      </w:pPr>
+    </w:p>
+    <w:p>
+      <w:pPr>
+        <w:pStyle w:val="Heading3"/>
+        <w:spacing w:before="320" w:after="160"/>
+      </w:pPr>
+      <w:r>
+        <w:t xml:space="preserve">On a Member's Dues Page</w:t>
+      </w:r>
+    </w:p>
+    <w:p>
+      <w:pPr>
+        <w:pStyle w:val="ListParagraph"/>
+        <w:numPr>
+          <w:ilvl w:val="0"/>
+          <w:numId w:val="2"/>
+        </w:numPr>
+        <w:spacing w:after="100"/>
+      </w:pPr>
+      <w:r>
+        <w:rPr>
+          <w:rFonts w:ascii="Calibri" w:cs="Calibri" w:eastAsia="Calibri" w:hAnsi="Calibri"/>
+          <w:b/>
+          <w:bCs/>
+        </w:rPr>
+        <w:t xml:space="preserve">Mark National paid</w:t>
+      </w:r>
+      <w:r>
+        <w:rPr>
+          <w:rFonts w:ascii="Calibri" w:cs="Calibri" w:eastAsia="Calibri" w:hAnsi="Calibri"/>
+        </w:rPr>
+        <w:t xml:space="preserve"> for one member, or </w:t>
+      </w:r>
+      <w:r>
+        <w:rPr>
+          <w:rFonts w:ascii="Calibri" w:cs="Calibri" w:eastAsia="Calibri" w:hAnsi="Calibri"/>
+          <w:b/>
+          <w:bCs/>
+        </w:rPr>
+        <w:t xml:space="preserve">Email the invoice again</w:t>
+      </w:r>
+      <w:r>
+        <w:rPr>
+          <w:rFonts w:ascii="Calibri" w:cs="Calibri" w:eastAsia="Calibri" w:hAnsi="Calibri"/>
+        </w:rPr>
+        <w:t xml:space="preserve">.</w:t>
+      </w:r>
+    </w:p>
+    <w:p>
+      <w:pPr>
+        <w:pStyle w:val="ListParagraph"/>
+        <w:numPr>
+          <w:ilvl w:val="0"/>
+          <w:numId w:val="2"/>
+        </w:numPr>
+        <w:spacing w:after="100"/>
+      </w:pPr>
+      <w:r>
+        <w:rPr>
+          <w:rFonts w:ascii="Calibri" w:cs="Calibri" w:eastAsia="Calibri" w:hAnsi="Calibri"/>
+          <w:b/>
+          <w:bCs/>
+        </w:rPr>
+        <w:t xml:space="preserve">Void</w:t>
+      </w:r>
+      <w:r>
+        <w:rPr>
+          <w:rFonts w:ascii="Calibri" w:cs="Calibri" w:eastAsia="Calibri" w:hAnsi="Calibri"/>
+        </w:rPr>
+        <w:t xml:space="preserve"> (it was a mistake: the invoice no longer counts) or </w:t>
+      </w:r>
+      <w:r>
+        <w:rPr>
+          <w:rFonts w:ascii="Calibri" w:cs="Calibri" w:eastAsia="Calibri" w:hAnsi="Calibri"/>
+          <w:b/>
+          <w:bCs/>
+        </w:rPr>
+        <w:t xml:space="preserve">Waive</w:t>
+      </w:r>
+      <w:r>
+        <w:rPr>
+          <w:rFonts w:ascii="Calibri" w:cs="Calibri" w:eastAsia="Calibri" w:hAnsi="Calibri"/>
+        </w:rPr>
+        <w:t xml:space="preserve"> (forgiven: counts as paid), with a reason.</w:t>
+      </w:r>
+    </w:p>
+    <w:p>
+      <w:pPr>
+        <w:pStyle w:val="ListParagraph"/>
+        <w:numPr>
+          <w:ilvl w:val="0"/>
+          <w:numId w:val="2"/>
+        </w:numPr>
+        <w:spacing w:after="100"/>
+      </w:pPr>
+      <w:r>
+        <w:rPr>
+          <w:rFonts w:ascii="Calibri" w:cs="Calibri" w:eastAsia="Calibri" w:hAnsi="Calibri"/>
+          <w:b/>
+          <w:bCs/>
+        </w:rPr>
+        <w:t xml:space="preserve">Reverse National payment</w:t>
+      </w:r>
+      <w:r>
+        <w:rPr>
+          <w:rFonts w:ascii="Calibri" w:cs="Calibri" w:eastAsia="Calibri" w:hAnsi="Calibri"/>
+        </w:rPr>
+        <w:t xml:space="preserve"> when a payment bounced or was entered by mistake: the invoice is open again and the member goes back to Pending.</w:t>
+      </w:r>
+    </w:p>
+    <w:p>
+      <w:pPr>
+        <w:spacing w:after="120"/>
+      </w:pPr>
+    </w:p>
+    <w:p>
+      <w:pPr>
+        <w:pStyle w:val="Heading3"/>
+        <w:spacing w:before="320" w:after="160"/>
+      </w:pPr>
+      <w:r>
+        <w:t xml:space="preserve">Needs Attention</w:t>
+      </w:r>
+    </w:p>
+    <w:p>
+      <w:pPr>
+        <w:spacing w:after="160"/>
+      </w:pPr>
+      <w:r>
+        <w:rPr>
+          <w:rFonts w:ascii="Calibri" w:cs="Calibri" w:eastAsia="Calibri" w:hAnsi="Calibri"/>
+        </w:rPr>
+        <w:t xml:space="preserve">Cases Honcho can't settle on its own: for example a chapter reversed a member's chapter dues after the member had already paid National. You're emailed when one arrives and the menu shows how many are open. Decide what to do, then click </w:t>
+      </w:r>
+      <w:r>
+        <w:rPr>
+          <w:rFonts w:ascii="Calibri" w:cs="Calibri" w:eastAsia="Calibri" w:hAnsi="Calibri"/>
+          <w:b/>
+          <w:bCs/>
+        </w:rPr>
+        <w:t xml:space="preserve">Resolved</w:t>
+      </w:r>
+      <w:r>
+        <w:rPr>
+          <w:rFonts w:ascii="Calibri" w:cs="Calibri" w:eastAsia="Calibri" w:hAnsi="Calibri"/>
+        </w:rPr>
+        <w:t xml:space="preserve"> with a note of what was done.</w:t>
+      </w:r>
+    </w:p>
+    <w:p>
+      <w:pPr>
+        <w:pStyle w:val="Heading3"/>
+        <w:spacing w:before="320" w:after="160"/>
+      </w:pPr>
+      <w:r>
+        <w:t xml:space="preserve">Dues Settings</w:t>
+      </w:r>
+    </w:p>
+    <w:p>
+      <w:pPr>
+        <w:pStyle w:val="ListParagraph"/>
+        <w:numPr>
+          <w:ilvl w:val="0"/>
+          <w:numId w:val="2"/>
+        </w:numPr>
+        <w:spacing w:after="100"/>
+      </w:pPr>
+      <w:r>
+        <w:rPr>
+          <w:rFonts w:ascii="Calibri" w:cs="Calibri" w:eastAsia="Calibri" w:hAnsi="Calibri"/>
+          <w:b/>
+          <w:bCs/>
+        </w:rPr>
+        <w:t xml:space="preserve">National dues by member type</w:t>
+      </w:r>
+      <w:r>
+        <w:rPr>
+          <w:rFonts w:ascii="Calibri" w:cs="Calibri" w:eastAsia="Calibri" w:hAnsi="Calibri"/>
+        </w:rPr>
+        <w:t xml:space="preserve">, whether a type is </w:t>
+      </w:r>
+      <w:r>
+        <w:rPr>
+          <w:rFonts w:ascii="Calibri" w:cs="Calibri" w:eastAsia="Calibri" w:hAnsi="Calibri"/>
+          <w:b/>
+          <w:bCs/>
+        </w:rPr>
+        <w:t xml:space="preserve">always Current</w:t>
+      </w:r>
+      <w:r>
+        <w:rPr>
+          <w:rFonts w:ascii="Calibri" w:cs="Calibri" w:eastAsia="Calibri" w:hAnsi="Calibri"/>
+        </w:rPr>
+        <w:t xml:space="preserve"> (BPA: Honorary), whether it's offered in the </w:t>
+      </w:r>
+      <w:r>
+        <w:rPr>
+          <w:rFonts w:ascii="Calibri" w:cs="Calibri" w:eastAsia="Calibri" w:hAnsi="Calibri"/>
+          <w:b/>
+          <w:bCs/>
+        </w:rPr>
+        <w:t xml:space="preserve">Chapter at Large</w:t>
+      </w:r>
+      <w:r>
+        <w:rPr>
+          <w:rFonts w:ascii="Calibri" w:cs="Calibri" w:eastAsia="Calibri" w:hAnsi="Calibri"/>
+        </w:rPr>
+        <w:t xml:space="preserve">, and whether </w:t>
+      </w:r>
+      <w:r>
+        <w:rPr>
+          <w:rFonts w:ascii="Calibri" w:cs="Calibri" w:eastAsia="Calibri" w:hAnsi="Calibri"/>
+          <w:b/>
+          <w:bCs/>
+        </w:rPr>
+        <w:t xml:space="preserve">new</w:t>
+      </w:r>
+      <w:r>
+        <w:rPr>
+          <w:rFonts w:ascii="Calibri" w:cs="Calibri" w:eastAsia="Calibri" w:hAnsi="Calibri"/>
+        </w:rPr>
+        <w:t xml:space="preserve"> members of that type have their National dues prorated.</w:t>
+      </w:r>
+    </w:p>
+    <w:p>
+      <w:pPr>
+        <w:pStyle w:val="ListParagraph"/>
+        <w:numPr>
+          <w:ilvl w:val="0"/>
+          <w:numId w:val="2"/>
+        </w:numPr>
+        <w:spacing w:after="100"/>
+      </w:pPr>
+      <w:r>
+        <w:rPr>
+          <w:rFonts w:ascii="Calibri" w:cs="Calibri" w:eastAsia="Calibri" w:hAnsi="Calibri"/>
+          <w:b/>
+          <w:bCs/>
+        </w:rPr>
+        <w:t xml:space="preserve">National proration schedule:</w:t>
+      </w:r>
+      <w:r>
+        <w:rPr>
+          <w:rFonts w:ascii="Calibri" w:cs="Calibri" w:eastAsia="Calibri" w:hAnsi="Calibri"/>
+        </w:rPr>
+        <w:t xml:space="preserve"> the share of National dues a new member pays, by the month they join (1 = full, 0.5 = half). Renewals are never prorated.</w:t>
+      </w:r>
+    </w:p>
+    <w:p>
+      <w:pPr>
+        <w:pStyle w:val="ListParagraph"/>
+        <w:numPr>
+          <w:ilvl w:val="0"/>
+          <w:numId w:val="2"/>
+        </w:numPr>
+        <w:spacing w:after="100"/>
+      </w:pPr>
+      <w:r>
+        <w:rPr>
+          <w:rFonts w:ascii="Calibri" w:cs="Calibri" w:eastAsia="Calibri" w:hAnsi="Calibri"/>
+          <w:b/>
+          <w:bCs/>
+        </w:rPr>
+        <w:t xml:space="preserve">Each chapter's dues</w:t>
+      </w:r>
+      <w:r>
+        <w:rPr>
+          <w:rFonts w:ascii="Calibri" w:cs="Calibri" w:eastAsia="Calibri" w:hAnsi="Calibri"/>
+        </w:rPr>
+        <w:t xml:space="preserve"> (0 = none) and </w:t>
+      </w:r>
+      <w:r>
+        <w:rPr>
+          <w:rFonts w:ascii="Calibri" w:cs="Calibri" w:eastAsia="Calibri" w:hAnsi="Calibri"/>
+          <w:b/>
+          <w:bCs/>
+        </w:rPr>
+        <w:t xml:space="preserve">who collects them</w:t>
+      </w:r>
+      <w:r>
+        <w:rPr>
+          <w:rFonts w:ascii="Calibri" w:cs="Calibri" w:eastAsia="Calibri" w:hAnsi="Calibri"/>
+        </w:rPr>
+        <w:t xml:space="preserve">: the chapter, or National (the Chapter at Large). A chapter's own proration schedule is under </w:t>
+      </w:r>
+      <w:r>
+        <w:rPr>
+          <w:rFonts w:ascii="Calibri" w:cs="Calibri" w:eastAsia="Calibri" w:hAnsi="Calibri"/>
+          <w:b/>
+          <w:bCs/>
+        </w:rPr>
+        <w:t xml:space="preserve">Proration</w:t>
+      </w:r>
+      <w:r>
+        <w:rPr>
+          <w:rFonts w:ascii="Calibri" w:cs="Calibri" w:eastAsia="Calibri" w:hAnsi="Calibri"/>
+        </w:rPr>
+        <w:t xml:space="preserve"> on its row; Chapter Admins can set their own chapter's amount and schedule from </w:t>
+      </w:r>
+      <w:r>
+        <w:rPr>
+          <w:rFonts w:ascii="Calibri" w:cs="Calibri" w:eastAsia="Calibri" w:hAnsi="Calibri"/>
+          <w:b/>
+          <w:bCs/>
+        </w:rPr>
+        <w:t xml:space="preserve">Dues &gt; Chapter Dues</w:t>
+      </w:r>
+      <w:r>
+        <w:rPr>
+          <w:rFonts w:ascii="Calibri" w:cs="Calibri" w:eastAsia="Calibri" w:hAnsi="Calibri"/>
+        </w:rPr>
+        <w:t xml:space="preserve">.</w:t>
+      </w:r>
+    </w:p>
+    <w:p>
+      <w:pPr>
+        <w:pStyle w:val="ListParagraph"/>
+        <w:numPr>
+          <w:ilvl w:val="0"/>
+          <w:numId w:val="2"/>
+        </w:numPr>
+        <w:spacing w:after="100"/>
+      </w:pPr>
+      <w:r>
+        <w:rPr>
+          <w:rFonts w:ascii="Calibri" w:cs="Calibri" w:eastAsia="Calibri" w:hAnsi="Calibri"/>
+        </w:rPr>
+        <w:t xml:space="preserve">New amounts apply to dues recorded from now on; invoices already raised keep their amounts. The due date, grace period and the invoice email's payment instructions are on System Settings, Financial.</w:t>
+      </w:r>
+    </w:p>
+    <w:p>
+      <w:pPr>
+        <w:spacing w:after="120"/>
+      </w:pPr>
     </w:p>
     <w:p>
       <w:pPr>

</xml_diff>

<commit_message>
Dues step 5: Dues Report and Excel export, printable receipts and receipt email, My Dues for members, reminders (coming due, Past Due, open invoice; nightly, capped per night, off by default), reminders log; guides. Dues phase complete on the Mac
Co-Authored-By: Claude Opus 5.5 <noreply@anthropic.com>
</commit_message>
<xml_diff>
--- a/docs/admin-guide/Honcho_Administrators_Guide.docx
+++ b/docs/admin-guide/Honcho_Administrators_Guide.docx
@@ -12830,6 +12830,258 @@
     <w:p>
       <w:pPr>
         <w:spacing w:after="120"/>
+      </w:pPr>
+    </w:p>
+    <w:p>
+      <w:pPr>
+        <w:pStyle w:val="Heading3"/>
+        <w:spacing w:before="320" w:after="160"/>
+      </w:pPr>
+      <w:r>
+        <w:t xml:space="preserve">Dues Report</w:t>
+      </w:r>
+    </w:p>
+    <w:p>
+      <w:pPr>
+        <w:spacing w:after="160"/>
+      </w:pPr>
+      <w:r>
+        <w:rPr>
+          <w:rFonts w:ascii="Calibri" w:cs="Calibri" w:eastAsia="Calibri" w:hAnsi="Calibri"/>
+          <w:b/>
+          <w:bCs/>
+        </w:rPr>
+        <w:t xml:space="preserve">Dues &gt; Dues Report</w:t>
+      </w:r>
+      <w:r>
+        <w:rPr>
+          <w:rFonts w:ascii="Calibri" w:cs="Calibri" w:eastAsia="Calibri" w:hAnsi="Calibri"/>
+        </w:rPr>
+        <w:t xml:space="preserve"> shows, for a membership year, each chapter's members by status (Current, Pending, Past Due, Expired) and the money: chapter dues paid, National invoiced, National paid and outstanding, with totals. </w:t>
+      </w:r>
+      <w:r>
+        <w:rPr>
+          <w:rFonts w:ascii="Calibri" w:cs="Calibri" w:eastAsia="Calibri" w:hAnsi="Calibri"/>
+          <w:b/>
+          <w:bCs/>
+        </w:rPr>
+        <w:t xml:space="preserve">Excel</w:t>
+      </w:r>
+      <w:r>
+        <w:rPr>
+          <w:rFonts w:ascii="Calibri" w:cs="Calibri" w:eastAsia="Calibri" w:hAnsi="Calibri"/>
+        </w:rPr>
+        <w:t xml:space="preserve"> downloads it with a second sheet listing every member, their status, chapter dues and National invoice. Financial Admins see every chapter; Chapter Admins see their own.</w:t>
+      </w:r>
+    </w:p>
+    <w:p>
+      <w:pPr>
+        <w:pStyle w:val="Heading3"/>
+        <w:spacing w:before="320" w:after="160"/>
+      </w:pPr>
+      <w:r>
+        <w:t xml:space="preserve">Receipts</w:t>
+      </w:r>
+    </w:p>
+    <w:p>
+      <w:pPr>
+        <w:spacing w:after="160"/>
+      </w:pPr>
+      <w:r>
+        <w:rPr>
+          <w:rFonts w:ascii="Calibri" w:cs="Calibri" w:eastAsia="Calibri" w:hAnsi="Calibri"/>
+        </w:rPr>
+        <w:t xml:space="preserve">Every payment gets a numbered receipt (R000123). Click it on a member's Dues page to open and print it. Members see their own under My Dues, and are emailed a receipt when National receives their dues; their chapter dues receipt number is in their National invoice email.</w:t>
+      </w:r>
+    </w:p>
+    <w:p>
+      <w:pPr>
+        <w:pStyle w:val="Heading3"/>
+        <w:spacing w:before="320" w:after="160"/>
+      </w:pPr>
+      <w:r>
+        <w:t xml:space="preserve">Reminders</w:t>
+      </w:r>
+    </w:p>
+    <w:p>
+      <w:pPr>
+        <w:spacing w:after="160"/>
+      </w:pPr>
+      <w:r>
+        <w:rPr>
+          <w:rFonts w:ascii="Calibri" w:cs="Calibri" w:eastAsia="Calibri" w:hAnsi="Calibri"/>
+        </w:rPr>
+        <w:t xml:space="preserve">Switch on </w:t>
+      </w:r>
+      <w:r>
+        <w:rPr>
+          <w:rFonts w:ascii="Calibri" w:cs="Calibri" w:eastAsia="Calibri" w:hAnsi="Calibri"/>
+          <w:b/>
+          <w:bCs/>
+        </w:rPr>
+        <w:t xml:space="preserve">Send dues reminder emails</w:t>
+      </w:r>
+      <w:r>
+        <w:rPr>
+          <w:rFonts w:ascii="Calibri" w:cs="Calibri" w:eastAsia="Calibri" w:hAnsi="Calibri"/>
+        </w:rPr>
+        <w:t xml:space="preserve"> in System Settings, Financial. The nightly job then emails members:</w:t>
+      </w:r>
+    </w:p>
+    <w:p>
+      <w:pPr>
+        <w:pStyle w:val="ListParagraph"/>
+        <w:numPr>
+          <w:ilvl w:val="0"/>
+          <w:numId w:val="2"/>
+        </w:numPr>
+        <w:spacing w:after="100"/>
+      </w:pPr>
+      <w:r>
+        <w:rPr>
+          <w:rFonts w:ascii="Calibri" w:cs="Calibri" w:eastAsia="Calibri" w:hAnsi="Calibri"/>
+          <w:b/>
+          <w:bCs/>
+        </w:rPr>
+        <w:t xml:space="preserve">Coming due:</w:t>
+      </w:r>
+      <w:r>
+        <w:rPr>
+          <w:rFonts w:ascii="Calibri" w:cs="Calibri" w:eastAsia="Calibri" w:hAnsi="Calibri"/>
+        </w:rPr>
+        <w:t xml:space="preserve"> the days before the due date you list (for example 30,7), to members paid for this year who haven't renewed.</w:t>
+      </w:r>
+    </w:p>
+    <w:p>
+      <w:pPr>
+        <w:pStyle w:val="ListParagraph"/>
+        <w:numPr>
+          <w:ilvl w:val="0"/>
+          <w:numId w:val="2"/>
+        </w:numPr>
+        <w:spacing w:after="100"/>
+      </w:pPr>
+      <w:r>
+        <w:rPr>
+          <w:rFonts w:ascii="Calibri" w:cs="Calibri" w:eastAsia="Calibri" w:hAnsi="Calibri"/>
+          <w:b/>
+          <w:bCs/>
+        </w:rPr>
+        <w:t xml:space="preserve">Past Due:</w:t>
+      </w:r>
+      <w:r>
+        <w:rPr>
+          <w:rFonts w:ascii="Calibri" w:cs="Calibri" w:eastAsia="Calibri" w:hAnsi="Calibri"/>
+        </w:rPr>
+        <w:t xml:space="preserve"> every so many days (for example 14) while they're Past Due.</w:t>
+      </w:r>
+    </w:p>
+    <w:p>
+      <w:pPr>
+        <w:pStyle w:val="ListParagraph"/>
+        <w:numPr>
+          <w:ilvl w:val="0"/>
+          <w:numId w:val="2"/>
+        </w:numPr>
+        <w:spacing w:after="100"/>
+      </w:pPr>
+      <w:r>
+        <w:rPr>
+          <w:rFonts w:ascii="Calibri" w:cs="Calibri" w:eastAsia="Calibri" w:hAnsi="Calibri"/>
+          <w:b/>
+          <w:bCs/>
+        </w:rPr>
+        <w:t xml:space="preserve">National invoice open:</w:t>
+      </w:r>
+      <w:r>
+        <w:rPr>
+          <w:rFonts w:ascii="Calibri" w:cs="Calibri" w:eastAsia="Calibri" w:hAnsi="Calibri"/>
+        </w:rPr>
+        <w:t xml:space="preserve"> every so many days while their National invoice is unpaid.</w:t>
+      </w:r>
+    </w:p>
+    <w:p>
+      <w:pPr>
+        <w:spacing w:after="120"/>
+      </w:pPr>
+    </w:p>
+    <w:p>
+      <w:pPr>
+        <w:spacing w:after="160"/>
+      </w:pPr>
+      <w:r>
+        <w:rPr>
+          <w:rFonts w:ascii="Calibri" w:cs="Calibri" w:eastAsia="Calibri" w:hAnsi="Calibri"/>
+          <w:b/>
+          <w:bCs/>
+        </w:rPr>
+        <w:t xml:space="preserve">Most reminder emails a night</w:t>
+      </w:r>
+      <w:r>
+        <w:rPr>
+          <w:rFonts w:ascii="Calibri" w:cs="Calibri" w:eastAsia="Calibri" w:hAnsi="Calibri"/>
+        </w:rPr>
+        <w:t xml:space="preserve"> (default 250) keeps each night within the Brevo plan's daily limit; the rest go the following nights. </w:t>
+      </w:r>
+      <w:r>
+        <w:rPr>
+          <w:rFonts w:ascii="Calibri" w:cs="Calibri" w:eastAsia="Calibri" w:hAnsi="Calibri"/>
+          <w:b/>
+          <w:bCs/>
+        </w:rPr>
+        <w:t xml:space="preserve">Reminders sent</w:t>
+      </w:r>
+      <w:r>
+        <w:rPr>
+          <w:rFonts w:ascii="Calibri" w:cs="Calibri" w:eastAsia="Calibri" w:hAnsi="Calibri"/>
+        </w:rPr>
+        <w:t xml:space="preserve"> (on the Dues Report) lists who was reminded and when.</w:t>
+      </w:r>
+    </w:p>
+    <w:tbl>
+      <w:tblPr>
+        <w:tblW w:type="pct" w:w="100%"/>
+        <w:tblBorders>
+          <w:top w:val="single" w:color="E8A33D" w:sz="4"/>
+          <w:left w:val="single" w:color="E8A33D" w:sz="4"/>
+          <w:bottom w:val="single" w:color="E8A33D" w:sz="4"/>
+          <w:right w:val="single" w:color="E8A33D" w:sz="4"/>
+          <w:insideH w:val="single" w:color="auto" w:sz="4"/>
+          <w:insideV w:val="single" w:color="auto" w:sz="4"/>
+        </w:tblBorders>
+      </w:tblPr>
+      <w:tblGrid>
+        <w:gridCol w:w="100"/>
+      </w:tblGrid>
+      <w:tr>
+        <w:tc>
+          <w:tcPr>
+            <w:tcW w:type="pct" w:w="100%"/>
+            <w:shd w:fill="FCF1DC" w:val="clear"/>
+            <w:tcMar>
+              <w:top w:type="dxa" w:w="160"/>
+              <w:left w:type="dxa" w:w="200"/>
+              <w:bottom w:type="dxa" w:w="160"/>
+              <w:right w:type="dxa" w:w="200"/>
+            </w:tcMar>
+          </w:tcPr>
+          <w:p>
+            <w:pPr>
+              <w:spacing w:after="0"/>
+            </w:pPr>
+            <w:r>
+              <w:rPr>
+                <w:rFonts w:ascii="Calibri" w:cs="Calibri" w:eastAsia="Calibri" w:hAnsi="Calibri"/>
+              </w:rPr>
+              <w:t xml:space="preserve">Check before switching reminders on: everyone who is Past Due gets one. On BPA's test data that's about 370 members.</w:t>
+            </w:r>
+          </w:p>
+        </w:tc>
+      </w:tr>
+    </w:tbl>
+    <w:p>
+      <w:pPr>
+        <w:spacing w:after="200"/>
       </w:pPr>
     </w:p>
     <w:p>

</xml_diff>

<commit_message>
View as a Member: admins see and act as a member without their password (session stashed and restored, red bar, Return/Logout back), rules per LOGIN-23/24, password/login name/email/card reissue blocked, Auditlog 'admin as member'; member session setup shared with the login (session_helper.php); guides and requirements updated
Co-Authored-By: Claude Opus 5.5 <noreply@anthropic.com>
</commit_message>
<xml_diff>
--- a/docs/admin-guide/Honcho_Administrators_Guide.docx
+++ b/docs/admin-guide/Honcho_Administrators_Guide.docx
@@ -1593,6 +1593,482 @@
         </w:rPr>
         <w:t xml:space="preserve"> button that opens the matching section.</w:t>
       </w:r>
+    </w:p>
+    <w:p>
+      <w:pPr>
+        <w:pStyle w:val="Heading2"/>
+        <w:pBdr>
+          <w:bottom w:val="single" w:color="2C3E50" w:sz="6" w:space="8"/>
+        </w:pBdr>
+        <w:spacing w:before="500" w:after="240"/>
+      </w:pPr>
+      <w:r>
+        <w:t xml:space="preserve">View as a Member</w:t>
+      </w:r>
+    </w:p>
+    <w:p>
+      <w:pPr>
+        <w:spacing w:after="160"/>
+      </w:pPr>
+      <w:r>
+        <w:rPr>
+          <w:rFonts w:ascii="Calibri" w:cs="Calibri" w:eastAsia="Calibri" w:hAnsi="Calibri"/>
+        </w:rPr>
+        <w:t xml:space="preserve">See Honcho exactly as a member sees it, and act for them, without their password: to check what they see, help them with their profile, or register them for something.</w:t>
+      </w:r>
+    </w:p>
+    <w:p>
+      <w:pPr>
+        <w:pStyle w:val="ListParagraph"/>
+        <w:numPr>
+          <w:ilvl w:val="0"/>
+          <w:numId w:val="3"/>
+        </w:numPr>
+        <w:spacing w:after="100"/>
+      </w:pPr>
+      <w:r>
+        <w:rPr>
+          <w:rFonts w:ascii="Calibri" w:cs="Calibri" w:eastAsia="Calibri" w:hAnsi="Calibri"/>
+        </w:rPr>
+        <w:t xml:space="preserve">Open the member's record and click </w:t>
+      </w:r>
+      <w:r>
+        <w:rPr>
+          <w:rFonts w:ascii="Calibri" w:cs="Calibri" w:eastAsia="Calibri" w:hAnsi="Calibri"/>
+          <w:b/>
+          <w:bCs/>
+        </w:rPr>
+        <w:t xml:space="preserve">View as</w:t>
+      </w:r>
+      <w:r>
+        <w:rPr>
+          <w:rFonts w:ascii="Calibri" w:cs="Calibri" w:eastAsia="Calibri" w:hAnsi="Calibri"/>
+        </w:rPr>
+        <w:t xml:space="preserve">, or choose </w:t>
+      </w:r>
+      <w:r>
+        <w:rPr>
+          <w:rFonts w:ascii="Calibri" w:cs="Calibri" w:eastAsia="Calibri" w:hAnsi="Calibri"/>
+          <w:b/>
+          <w:bCs/>
+        </w:rPr>
+        <w:t xml:space="preserve">View as a Member</w:t>
+      </w:r>
+      <w:r>
+        <w:rPr>
+          <w:rFonts w:ascii="Calibri" w:cs="Calibri" w:eastAsia="Calibri" w:hAnsi="Calibri"/>
+        </w:rPr>
+        <w:t xml:space="preserve"> in the EMS menu and search by name, member number or email.</w:t>
+      </w:r>
+    </w:p>
+    <w:p>
+      <w:pPr>
+        <w:pStyle w:val="ListParagraph"/>
+        <w:numPr>
+          <w:ilvl w:val="0"/>
+          <w:numId w:val="3"/>
+        </w:numPr>
+        <w:spacing w:after="100"/>
+      </w:pPr>
+      <w:r>
+        <w:rPr>
+          <w:rFonts w:ascii="Calibri" w:cs="Calibri" w:eastAsia="Calibri" w:hAnsi="Calibri"/>
+        </w:rPr>
+        <w:t xml:space="preserve">Honcho opens the member home as that member. A red bar across the top of every page says who you're viewing as.</w:t>
+      </w:r>
+    </w:p>
+    <w:p>
+      <w:pPr>
+        <w:pStyle w:val="ListParagraph"/>
+        <w:numPr>
+          <w:ilvl w:val="0"/>
+          <w:numId w:val="3"/>
+        </w:numPr>
+        <w:spacing w:after="100"/>
+      </w:pPr>
+      <w:r>
+        <w:rPr>
+          <w:rFonts w:ascii="Calibri" w:cs="Calibri" w:eastAsia="Calibri" w:hAnsi="Calibri"/>
+        </w:rPr>
+        <w:t xml:space="preserve">Click </w:t>
+      </w:r>
+      <w:r>
+        <w:rPr>
+          <w:rFonts w:ascii="Calibri" w:cs="Calibri" w:eastAsia="Calibri" w:hAnsi="Calibri"/>
+          <w:b/>
+          <w:bCs/>
+        </w:rPr>
+        <w:t xml:space="preserve">Return to my account</w:t>
+      </w:r>
+      <w:r>
+        <w:rPr>
+          <w:rFonts w:ascii="Calibri" w:cs="Calibri" w:eastAsia="Calibri" w:hAnsi="Calibri"/>
+        </w:rPr>
+        <w:t xml:space="preserve"> in the bar (or </w:t>
+      </w:r>
+      <w:r>
+        <w:rPr>
+          <w:rFonts w:ascii="Calibri" w:cs="Calibri" w:eastAsia="Calibri" w:hAnsi="Calibri"/>
+          <w:b/>
+          <w:bCs/>
+        </w:rPr>
+        <w:t xml:space="preserve">Logout</w:t>
+      </w:r>
+      <w:r>
+        <w:rPr>
+          <w:rFonts w:ascii="Calibri" w:cs="Calibri" w:eastAsia="Calibri" w:hAnsi="Calibri"/>
+        </w:rPr>
+        <w:t xml:space="preserve">) to go straight back to your own account, where you were. No logging out and in again.</w:t>
+      </w:r>
+    </w:p>
+    <w:p>
+      <w:pPr>
+        <w:spacing w:after="120"/>
+      </w:pPr>
+    </w:p>
+    <w:tbl>
+      <w:tblPr>
+        <w:tblW w:type="dxa" w:w="9360"/>
+        <w:tblBorders>
+          <w:top w:val="single" w:color="auto" w:sz="4"/>
+          <w:left w:val="single" w:color="auto" w:sz="4"/>
+          <w:bottom w:val="single" w:color="auto" w:sz="4"/>
+          <w:right w:val="single" w:color="auto" w:sz="4"/>
+          <w:insideH w:val="single" w:color="auto" w:sz="4"/>
+          <w:insideV w:val="single" w:color="auto" w:sz="4"/>
+        </w:tblBorders>
+      </w:tblPr>
+      <w:tblGrid>
+        <w:gridCol w:w="4680"/>
+        <w:gridCol w:w="4680"/>
+      </w:tblGrid>
+      <w:tr>
+        <w:trPr>
+          <w:tblHeader/>
+        </w:trPr>
+        <w:tc>
+          <w:tcPr>
+            <w:tcW w:type="dxa" w:w="4680"/>
+            <w:shd w:fill="2C3E50" w:val="clear"/>
+            <w:tcMar>
+              <w:top w:type="dxa" w:w="100"/>
+              <w:left w:type="dxa" w:w="120"/>
+              <w:bottom w:type="dxa" w:w="100"/>
+              <w:right w:type="dxa" w:w="120"/>
+            </w:tcMar>
+          </w:tcPr>
+          <w:p>
+            <w:pPr>
+              <w:spacing w:after="0"/>
+            </w:pPr>
+            <w:r>
+              <w:rPr>
+                <w:rFonts w:ascii="Calibri" w:cs="Calibri" w:eastAsia="Calibri" w:hAnsi="Calibri"/>
+                <w:b/>
+                <w:bCs/>
+                <w:color w:val="FFFFFF"/>
+                <w:sz w:val="20"/>
+                <w:szCs w:val="20"/>
+              </w:rPr>
+              <w:t xml:space="preserve">Who</w:t>
+            </w:r>
+          </w:p>
+        </w:tc>
+        <w:tc>
+          <w:tcPr>
+            <w:tcW w:type="dxa" w:w="4680"/>
+            <w:shd w:fill="2C3E50" w:val="clear"/>
+            <w:tcMar>
+              <w:top w:type="dxa" w:w="100"/>
+              <w:left w:type="dxa" w:w="120"/>
+              <w:bottom w:type="dxa" w:w="100"/>
+              <w:right w:type="dxa" w:w="120"/>
+            </w:tcMar>
+          </w:tcPr>
+          <w:p>
+            <w:pPr>
+              <w:spacing w:after="0"/>
+            </w:pPr>
+            <w:r>
+              <w:rPr>
+                <w:rFonts w:ascii="Calibri" w:cs="Calibri" w:eastAsia="Calibri" w:hAnsi="Calibri"/>
+                <w:b/>
+                <w:bCs/>
+                <w:color w:val="FFFFFF"/>
+                <w:sz w:val="20"/>
+                <w:szCs w:val="20"/>
+              </w:rPr>
+              <w:t xml:space="preserve">Can view as</w:t>
+            </w:r>
+          </w:p>
+        </w:tc>
+      </w:tr>
+      <w:tr>
+        <w:tc>
+          <w:tcPr>
+            <w:tcW w:type="dxa" w:w="4680"/>
+            <w:shd w:fill="FFFFFF" w:val="clear"/>
+            <w:tcMar>
+              <w:top w:type="dxa" w:w="100"/>
+              <w:left w:type="dxa" w:w="120"/>
+              <w:bottom w:type="dxa" w:w="100"/>
+              <w:right w:type="dxa" w:w="120"/>
+            </w:tcMar>
+          </w:tcPr>
+          <w:p>
+            <w:pPr>
+              <w:spacing w:after="0"/>
+            </w:pPr>
+            <w:r>
+              <w:rPr>
+                <w:rFonts w:ascii="Calibri" w:cs="Calibri" w:eastAsia="Calibri" w:hAnsi="Calibri"/>
+                <w:b/>
+                <w:bCs/>
+                <w:sz w:val="19"/>
+                <w:szCs w:val="19"/>
+              </w:rPr>
+              <w:t xml:space="preserve">System Admins</w:t>
+            </w:r>
+          </w:p>
+        </w:tc>
+        <w:tc>
+          <w:tcPr>
+            <w:tcW w:type="dxa" w:w="4680"/>
+            <w:shd w:fill="FFFFFF" w:val="clear"/>
+            <w:tcMar>
+              <w:top w:type="dxa" w:w="100"/>
+              <w:left w:type="dxa" w:w="120"/>
+              <w:bottom w:type="dxa" w:w="100"/>
+              <w:right w:type="dxa" w:w="120"/>
+            </w:tcMar>
+          </w:tcPr>
+          <w:p>
+            <w:pPr>
+              <w:spacing w:after="0"/>
+            </w:pPr>
+            <w:r>
+              <w:rPr>
+                <w:rFonts w:ascii="Calibri" w:cs="Calibri" w:eastAsia="Calibri" w:hAnsi="Calibri"/>
+                <w:sz w:val="19"/>
+                <w:szCs w:val="19"/>
+              </w:rPr>
+              <w:t xml:space="preserve">Any member, including members with admin roles; never another System Admin</w:t>
+            </w:r>
+          </w:p>
+        </w:tc>
+      </w:tr>
+      <w:tr>
+        <w:tc>
+          <w:tcPr>
+            <w:tcW w:type="dxa" w:w="4680"/>
+            <w:shd w:fill="F7F9FA" w:val="clear"/>
+            <w:tcMar>
+              <w:top w:type="dxa" w:w="100"/>
+              <w:left w:type="dxa" w:w="120"/>
+              <w:bottom w:type="dxa" w:w="100"/>
+              <w:right w:type="dxa" w:w="120"/>
+            </w:tcMar>
+          </w:tcPr>
+          <w:p>
+            <w:pPr>
+              <w:spacing w:after="0"/>
+            </w:pPr>
+            <w:r>
+              <w:rPr>
+                <w:rFonts w:ascii="Calibri" w:cs="Calibri" w:eastAsia="Calibri" w:hAnsi="Calibri"/>
+                <w:b/>
+                <w:bCs/>
+                <w:sz w:val="19"/>
+                <w:szCs w:val="19"/>
+              </w:rPr>
+              <w:t xml:space="preserve">Member Admins</w:t>
+            </w:r>
+          </w:p>
+        </w:tc>
+        <w:tc>
+          <w:tcPr>
+            <w:tcW w:type="dxa" w:w="4680"/>
+            <w:shd w:fill="F7F9FA" w:val="clear"/>
+            <w:tcMar>
+              <w:top w:type="dxa" w:w="100"/>
+              <w:left w:type="dxa" w:w="120"/>
+              <w:bottom w:type="dxa" w:w="100"/>
+              <w:right w:type="dxa" w:w="120"/>
+            </w:tcMar>
+          </w:tcPr>
+          <w:p>
+            <w:pPr>
+              <w:spacing w:after="0"/>
+            </w:pPr>
+            <w:r>
+              <w:rPr>
+                <w:rFonts w:ascii="Calibri" w:cs="Calibri" w:eastAsia="Calibri" w:hAnsi="Calibri"/>
+                <w:sz w:val="19"/>
+                <w:szCs w:val="19"/>
+              </w:rPr>
+              <w:t xml:space="preserve">Any member without an admin role</w:t>
+            </w:r>
+          </w:p>
+        </w:tc>
+      </w:tr>
+      <w:tr>
+        <w:tc>
+          <w:tcPr>
+            <w:tcW w:type="dxa" w:w="4680"/>
+            <w:shd w:fill="FFFFFF" w:val="clear"/>
+            <w:tcMar>
+              <w:top w:type="dxa" w:w="100"/>
+              <w:left w:type="dxa" w:w="120"/>
+              <w:bottom w:type="dxa" w:w="100"/>
+              <w:right w:type="dxa" w:w="120"/>
+            </w:tcMar>
+          </w:tcPr>
+          <w:p>
+            <w:pPr>
+              <w:spacing w:after="0"/>
+            </w:pPr>
+            <w:r>
+              <w:rPr>
+                <w:rFonts w:ascii="Calibri" w:cs="Calibri" w:eastAsia="Calibri" w:hAnsi="Calibri"/>
+                <w:b/>
+                <w:bCs/>
+                <w:sz w:val="19"/>
+                <w:szCs w:val="19"/>
+              </w:rPr>
+              <w:t xml:space="preserve">Chapter Admins</w:t>
+            </w:r>
+          </w:p>
+        </w:tc>
+        <w:tc>
+          <w:tcPr>
+            <w:tcW w:type="dxa" w:w="4680"/>
+            <w:shd w:fill="FFFFFF" w:val="clear"/>
+            <w:tcMar>
+              <w:top w:type="dxa" w:w="100"/>
+              <w:left w:type="dxa" w:w="120"/>
+              <w:bottom w:type="dxa" w:w="100"/>
+              <w:right w:type="dxa" w:w="120"/>
+            </w:tcMar>
+          </w:tcPr>
+          <w:p>
+            <w:pPr>
+              <w:spacing w:after="0"/>
+            </w:pPr>
+            <w:r>
+              <w:rPr>
+                <w:rFonts w:ascii="Calibri" w:cs="Calibri" w:eastAsia="Calibri" w:hAnsi="Calibri"/>
+                <w:sz w:val="19"/>
+                <w:szCs w:val="19"/>
+              </w:rPr>
+              <w:t xml:space="preserve">Members of their own chapter without an admin role</w:t>
+            </w:r>
+          </w:p>
+        </w:tc>
+      </w:tr>
+    </w:tbl>
+    <w:p>
+      <w:pPr>
+        <w:spacing w:after="240"/>
+      </w:pPr>
+    </w:p>
+    <w:p>
+      <w:pPr>
+        <w:pStyle w:val="ListParagraph"/>
+        <w:numPr>
+          <w:ilvl w:val="0"/>
+          <w:numId w:val="2"/>
+        </w:numPr>
+        <w:spacing w:after="100"/>
+      </w:pPr>
+      <w:r>
+        <w:rPr>
+          <w:rFonts w:ascii="Calibri" w:cs="Calibri" w:eastAsia="Calibri" w:hAnsi="Calibri"/>
+          <w:b/>
+          <w:bCs/>
+        </w:rPr>
+        <w:t xml:space="preserve">Not available while viewing as a member:</w:t>
+      </w:r>
+      <w:r>
+        <w:rPr>
+          <w:rFonts w:ascii="Calibri" w:cs="Calibri" w:eastAsia="Calibri" w:hAnsi="Calibri"/>
+        </w:rPr>
+        <w:t xml:space="preserve"> changing their password, their login name or their email address, and reissuing their card (and, later, paying or voting for them).</w:t>
+      </w:r>
+    </w:p>
+    <w:p>
+      <w:pPr>
+        <w:pStyle w:val="ListParagraph"/>
+        <w:numPr>
+          <w:ilvl w:val="0"/>
+          <w:numId w:val="2"/>
+        </w:numPr>
+        <w:spacing w:after="100"/>
+      </w:pPr>
+      <w:r>
+        <w:rPr>
+          <w:rFonts w:ascii="Calibri" w:cs="Calibri" w:eastAsia="Calibri" w:hAnsi="Calibri"/>
+          <w:b/>
+          <w:bCs/>
+        </w:rPr>
+        <w:t xml:space="preserve">Everything is logged:</w:t>
+      </w:r>
+      <w:r>
+        <w:rPr>
+          <w:rFonts w:ascii="Calibri" w:cs="Calibri" w:eastAsia="Calibri" w:hAnsi="Calibri"/>
+        </w:rPr>
+        <w:t xml:space="preserve"> starting, returning, and every change you make meanwhile appears in the Auditlog as "you as the member". The member isn't notified.</w:t>
+      </w:r>
+    </w:p>
+    <w:p>
+      <w:pPr>
+        <w:pStyle w:val="ListParagraph"/>
+        <w:numPr>
+          <w:ilvl w:val="0"/>
+          <w:numId w:val="2"/>
+        </w:numPr>
+        <w:spacing w:after="100"/>
+      </w:pPr>
+      <w:r>
+        <w:rPr>
+          <w:rFonts w:ascii="Calibri" w:cs="Calibri" w:eastAsia="Calibri" w:hAnsi="Calibri"/>
+        </w:rPr>
+        <w:t xml:space="preserve">A </w:t>
+      </w:r>
+      <w:r>
+        <w:rPr>
+          <w:rFonts w:ascii="Calibri" w:cs="Calibri" w:eastAsia="Calibri" w:hAnsi="Calibri"/>
+          <w:b/>
+          <w:bCs/>
+        </w:rPr>
+        <w:t xml:space="preserve">locked</w:t>
+      </w:r>
+      <w:r>
+        <w:rPr>
+          <w:rFonts w:ascii="Calibri" w:cs="Calibri" w:eastAsia="Calibri" w:hAnsi="Calibri"/>
+        </w:rPr>
+        <w:t xml:space="preserve"> member can be viewed as (you'll see a warning); deceased and deleted members can't.</w:t>
+      </w:r>
+    </w:p>
+    <w:p>
+      <w:pPr>
+        <w:pStyle w:val="ListParagraph"/>
+        <w:numPr>
+          <w:ilvl w:val="0"/>
+          <w:numId w:val="2"/>
+        </w:numPr>
+        <w:spacing w:after="100"/>
+      </w:pPr>
+      <w:r>
+        <w:rPr>
+          <w:rFonts w:ascii="Calibri" w:cs="Calibri" w:eastAsia="Calibri" w:hAnsi="Calibri"/>
+        </w:rPr>
+        <w:t xml:space="preserve">One member at a time. To look at two accounts side by side, use a second browser or a private window signed in separately.</w:t>
+      </w:r>
+    </w:p>
+    <w:p>
+      <w:pPr>
+        <w:spacing w:after="120"/>
+      </w:pPr>
     </w:p>
     <w:p>
       <w:pPr>

</xml_diff>

<commit_message>
Family Member: link a member to one member of the same chapter (Membership section, list filtered by chapter, checked on save, Family of on the other record); create screen's empty Chapter/Role/Region/State/Country lists fixed via shared _member_form_lists(); debug dump of the session removed from the create screen; refusal messages shown on the member page and form; docs (MEM-30, MEM-31 report)
Co-Authored-By: Claude Opus 5.5 <noreply@anthropic.com>
</commit_message>
<xml_diff>
--- a/docs/admin-guide/Honcho_Administrators_Guide.docx
+++ b/docs/admin-guide/Honcho_Administrators_Guide.docx
@@ -3575,6 +3575,85 @@
         <w:rPr>
           <w:rFonts w:ascii="Calibri" w:cs="Calibri" w:eastAsia="Calibri" w:hAnsi="Calibri"/>
         </w:rPr>
+        <w:t xml:space="preserve">Family Members</w:t>
+      </w:r>
+    </w:p>
+    <w:p>
+      <w:pPr>
+        <w:spacing w:after="160"/>
+      </w:pPr>
+      <w:r>
+        <w:rPr>
+          <w:rFonts w:ascii="Calibri" w:cs="Calibri" w:eastAsia="Calibri" w:hAnsi="Calibri"/>
+        </w:rPr>
+        <w:t xml:space="preserve">To record that two members are related, open one of them with </w:t>
+      </w:r>
+      <w:r>
+        <w:rPr>
+          <w:rFonts w:ascii="Calibri" w:cs="Calibri" w:eastAsia="Calibri" w:hAnsi="Calibri"/>
+          <w:b/>
+          <w:bCs/>
+        </w:rPr>
+        <w:t xml:space="preserve">Update Record</w:t>
+      </w:r>
+      <w:r>
+        <w:rPr>
+          <w:rFonts w:ascii="Calibri" w:cs="Calibri" w:eastAsia="Calibri" w:hAnsi="Calibri"/>
+        </w:rPr>
+        <w:t xml:space="preserve"> and, in </w:t>
+      </w:r>
+      <w:r>
+        <w:rPr>
+          <w:rFonts w:ascii="Calibri" w:cs="Calibri" w:eastAsia="Calibri" w:hAnsi="Calibri"/>
+          <w:b/>
+          <w:bCs/>
+        </w:rPr>
+        <w:t xml:space="preserve">Membership</w:t>
+      </w:r>
+      <w:r>
+        <w:rPr>
+          <w:rFonts w:ascii="Calibri" w:cs="Calibri" w:eastAsia="Calibri" w:hAnsi="Calibri"/>
+        </w:rPr>
+        <w:t xml:space="preserve">, choose the other from </w:t>
+      </w:r>
+      <w:r>
+        <w:rPr>
+          <w:rFonts w:ascii="Calibri" w:cs="Calibri" w:eastAsia="Calibri" w:hAnsi="Calibri"/>
+          <w:b/>
+          <w:bCs/>
+        </w:rPr>
+        <w:t xml:space="preserve">Family Member</w:t>
+      </w:r>
+      <w:r>
+        <w:rPr>
+          <w:rFonts w:ascii="Calibri" w:cs="Calibri" w:eastAsia="Calibri" w:hAnsi="Calibri"/>
+        </w:rPr>
+        <w:t xml:space="preserve">. The list shows only members of the chapter chosen above it, so pick the chapter first. Choose one person; leave it blank for none. Their record then shows </w:t>
+      </w:r>
+      <w:r>
+        <w:rPr>
+          <w:rFonts w:ascii="Calibri" w:cs="Calibri" w:eastAsia="Calibri" w:hAnsi="Calibri"/>
+          <w:b/>
+          <w:bCs/>
+        </w:rPr>
+        <w:t xml:space="preserve">Family of</w:t>
+      </w:r>
+      <w:r>
+        <w:rPr>
+          <w:rFonts w:ascii="Calibri" w:cs="Calibri" w:eastAsia="Calibri" w:hAnsi="Calibri"/>
+        </w:rPr>
+        <w:t xml:space="preserve"> with this member's name. Honcho won't save a family member from another chapter, the member themselves, or a deceased or deleted member. Members see the link on their record but can't change it.</w:t>
+      </w:r>
+    </w:p>
+    <w:p>
+      <w:pPr>
+        <w:pStyle w:val="Heading4"/>
+        <w:spacing w:before="240" w:after="120"/>
+      </w:pPr>
+      <w:r>
+        <w:rPr>
+          <w:rFonts w:ascii="Calibri" w:cs="Calibri" w:eastAsia="Calibri" w:hAnsi="Calibri"/>
+        </w:rPr>
         <w:t xml:space="preserve">Locking a Member</w:t>
       </w:r>
     </w:p>
@@ -6144,6 +6223,85 @@
           <w:rFonts w:ascii="Calibri" w:cs="Calibri" w:eastAsia="Calibri" w:hAnsi="Calibri"/>
         </w:rPr>
         <w:t xml:space="preserve"> also appear in the list but don't do anything yet.</w:t>
+      </w:r>
+    </w:p>
+    <w:p>
+      <w:pPr>
+        <w:pStyle w:val="Heading4"/>
+        <w:spacing w:before="240" w:after="120"/>
+      </w:pPr>
+      <w:r>
+        <w:rPr>
+          <w:rFonts w:ascii="Calibri" w:cs="Calibri" w:eastAsia="Calibri" w:hAnsi="Calibri"/>
+        </w:rPr>
+        <w:t xml:space="preserve">Family Members</w:t>
+      </w:r>
+    </w:p>
+    <w:p>
+      <w:pPr>
+        <w:spacing w:after="160"/>
+      </w:pPr>
+      <w:r>
+        <w:rPr>
+          <w:rFonts w:ascii="Calibri" w:cs="Calibri" w:eastAsia="Calibri" w:hAnsi="Calibri"/>
+        </w:rPr>
+        <w:t xml:space="preserve">To record that two members are related, open one of them with </w:t>
+      </w:r>
+      <w:r>
+        <w:rPr>
+          <w:rFonts w:ascii="Calibri" w:cs="Calibri" w:eastAsia="Calibri" w:hAnsi="Calibri"/>
+          <w:b/>
+          <w:bCs/>
+        </w:rPr>
+        <w:t xml:space="preserve">Update Record</w:t>
+      </w:r>
+      <w:r>
+        <w:rPr>
+          <w:rFonts w:ascii="Calibri" w:cs="Calibri" w:eastAsia="Calibri" w:hAnsi="Calibri"/>
+        </w:rPr>
+        <w:t xml:space="preserve"> and, in </w:t>
+      </w:r>
+      <w:r>
+        <w:rPr>
+          <w:rFonts w:ascii="Calibri" w:cs="Calibri" w:eastAsia="Calibri" w:hAnsi="Calibri"/>
+          <w:b/>
+          <w:bCs/>
+        </w:rPr>
+        <w:t xml:space="preserve">Membership</w:t>
+      </w:r>
+      <w:r>
+        <w:rPr>
+          <w:rFonts w:ascii="Calibri" w:cs="Calibri" w:eastAsia="Calibri" w:hAnsi="Calibri"/>
+        </w:rPr>
+        <w:t xml:space="preserve">, choose the other from </w:t>
+      </w:r>
+      <w:r>
+        <w:rPr>
+          <w:rFonts w:ascii="Calibri" w:cs="Calibri" w:eastAsia="Calibri" w:hAnsi="Calibri"/>
+          <w:b/>
+          <w:bCs/>
+        </w:rPr>
+        <w:t xml:space="preserve">Family Member</w:t>
+      </w:r>
+      <w:r>
+        <w:rPr>
+          <w:rFonts w:ascii="Calibri" w:cs="Calibri" w:eastAsia="Calibri" w:hAnsi="Calibri"/>
+        </w:rPr>
+        <w:t xml:space="preserve">. The list shows only members of the chapter chosen above it, so pick the chapter first. Choose one person; leave it blank for none. Their record then shows </w:t>
+      </w:r>
+      <w:r>
+        <w:rPr>
+          <w:rFonts w:ascii="Calibri" w:cs="Calibri" w:eastAsia="Calibri" w:hAnsi="Calibri"/>
+          <w:b/>
+          <w:bCs/>
+        </w:rPr>
+        <w:t xml:space="preserve">Family of</w:t>
+      </w:r>
+      <w:r>
+        <w:rPr>
+          <w:rFonts w:ascii="Calibri" w:cs="Calibri" w:eastAsia="Calibri" w:hAnsi="Calibri"/>
+        </w:rPr>
+        <w:t xml:space="preserve"> with this member's name. Honcho won't save a family member from another chapter, the member themselves, or a deceased or deleted member. Members see the link on their record but can't change it.</w:t>
       </w:r>
     </w:p>
     <w:p>

</xml_diff>

<commit_message>
Coffee Report: Birthdays today section, second after Membership and switched on in saved reports (Current/Pending/Past Due, dob or else the Birthday text, report time zone, names only; members' reports: their chapter, directory opt-outs left out); docs (AI-40)
Co-Authored-By: Claude Opus 5.5 <noreply@anthropic.com>
</commit_message>
<xml_diff>
--- a/docs/admin-guide/Honcho_Administrators_Guide.docx
+++ b/docs/admin-guide/Honcho_Administrators_Guide.docx
@@ -10463,7 +10463,7 @@
                 <w:sz w:val="19"/>
                 <w:szCs w:val="19"/>
               </w:rPr>
-              <w:t xml:space="preserve">When the AI module is switched on: a short daily email for National's admins with membership numbers, upcoming events, Sunshine and Bulletin Board posts, documents waiting for approval, and weather, news and YouTube sections you choose. Pick the days, time, recipients and tone, and optionally a Telegram chat to send it to as well (make a bot with @BotFather, paste its token, message the bot, then use </w:t>
+              <w:t xml:space="preserve">When the AI module is switched on: a short daily email for National's admins with membership numbers, upcoming events,National's admins with membership numbers, today's birthdays, upcoming events, Sunshine and Bulletin Board posts, documents waiting for approval, and weather, news and YouTube sections you choose. Pick the days, time, recipients and tone, and optionally a Telegram chat to send it to as well (make a bot with @BotFather, paste its token, message the bot, then use </w:t>
             </w:r>
             <w:r>
               <w:rPr>
@@ -13762,7 +13762,7 @@
         <w:rPr>
           <w:rFonts w:ascii="Calibri" w:cs="Calibri" w:eastAsia="Calibri" w:hAnsi="Calibri"/>
         </w:rPr>
-        <w:t xml:space="preserve"> is a short morning email for admins: membership numbers, upcoming events, Sunshine and Bulletin Board posts, documents waiting for approval, and any weather, news and YouTube sections you choose. It can also go to a Telegram chat.</w:t>
+        <w:t xml:space="preserve"> is a short morning email for admins: membership numbers, upcoming events, Sunshine and Bulletin Board posts, documents waiting for approval, and any weathermembership numbers, today's birthdays, upcoming events, Sunshine and Bulletin Board posts, documents waiting for approval, and any weather, news and YouTube sections you choose. It can also go to a Telegram chat.</w:t>
       </w:r>
     </w:p>
     <w:p>
@@ -15488,7 +15488,7 @@
                 <w:sz w:val="19"/>
                 <w:szCs w:val="19"/>
               </w:rPr>
-              <w:t xml:space="preserve">Upcoming events</w:t>
+              <w:t xml:space="preserve">Birthdays today</w:t>
             </w:r>
           </w:p>
         </w:tc>
@@ -15513,7 +15513,7 @@
                 <w:sz w:val="19"/>
                 <w:szCs w:val="19"/>
               </w:rPr>
-              <w:t xml:space="preserve">Approved calendar events (a chapter sees its own and National's)</w:t>
+              <w:t xml:space="preserve">Current, Pending and Past Due members whose birthday is today (a chapter: its own; National: everyone, with their chapter). Names only, no ages. It uses the Date of Birth on the member's record, or the Birthday field when there is no Date of Birth. Switched on, second, in every report</w:t>
             </w:r>
           </w:p>
         </w:tc>
@@ -15538,7 +15538,7 @@
                 <w:sz w:val="19"/>
                 <w:szCs w:val="19"/>
               </w:rPr>
-              <w:t xml:space="preserve">Days ahead</w:t>
+              <w:t xml:space="preserve">none</w:t>
             </w:r>
           </w:p>
         </w:tc>
@@ -15567,7 +15567,7 @@
                 <w:sz w:val="19"/>
                 <w:szCs w:val="19"/>
               </w:rPr>
-              <w:t xml:space="preserve">Sunshine and Bulletin Board</w:t>
+              <w:t xml:space="preserve">Upcoming events</w:t>
             </w:r>
           </w:p>
         </w:tc>
@@ -15592,7 +15592,7 @@
                 <w:sz w:val="19"/>
                 <w:szCs w:val="19"/>
               </w:rPr>
-              <w:t xml:space="preserve">Posts showing today on the member home</w:t>
+              <w:t xml:space="preserve">Approved calendar events (a chapter sees its own and National's)</w:t>
             </w:r>
           </w:p>
         </w:tc>
@@ -15617,7 +15617,7 @@
                 <w:sz w:val="19"/>
                 <w:szCs w:val="19"/>
               </w:rPr>
-              <w:t xml:space="preserve">none</w:t>
+              <w:t xml:space="preserve">Days ahead</w:t>
             </w:r>
           </w:p>
         </w:tc>
@@ -15646,7 +15646,7 @@
                 <w:sz w:val="19"/>
                 <w:szCs w:val="19"/>
               </w:rPr>
-              <w:t xml:space="preserve">Documents waiting for approval</w:t>
+              <w:t xml:space="preserve">Sunshine and Bulletin Board</w:t>
             </w:r>
           </w:p>
         </w:tc>
@@ -15671,7 +15671,7 @@
                 <w:sz w:val="19"/>
                 <w:szCs w:val="19"/>
               </w:rPr>
-              <w:t xml:space="preserve">Document Library items in Pending Approval (a chapter: its own)</w:t>
+              <w:t xml:space="preserve">Posts showing today on the member home</w:t>
             </w:r>
           </w:p>
         </w:tc>
@@ -15725,7 +15725,7 @@
                 <w:sz w:val="19"/>
                 <w:szCs w:val="19"/>
               </w:rPr>
-              <w:t xml:space="preserve">Weather</w:t>
+              <w:t xml:space="preserve">Documents waiting for approval</w:t>
             </w:r>
           </w:p>
         </w:tc>
@@ -15750,7 +15750,7 @@
                 <w:sz w:val="19"/>
                 <w:szCs w:val="19"/>
               </w:rPr>
-              <w:t xml:space="preserve">Today's forecast for each place</w:t>
+              <w:t xml:space="preserve">Document Library items in Pending Approval (a chapter: its own)</w:t>
             </w:r>
           </w:p>
         </w:tc>
@@ -15775,7 +15775,7 @@
                 <w:sz w:val="19"/>
                 <w:szCs w:val="19"/>
               </w:rPr>
-              <w:t xml:space="preserve">Locations, one per line, e.g. "Chicago, IL"</w:t>
+              <w:t xml:space="preserve">none</w:t>
             </w:r>
           </w:p>
         </w:tc>
@@ -15804,7 +15804,7 @@
                 <w:sz w:val="19"/>
                 <w:szCs w:val="19"/>
               </w:rPr>
-              <w:t xml:space="preserve">Markets</w:t>
+              <w:t xml:space="preserve">Weather</w:t>
             </w:r>
           </w:p>
         </w:tc>
@@ -15829,7 +15829,7 @@
                 <w:sz w:val="19"/>
                 <w:szCs w:val="19"/>
               </w:rPr>
-              <w:t xml:space="preserve">The previous trading day's close and change for each ticker symbol you list (stocks and funds such as AAPL, indices ^GSPC S&amp;P 500, ^DJI Dow, ^IXIC Nasdaq, Bitcoin BTC-USD, gold GC=F, oil CL=F); WTI crude, the Prime Rate and the 30-year mortgage rate; exchange rates from US dollars</w:t>
+              <w:t xml:space="preserve">Today's forecast for each place</w:t>
             </w:r>
           </w:p>
         </w:tc>
@@ -15854,7 +15854,7 @@
                 <w:sz w:val="19"/>
                 <w:szCs w:val="19"/>
               </w:rPr>
-              <w:t xml:space="preserve">Ticker symbols, one per line; tick oil and rates (these need a free FRED API key on the server, set by whoever looks after it); currency codes, one per line (EUR, GTQ)</w:t>
+              <w:t xml:space="preserve">Locations, one per line, e.g. "Chicago, IL"</w:t>
             </w:r>
           </w:p>
         </w:tc>
@@ -15883,7 +15883,7 @@
                 <w:sz w:val="19"/>
                 <w:szCs w:val="19"/>
               </w:rPr>
-              <w:t xml:space="preserve">News</w:t>
+              <w:t xml:space="preserve">Markets</w:t>
             </w:r>
           </w:p>
         </w:tc>
@@ -15908,7 +15908,7 @@
                 <w:sz w:val="19"/>
                 <w:szCs w:val="19"/>
               </w:rPr>
-              <w:t xml:space="preserve">Recent headlines for each search topic, duplicates removed</w:t>
+              <w:t xml:space="preserve">The previous trading day's close and change for each ticker symbol you list (stocks and funds such as AAPL, indices ^GSPC S&amp;P 500, ^DJI Dow, ^IXIC Nasdaq, Bitcoin BTC-USD, gold GC=F, oil CL=F); WTI crude, the Prime Rate and the 30-year mortgage rate; exchange rates from US dollars</w:t>
             </w:r>
           </w:p>
         </w:tc>
@@ -15933,7 +15933,7 @@
                 <w:sz w:val="19"/>
                 <w:szCs w:val="19"/>
               </w:rPr>
-              <w:t xml:space="preserve">Topics, one per line; hours to look back; most headlines</w:t>
+              <w:t xml:space="preserve">Ticker symbols, one per line; tick oil and rates (these need a free FRED API key on the server, set by whoever looks after it); currency codes, one per line (EUR, GTQ)</w:t>
             </w:r>
           </w:p>
         </w:tc>
@@ -15962,7 +15962,7 @@
                 <w:sz w:val="19"/>
                 <w:szCs w:val="19"/>
               </w:rPr>
-              <w:t xml:space="preserve">YouTube channels</w:t>
+              <w:t xml:space="preserve">News</w:t>
             </w:r>
           </w:p>
         </w:tc>
@@ -15987,7 +15987,7 @@
                 <w:sz w:val="19"/>
                 <w:szCs w:val="19"/>
               </w:rPr>
-              <w:t xml:space="preserve">New videos from chosen channels</w:t>
+              <w:t xml:space="preserve">Recent headlines for each search topic, duplicates removed</w:t>
             </w:r>
           </w:p>
         </w:tc>
@@ -16012,7 +16012,7 @@
                 <w:sz w:val="19"/>
                 <w:szCs w:val="19"/>
               </w:rPr>
-              <w:t xml:space="preserve">One per line: "Name | channel ID" (the ID starts with UC); hours to look back</w:t>
+              <w:t xml:space="preserve">Topics, one per line; hours to look back; most headlines</w:t>
             </w:r>
           </w:p>
         </w:tc>
@@ -16041,7 +16041,7 @@
                 <w:sz w:val="19"/>
                 <w:szCs w:val="19"/>
               </w:rPr>
-              <w:t xml:space="preserve">Sports</w:t>
+              <w:t xml:space="preserve">YouTube channels</w:t>
             </w:r>
           </w:p>
         </w:tc>
@@ -16066,7 +16066,7 @@
                 <w:sz w:val="19"/>
                 <w:szCs w:val="19"/>
               </w:rPr>
-              <w:t xml:space="preserve">Yesterday's results and today's games for the leagues you tick (NFL, MLB, NBA, WNBA, MLS, NWSL), and golf leaderboards (PGA Tour, LPGA Tour, DP World Tour, PGA Tour Champions)</w:t>
+              <w:t xml:space="preserve">New videos from chosen channels</w:t>
             </w:r>
           </w:p>
         </w:tc>
@@ -16074,6 +16074,85 @@
           <w:tcPr>
             <w:tcW w:type="dxa" w:w="3120"/>
             <w:shd w:fill="FFFFFF" w:val="clear"/>
+            <w:tcMar>
+              <w:top w:type="dxa" w:w="100"/>
+              <w:left w:type="dxa" w:w="120"/>
+              <w:bottom w:type="dxa" w:w="100"/>
+              <w:right w:type="dxa" w:w="120"/>
+            </w:tcMar>
+          </w:tcPr>
+          <w:p>
+            <w:pPr>
+              <w:spacing w:after="0"/>
+            </w:pPr>
+            <w:r>
+              <w:rPr>
+                <w:rFonts w:ascii="Calibri" w:cs="Calibri" w:eastAsia="Calibri" w:hAnsi="Calibri"/>
+                <w:sz w:val="19"/>
+                <w:szCs w:val="19"/>
+              </w:rPr>
+              <w:t xml:space="preserve">One per line: "Name | channel ID" (the ID starts with UC); hours to look back</w:t>
+            </w:r>
+          </w:p>
+        </w:tc>
+      </w:tr>
+      <w:tr>
+        <w:tc>
+          <w:tcPr>
+            <w:tcW w:type="dxa" w:w="3120"/>
+            <w:shd w:fill="F7F9FA" w:val="clear"/>
+            <w:tcMar>
+              <w:top w:type="dxa" w:w="100"/>
+              <w:left w:type="dxa" w:w="120"/>
+              <w:bottom w:type="dxa" w:w="100"/>
+              <w:right w:type="dxa" w:w="120"/>
+            </w:tcMar>
+          </w:tcPr>
+          <w:p>
+            <w:pPr>
+              <w:spacing w:after="0"/>
+            </w:pPr>
+            <w:r>
+              <w:rPr>
+                <w:rFonts w:ascii="Calibri" w:cs="Calibri" w:eastAsia="Calibri" w:hAnsi="Calibri"/>
+                <w:b/>
+                <w:bCs/>
+                <w:sz w:val="19"/>
+                <w:szCs w:val="19"/>
+              </w:rPr>
+              <w:t xml:space="preserve">Sports</w:t>
+            </w:r>
+          </w:p>
+        </w:tc>
+        <w:tc>
+          <w:tcPr>
+            <w:tcW w:type="dxa" w:w="3120"/>
+            <w:shd w:fill="F7F9FA" w:val="clear"/>
+            <w:tcMar>
+              <w:top w:type="dxa" w:w="100"/>
+              <w:left w:type="dxa" w:w="120"/>
+              <w:bottom w:type="dxa" w:w="100"/>
+              <w:right w:type="dxa" w:w="120"/>
+            </w:tcMar>
+          </w:tcPr>
+          <w:p>
+            <w:pPr>
+              <w:spacing w:after="0"/>
+            </w:pPr>
+            <w:r>
+              <w:rPr>
+                <w:rFonts w:ascii="Calibri" w:cs="Calibri" w:eastAsia="Calibri" w:hAnsi="Calibri"/>
+                <w:sz w:val="19"/>
+                <w:szCs w:val="19"/>
+              </w:rPr>
+              <w:t xml:space="preserve">Yesterday's results and today's games for the leagues you tick (NFL, MLB, NBA, WNBA, MLS, NWSL), and golf leaderboards (PGA Tour, LPGA Tour, DP World Tour, PGA Tour Champions)</w:t>
+            </w:r>
+          </w:p>
+        </w:tc>
+        <w:tc>
+          <w:tcPr>
+            <w:tcW w:type="dxa" w:w="3120"/>
+            <w:shd w:fill="F7F9FA" w:val="clear"/>
             <w:tcMar>
               <w:top w:type="dxa" w:w="100"/>
               <w:left w:type="dxa" w:w="120"/>
@@ -17824,7 +17903,7 @@
         <w:rPr>
           <w:rFonts w:ascii="Calibri" w:cs="Calibri" w:eastAsia="Calibri" w:hAnsi="Calibri"/>
         </w:rPr>
-        <w:t xml:space="preserve">Members can also get their own Daily Coffee Report: bulletins first, then the sections they choose (membership numbers, events, Sunshine and Bulletin Board, weather, markets, news and sports). It is plain facts, without AI, sent to the member's own email address and, if they link it, their Telegram.</w:t>
+        <w:t xml:space="preserve">Members can also get their own Daily Coffee Report: bulletins first, then the sections they choose (membership numbers, events, Sunshine and Bulletin Board, weather, markets, news and sports)(membership numbers, birthdays in their chapter, events, Sunshine and Bulletin Board, weather, markets, news and sports). It is plain facts, without AI, sent to the member's own email address and, if they link it, their Telegram.</w:t>
       </w:r>
     </w:p>
     <w:p>

</xml_diff>